<commit_message>
Protocol: add stage 1b (organ heads on the flat backbone, quantile operating point, alarm policy) decided on validation only; fix the stage-2 loss
Co-Authored-By: Claude Fable 5.1 <noreply@anthropic.com>
Claude-Session: https://claude.ai/code/session_01LgDqxV9dzSvE8XpquGaBd5
</commit_message>
<xml_diff>
--- a/dev/protocol/Study_Protocol_v11.docx
+++ b/dev/protocol/Study_Protocol_v11.docx
@@ -2,7 +2,7 @@
 <file path=word/document.xml><?xml version="1.0" encoding="utf-8"?>
 <w:document xmlns:w="http://schemas.openxmlformats.org/wordprocessingml/2006/main" xmlns:m="http://schemas.openxmlformats.org/officeDocument/2006/math" xmlns:r="http://schemas.openxmlformats.org/officeDocument/2006/relationships" xmlns:o="urn:schemas-microsoft-com:office:office" xmlns:v="urn:schemas-microsoft-com:vml" xmlns:w10="urn:schemas-microsoft-com:office:word" xmlns:a="http://schemas.openxmlformats.org/drawingml/2006/main" xmlns:pic="http://schemas.openxmlformats.org/drawingml/2006/picture" xmlns:wp="http://schemas.openxmlformats.org/drawingml/2006/wordprocessingDrawing">
   <w:body>
-    <w:bookmarkStart w:id="38" w:name="X2351f334f17781296d91bfff42ea2b910f98989"/>
+    <w:bookmarkStart w:id="42" w:name="X2351f334f17781296d91bfff42ea2b910f98989"/>
     <w:p>
       <w:pPr>
         <w:pStyle w:val="Heading1"/>
@@ -5799,12 +5799,690 @@
       </w:r>
     </w:p>
     <w:bookmarkEnd w:id="29"/>
-    <w:bookmarkStart w:id="30" w:name="stage-2-full-cohort"/>
+    <w:bookmarkStart w:id="33" w:name="X107348d32c6f3016a98df991ad75d6f5e69b687"/>
     <w:p>
       <w:pPr>
         <w:pStyle w:val="Heading2"/>
       </w:pPr>
       <w:r>
+        <w:t xml:space="preserve">10b. Stage 1b: training recipe and alarm policy, decided on validation only (added 24 Oct 2026)</w:t>
+      </w:r>
+    </w:p>
+    <w:p>
+      <w:pPr>
+        <w:pStyle w:val="FirstParagraph"/>
+      </w:pPr>
+      <w:r>
+        <w:rPr>
+          <w:bCs/>
+          <w:b/>
+        </w:rPr>
+        <w:t xml:space="preserve">Status and disclosure.</w:t>
+      </w:r>
+      <w:r>
+        <w:t xml:space="preserve"> </w:t>
+      </w:r>
+      <w:r>
+        <w:t xml:space="preserve">This section was written after the stage-1 development results of run</w:t>
+      </w:r>
+      <w:r>
+        <w:t xml:space="preserve"> </w:t>
+      </w:r>
+      <w:r>
+        <w:rPr>
+          <w:rStyle w:val="VerbatimChar"/>
+        </w:rPr>
+        <w:t xml:space="preserve">4cd752bef2ccbd42</w:t>
+      </w:r>
+      <w:r>
+        <w:t xml:space="preserve"> </w:t>
+      </w:r>
+      <w:r>
+        <w:t xml:space="preserve">had been seen (Section 10) and before any stage-1b code ran. It is therefore not blind to stage 1, and it says so. It is blind to the test splits: no test-split number is computed, displayed or read during stage 1b, and the sealed holdout stays sealed. Everything below is chosen on the training and validation splits of the two prespecified 10,000-stay samples, by rules fixed here.</w:t>
+      </w:r>
+    </w:p>
+    <w:p>
+      <w:pPr>
+        <w:pStyle w:val="BodyText"/>
+      </w:pPr>
+      <w:r>
+        <w:rPr>
+          <w:bCs/>
+          <w:b/>
+        </w:rPr>
+        <w:t xml:space="preserve">Why.</w:t>
+      </w:r>
+      <w:r>
+        <w:t xml:space="preserve"> </w:t>
+      </w:r>
+      <w:r>
+        <w:t xml:space="preserve">Stage 1 left three things undecided that stage 2 needs: (1) the project’s own architecture, after the organ grouping was not supported on either database; (2) the alarm threshold, after an absolute probability threshold set on the calibration split left OSTA, OSTA@bce and OSTA@tls silent on the eICU test split (no alarm within the false-alarm budget); (3) the alarm policy, which the consultants’ study will tune and which must exist before their answers can be used.</w:t>
+      </w:r>
+    </w:p>
+    <w:bookmarkStart w:id="30" w:name="Xa2a3df0fb6d41ee25c9705cf39e9693433a214a"/>
+    <w:p>
+      <w:pPr>
+        <w:pStyle w:val="Heading3"/>
+      </w:pPr>
+      <w:r>
+        <w:t xml:space="preserve">10b.1 What is tried (the complete list; nothing is added during the stage)</w:t>
+      </w:r>
+    </w:p>
+    <w:tbl>
+      <w:tblPr>
+        <w:tblStyle w:val="Table"/>
+        <w:tblW w:type="pct" w:w="5000"/>
+        <w:tblLook w:firstRow="1" w:lastRow="0" w:firstColumn="0" w:lastColumn="0" w:noHBand="0" w:noVBand="0" w:val="0020"/>
+        <w:jc w:val="start"/>
+      </w:tblPr>
+      <w:tblGrid>
+        <w:gridCol w:w="2640"/>
+        <w:gridCol w:w="2640"/>
+        <w:gridCol w:w="2640"/>
+      </w:tblGrid>
+      <w:tr>
+        <w:trPr>
+          <w:tblHeader w:val="true"/>
+        </w:trPr>
+        <w:tc>
+          <w:tcPr/>
+          <w:p>
+            <w:pPr>
+              <w:pStyle w:val="Compact"/>
+              <w:jc w:val="left"/>
+            </w:pPr>
+            <w:r>
+              <w:t xml:space="preserve">Item</w:t>
+            </w:r>
+          </w:p>
+        </w:tc>
+        <w:tc>
+          <w:tcPr/>
+          <w:p>
+            <w:pPr>
+              <w:pStyle w:val="Compact"/>
+              <w:jc w:val="left"/>
+            </w:pPr>
+            <w:r>
+              <w:t xml:space="preserve">Options compared</w:t>
+            </w:r>
+          </w:p>
+        </w:tc>
+        <w:tc>
+          <w:tcPr/>
+          <w:p>
+            <w:pPr>
+              <w:pStyle w:val="Compact"/>
+              <w:jc w:val="left"/>
+            </w:pPr>
+            <w:r>
+              <w:t xml:space="preserve">Fixed settings</w:t>
+            </w:r>
+          </w:p>
+        </w:tc>
+      </w:tr>
+      <w:tr>
+        <w:tc>
+          <w:tcPr/>
+          <w:p>
+            <w:pPr>
+              <w:pStyle w:val="Compact"/>
+              <w:jc w:val="left"/>
+            </w:pPr>
+            <w:r>
+              <w:t xml:space="preserve">A. Backbone</w:t>
+            </w:r>
+          </w:p>
+        </w:tc>
+        <w:tc>
+          <w:tcPr/>
+          <w:p>
+            <w:pPr>
+              <w:pStyle w:val="Compact"/>
+              <w:jc w:val="left"/>
+            </w:pPr>
+            <w:r>
+              <w:rPr>
+                <w:rStyle w:val="VerbatimChar"/>
+              </w:rPr>
+              <w:t xml:space="preserve">flat_osta</w:t>
+            </w:r>
+            <w:r>
+              <w:t xml:space="preserve"> </w:t>
+            </w:r>
+            <w:r>
+              <w:t xml:space="preserve">(reference) vs</w:t>
+            </w:r>
+            <w:r>
+              <w:t xml:space="preserve"> </w:t>
+            </w:r>
+            <w:r>
+              <w:rPr>
+                <w:rStyle w:val="VerbatimChar"/>
+              </w:rPr>
+              <w:t xml:space="preserve">flat_osta_heads</w:t>
+            </w:r>
+            <w:r>
+              <w:t xml:space="preserve">: the same flat backbone with fourteen organ heads at the output</w:t>
+            </w:r>
+          </w:p>
+        </w:tc>
+        <w:tc>
+          <w:tcPr/>
+          <w:p>
+            <w:pPr>
+              <w:pStyle w:val="Compact"/>
+              <w:jc w:val="left"/>
+            </w:pPr>
+            <w:r>
+              <w:t xml:space="preserve">d_global 128, 4 heads, 2 + 2 layers, dropout 0.2, batch 32, AdamW wd 1e-4, 30 epochs, early stopping on validation AUPRC (patience 5), seed 42, as in V11</w:t>
+            </w:r>
+          </w:p>
+        </w:tc>
+      </w:tr>
+      <w:tr>
+        <w:tc>
+          <w:tcPr/>
+          <w:p>
+            <w:pPr>
+              <w:pStyle w:val="Compact"/>
+              <w:jc w:val="left"/>
+            </w:pPr>
+            <w:r>
+              <w:t xml:space="preserve">B. Organ heads</w:t>
+            </w:r>
+          </w:p>
+        </w:tc>
+        <w:tc>
+          <w:tcPr/>
+          <w:p>
+            <w:pPr>
+              <w:pStyle w:val="Compact"/>
+              <w:jc w:val="left"/>
+            </w:pPr>
+            <w:r>
+              <w:t xml:space="preserve">Each head is a linear readout on the shared stay representation, trained jointly with the sepsis head on its own target: whether that organ’s SOFA component worsens within 6, 12 and 24 h (the targets already defined for self-supervised pretraining,</w:t>
+            </w:r>
+            <w:r>
+              <w:t xml:space="preserve"> </w:t>
+            </w:r>
+            <w:r>
+              <w:rPr>
+                <w:rStyle w:val="VerbatimChar"/>
+              </w:rPr>
+              <w:t xml:space="preserve">ssl_targets</w:t>
+            </w:r>
+            <w:r>
+              <w:t xml:space="preserve">). Auxiliary loss weight 0.2, fixed. Heads never feed back into the sepsis risk</w:t>
+            </w:r>
+          </w:p>
+        </w:tc>
+        <w:tc>
+          <w:tcPr/>
+          <w:p>
+            <w:pPr>
+              <w:pStyle w:val="Compact"/>
+              <w:jc w:val="left"/>
+            </w:pPr>
+            <w:r>
+              <w:t xml:space="preserve">Six SOFA organs plus the eight other groups of the V11 mapping; groups with no SOFA target carry only the 6 h</w:t>
+            </w:r>
+            <w:r>
+              <w:t xml:space="preserve"> </w:t>
+            </w:r>
+            <w:r>
+              <w:t xml:space="preserve">“</w:t>
+            </w:r>
+            <w:r>
+              <w:t xml:space="preserve">any worsening</w:t>
+            </w:r>
+            <w:r>
+              <w:t xml:space="preserve">”</w:t>
+            </w:r>
+            <w:r>
+              <w:t xml:space="preserve"> </w:t>
+            </w:r>
+            <w:r>
+              <w:t xml:space="preserve">target</w:t>
+            </w:r>
+          </w:p>
+        </w:tc>
+      </w:tr>
+      <w:tr>
+        <w:tc>
+          <w:tcPr/>
+          <w:p>
+            <w:pPr>
+              <w:pStyle w:val="Compact"/>
+              <w:jc w:val="left"/>
+            </w:pPr>
+            <w:r>
+              <w:t xml:space="preserve">C. Input dropout</w:t>
+            </w:r>
+          </w:p>
+        </w:tc>
+        <w:tc>
+          <w:tcPr/>
+          <w:p>
+            <w:pPr>
+              <w:pStyle w:val="Compact"/>
+              <w:jc w:val="left"/>
+            </w:pPr>
+            <w:r>
+              <w:t xml:space="preserve">0 (reference), 0.1, 0.2: each predictor’s value, measured flag and age channels are hidden together with that probability during training only</w:t>
+            </w:r>
+          </w:p>
+        </w:tc>
+        <w:tc>
+          <w:tcPr/>
+          <w:p>
+            <w:pPr>
+              <w:pStyle w:val="Compact"/>
+              <w:jc w:val="left"/>
+            </w:pPr>
+            <w:r>
+              <w:t xml:space="preserve">Applied to both backbones; 2 × 3 = 6 trainings per database</w:t>
+            </w:r>
+          </w:p>
+        </w:tc>
+      </w:tr>
+      <w:tr>
+        <w:tc>
+          <w:tcPr/>
+          <w:p>
+            <w:pPr>
+              <w:pStyle w:val="Compact"/>
+              <w:jc w:val="left"/>
+            </w:pPr>
+            <w:r>
+              <w:t xml:space="preserve">D. Loss</w:t>
+            </w:r>
+          </w:p>
+        </w:tc>
+        <w:tc>
+          <w:tcPr/>
+          <w:p>
+            <w:pPr>
+              <w:pStyle w:val="Compact"/>
+              <w:jc w:val="left"/>
+            </w:pPr>
+            <w:r>
+              <w:t xml:space="preserve">Plain cross-entropy for every stage-1b training (Section 10 rule, three of four comparisons). No loss comparison in stage 1b</w:t>
+            </w:r>
+          </w:p>
+        </w:tc>
+        <w:tc>
+          <w:tcPr/>
+          <w:p>
+            <w:pPr>
+              <w:pStyle w:val="Compact"/>
+              <w:jc w:val="left"/>
+            </w:pPr>
+            <w:r>
+              <w:t xml:space="preserve">—</w:t>
+            </w:r>
+          </w:p>
+        </w:tc>
+      </w:tr>
+      <w:tr>
+        <w:tc>
+          <w:tcPr/>
+          <w:p>
+            <w:pPr>
+              <w:pStyle w:val="Compact"/>
+              <w:jc w:val="left"/>
+            </w:pPr>
+            <w:r>
+              <w:t xml:space="preserve">E. Operating point</w:t>
+            </w:r>
+          </w:p>
+        </w:tc>
+        <w:tc>
+          <w:tcPr/>
+          <w:p>
+            <w:pPr>
+              <w:pStyle w:val="Compact"/>
+              <w:jc w:val="left"/>
+            </w:pPr>
+            <w:r>
+              <w:t xml:space="preserve">Absolute threshold (as implemented in V11) vs</w:t>
+            </w:r>
+            <w:r>
+              <w:t xml:space="preserve"> </w:t>
+            </w:r>
+            <w:r>
+              <w:rPr>
+                <w:bCs/>
+                <w:b/>
+              </w:rPr>
+              <w:t xml:space="preserve">quantile operating point</w:t>
+            </w:r>
+            <w:r>
+              <w:t xml:space="preserve">: the budget threshold is found on the calibration split as before, then carried to any scored population as an alarm rate, not a probability: the fraction of calibration hours at or above the threshold is computed, and on the scored population the alarm fires on the same fraction of its own hours (the same quantile of its own score distribution). The quantile is label-free, so it can be set on a new hospital’s unlabelled hours</w:t>
+            </w:r>
+          </w:p>
+        </w:tc>
+        <w:tc>
+          <w:tcPr/>
+          <w:p>
+            <w:pPr>
+              <w:pStyle w:val="Compact"/>
+              <w:jc w:val="left"/>
+            </w:pPr>
+            <w:r>
+              <w:t xml:space="preserve">Budget 0.5 false alarms per patient-day on the calibration split, unchanged</w:t>
+            </w:r>
+          </w:p>
+        </w:tc>
+      </w:tr>
+      <w:tr>
+        <w:tc>
+          <w:tcPr/>
+          <w:p>
+            <w:pPr>
+              <w:pStyle w:val="Compact"/>
+              <w:jc w:val="left"/>
+            </w:pPr>
+            <w:r>
+              <w:t xml:space="preserve">F. Alarm policy</w:t>
+            </w:r>
+          </w:p>
+        </w:tc>
+        <w:tc>
+          <w:tcPr/>
+          <w:p>
+            <w:pPr>
+              <w:pStyle w:val="Compact"/>
+              <w:jc w:val="left"/>
+            </w:pPr>
+            <w:r>
+              <w:t xml:space="preserve">Persistence 1 h (as now) vs 2 h; cooldown 6 h (as now, kept); fresh-information hours: alarms allowed in every hour (as now) vs only in hours in which at least one predictor was newly charted</w:t>
+            </w:r>
+          </w:p>
+        </w:tc>
+        <w:tc>
+          <w:tcPr/>
+          <w:p>
+            <w:pPr>
+              <w:pStyle w:val="Compact"/>
+              <w:jc w:val="left"/>
+            </w:pPr>
+            <w:r>
+              <w:t xml:space="preserve">Evaluated on validation only; false alarms per patient-day always counted over every hour of the day</w:t>
+            </w:r>
+          </w:p>
+        </w:tc>
+      </w:tr>
+    </w:tbl>
+    <w:p>
+      <w:pPr>
+        <w:pStyle w:val="BodyText"/>
+      </w:pPr>
+      <w:r>
+        <w:t xml:space="preserve">Items E and F are evaluation settings applied to saved predictions; they need no retraining. The PhysioNet utility is always reported on the plain hourly predictions (no persistence, no cooldown, no fresh-hour rule) so that it stays comparable with the published score; the policy is judged on the clinical metrics (event sensitivity, false alarms per patient-day, warning time, antibiotic lead).</w:t>
+      </w:r>
+    </w:p>
+    <w:bookmarkEnd w:id="30"/>
+    <w:bookmarkStart w:id="31" w:name="b.2-decision-rules-fixed-now"/>
+    <w:p>
+      <w:pPr>
+        <w:pStyle w:val="Heading3"/>
+      </w:pPr>
+      <w:r>
+        <w:t xml:space="preserve">10b.2 Decision rules (fixed now)</w:t>
+      </w:r>
+    </w:p>
+    <w:p>
+      <w:pPr>
+        <w:numPr>
+          <w:ilvl w:val="0"/>
+          <w:numId w:val="1041"/>
+        </w:numPr>
+        <w:pStyle w:val="Compact"/>
+      </w:pPr>
+      <w:r>
+        <w:rPr>
+          <w:bCs/>
+          <w:b/>
+        </w:rPr>
+        <w:t xml:space="preserve">Backbone and input dropout.</w:t>
+      </w:r>
+      <w:r>
+        <w:t xml:space="preserve"> </w:t>
+      </w:r>
+      <w:r>
+        <w:t xml:space="preserve">Rank the six trainings per database by the Section 10 rule (rank-average of validation utility and validation AUPRC). The setting with the best average rank across both databases goes to stage 2 as</w:t>
+      </w:r>
+      <w:r>
+        <w:t xml:space="preserve"> </w:t>
+      </w:r>
+      <w:r>
+        <w:t xml:space="preserve">“</w:t>
+      </w:r>
+      <w:r>
+        <w:t xml:space="preserve">the project’s model</w:t>
+      </w:r>
+      <w:r>
+        <w:t xml:space="preserve">”</w:t>
+      </w:r>
+      <w:r>
+        <w:t xml:space="preserve">.</w:t>
+      </w:r>
+      <w:r>
+        <w:t xml:space="preserve"> </w:t>
+      </w:r>
+      <w:r>
+        <w:rPr>
+          <w:rStyle w:val="VerbatimChar"/>
+        </w:rPr>
+        <w:t xml:space="preserve">flat_osta_heads</w:t>
+      </w:r>
+      <w:r>
+        <w:t xml:space="preserve"> </w:t>
+      </w:r>
+      <w:r>
+        <w:t xml:space="preserve">is kept only if its best configuration is not ranked below the best</w:t>
+      </w:r>
+      <w:r>
+        <w:t xml:space="preserve"> </w:t>
+      </w:r>
+      <w:r>
+        <w:rPr>
+          <w:rStyle w:val="VerbatimChar"/>
+        </w:rPr>
+        <w:t xml:space="preserve">flat_osta</w:t>
+      </w:r>
+      <w:r>
+        <w:t xml:space="preserve"> </w:t>
+      </w:r>
+      <w:r>
+        <w:t xml:space="preserve">configuration on the cross-database average; otherwise the heads are reported as not supported and the stage-2 model is</w:t>
+      </w:r>
+      <w:r>
+        <w:t xml:space="preserve"> </w:t>
+      </w:r>
+      <w:r>
+        <w:rPr>
+          <w:rStyle w:val="VerbatimChar"/>
+        </w:rPr>
+        <w:t xml:space="preserve">flat_osta</w:t>
+      </w:r>
+      <w:r>
+        <w:t xml:space="preserve"> </w:t>
+      </w:r>
+      <w:r>
+        <w:t xml:space="preserve">with the chosen input dropout.</w:t>
+      </w:r>
+    </w:p>
+    <w:p>
+      <w:pPr>
+        <w:numPr>
+          <w:ilvl w:val="0"/>
+          <w:numId w:val="1041"/>
+        </w:numPr>
+        <w:pStyle w:val="Compact"/>
+      </w:pPr>
+      <w:r>
+        <w:rPr>
+          <w:bCs/>
+          <w:b/>
+        </w:rPr>
+        <w:t xml:space="preserve">Organ heads as explanation.</w:t>
+      </w:r>
+      <w:r>
+        <w:t xml:space="preserve"> </w:t>
+      </w:r>
+      <w:r>
+        <w:t xml:space="preserve">Reported regardless of rule 1: per-organ validation AUROC of each head’s 6 h target. A head with AUROC below 0.60 on both databases is reported as uninformative. This does not affect rule 1; it tells the consultants’ study which organ readings can be trusted.</w:t>
+      </w:r>
+    </w:p>
+    <w:p>
+      <w:pPr>
+        <w:numPr>
+          <w:ilvl w:val="0"/>
+          <w:numId w:val="1041"/>
+        </w:numPr>
+        <w:pStyle w:val="Compact"/>
+      </w:pPr>
+      <w:r>
+        <w:rPr>
+          <w:bCs/>
+          <w:b/>
+        </w:rPr>
+        <w:t xml:space="preserve">Operating point.</w:t>
+      </w:r>
+      <w:r>
+        <w:t xml:space="preserve"> </w:t>
+      </w:r>
+      <w:r>
+        <w:t xml:space="preserve">The quantile operating point replaces the absolute threshold for every event metric and every transfer row in stage 2 if, on the validation splits, it keeps the false-alarm rate within 0.5 per patient-day on both databases and raises no model to silence. Otherwise the absolute threshold stays and the silence is reported as found.</w:t>
+      </w:r>
+    </w:p>
+    <w:p>
+      <w:pPr>
+        <w:numPr>
+          <w:ilvl w:val="0"/>
+          <w:numId w:val="1041"/>
+        </w:numPr>
+        <w:pStyle w:val="Compact"/>
+      </w:pPr>
+      <w:r>
+        <w:rPr>
+          <w:bCs/>
+          <w:b/>
+        </w:rPr>
+        <w:t xml:space="preserve">Policy.</w:t>
+      </w:r>
+      <w:r>
+        <w:t xml:space="preserve"> </w:t>
+      </w:r>
+      <w:r>
+        <w:t xml:space="preserve">Among the four policy combinations (persistence 1 or 2 h × all hours or fresh hours), the one with the highest validation event sensitivity at or under the budget, averaged over both databases, is the stage-2 default. Ties go to the simpler policy. The consultants’ study may move the budget and the persistence; that change is recorded, dated, before the holdout opens.</w:t>
+      </w:r>
+    </w:p>
+    <w:p>
+      <w:pPr>
+        <w:numPr>
+          <w:ilvl w:val="0"/>
+          <w:numId w:val="1041"/>
+        </w:numPr>
+        <w:pStyle w:val="Compact"/>
+      </w:pPr>
+      <w:r>
+        <w:rPr>
+          <w:bCs/>
+          <w:b/>
+        </w:rPr>
+        <w:t xml:space="preserve">No other change.</w:t>
+      </w:r>
+      <w:r>
+        <w:t xml:space="preserve"> </w:t>
+      </w:r>
+      <w:r>
+        <w:t xml:space="preserve">Predictor set, label, splits, calibration, bootstrap, horizon (6 h) and every other setting stay as in Section 1 to 9.</w:t>
+      </w:r>
+    </w:p>
+    <w:bookmarkEnd w:id="31"/>
+    <w:bookmarkStart w:id="32" w:name="b.3-outputs-and-audit-trail"/>
+    <w:p>
+      <w:pPr>
+        <w:pStyle w:val="Heading3"/>
+      </w:pPr>
+      <w:r>
+        <w:t xml:space="preserve">10b.3 Outputs and audit trail</w:t>
+      </w:r>
+    </w:p>
+    <w:p>
+      <w:pPr>
+        <w:numPr>
+          <w:ilvl w:val="0"/>
+          <w:numId w:val="1042"/>
+        </w:numPr>
+        <w:pStyle w:val="Compact"/>
+      </w:pPr>
+      <w:r>
+        <w:t xml:space="preserve">A validation-only summary table per database: arm × input dropout × operating point × policy, with validation utility, AUPRC, event sensitivity, false alarms per patient-day, warning time, and per-organ head AUROC.</w:t>
+      </w:r>
+    </w:p>
+    <w:p>
+      <w:pPr>
+        <w:numPr>
+          <w:ilvl w:val="0"/>
+          <w:numId w:val="1042"/>
+        </w:numPr>
+        <w:pStyle w:val="Compact"/>
+      </w:pPr>
+      <w:r>
+        <w:t xml:space="preserve">The team summary code refuses to print any test-split row while</w:t>
+      </w:r>
+      <w:r>
+        <w:t xml:space="preserve"> </w:t>
+      </w:r>
+      <w:r>
+        <w:rPr>
+          <w:rStyle w:val="VerbatimChar"/>
+        </w:rPr>
+        <w:t xml:space="preserve">STAGE='1b'</w:t>
+      </w:r>
+      <w:r>
+        <w:t xml:space="preserve">; the test predictions are still written to disk, unread, so that the chosen configuration can later be reported on the development test split once, together with the stage-2 results, labelled</w:t>
+      </w:r>
+      <w:r>
+        <w:t xml:space="preserve"> </w:t>
+      </w:r>
+      <w:r>
+        <w:t xml:space="preserve">“</w:t>
+      </w:r>
+      <w:r>
+        <w:t xml:space="preserve">chosen on validation in stage 1b</w:t>
+      </w:r>
+      <w:r>
+        <w:t xml:space="preserve">”</w:t>
+      </w:r>
+      <w:r>
+        <w:t xml:space="preserve">.</w:t>
+      </w:r>
+    </w:p>
+    <w:p>
+      <w:pPr>
+        <w:numPr>
+          <w:ilvl w:val="0"/>
+          <w:numId w:val="1042"/>
+        </w:numPr>
+        <w:pStyle w:val="Compact"/>
+      </w:pPr>
+      <w:r>
+        <w:t xml:space="preserve">The outcome of rules 1 to 4 is appended to this section with the run key and date, and Section 11 is updated in the same commit. That commit is the stage-2 freeze candidate.</w:t>
+      </w:r>
+    </w:p>
+    <w:bookmarkEnd w:id="32"/>
+    <w:bookmarkEnd w:id="33"/>
+    <w:bookmarkStart w:id="34" w:name="stage-2-full-cohort"/>
+    <w:p>
+      <w:pPr>
+        <w:pStyle w:val="Heading2"/>
+      </w:pPr>
+      <w:r>
         <w:t xml:space="preserve">11. Stage 2, full cohort</w:t>
       </w:r>
     </w:p>
@@ -5812,7 +6490,7 @@
       <w:pPr>
         <w:numPr>
           <w:ilvl w:val="0"/>
-          <w:numId w:val="1041"/>
+          <w:numId w:val="1043"/>
         </w:numPr>
         <w:pStyle w:val="Compact"/>
       </w:pPr>
@@ -5843,7 +6521,7 @@
       <w:pPr>
         <w:numPr>
           <w:ilvl w:val="0"/>
-          <w:numId w:val="1041"/>
+          <w:numId w:val="1043"/>
         </w:numPr>
         <w:pStyle w:val="Compact"/>
       </w:pPr>
@@ -5853,176 +6531,6 @@
           <w:b/>
         </w:rPr>
         <w:t xml:space="preserve">Arms (TO FREEZE):</w:t>
-      </w:r>
-    </w:p>
-    <w:p>
-      <w:pPr>
-        <w:numPr>
-          <w:ilvl w:val="1"/>
-          <w:numId w:val="1042"/>
-        </w:numPr>
-        <w:pStyle w:val="Compact"/>
-      </w:pPr>
-      <w:r>
-        <w:t xml:space="preserve">the union of the MIMIC-IV and eICU shortlists: GRU-D, TCN, flat OSTA, SSL-CNN→flat (pooled encoder);</w:t>
-      </w:r>
-    </w:p>
-    <w:p>
-      <w:pPr>
-        <w:numPr>
-          <w:ilvl w:val="1"/>
-          <w:numId w:val="1042"/>
-        </w:numPr>
-        <w:pStyle w:val="Compact"/>
-      </w:pPr>
-      <w:r>
-        <w:t xml:space="preserve">OSTA, CNN–Transformer, boosted trees and logistic regression;</w:t>
-      </w:r>
-    </w:p>
-    <w:p>
-      <w:pPr>
-        <w:numPr>
-          <w:ilvl w:val="1"/>
-          <w:numId w:val="1042"/>
-        </w:numPr>
-        <w:pStyle w:val="Compact"/>
-      </w:pPr>
-      <w:r>
-        <w:t xml:space="preserve">signature boosted trees;</w:t>
-      </w:r>
-    </w:p>
-    <w:p>
-      <w:pPr>
-        <w:numPr>
-          <w:ilvl w:val="1"/>
-          <w:numId w:val="1042"/>
-        </w:numPr>
-        <w:pStyle w:val="Compact"/>
-      </w:pPr>
-      <w:r>
-        <w:t xml:space="preserve">the D1 pair, labelled exploratory.</w:t>
-      </w:r>
-    </w:p>
-    <w:p>
-      <w:pPr>
-        <w:numPr>
-          <w:ilvl w:val="0"/>
-          <w:numId w:val="1041"/>
-        </w:numPr>
-        <w:pStyle w:val="Compact"/>
-      </w:pPr>
-      <w:r>
-        <w:rPr>
-          <w:bCs/>
-          <w:b/>
-        </w:rPr>
-        <w:t xml:space="preserve">Loss (TO FREEZE):</w:t>
-      </w:r>
-      <w:r>
-        <w:t xml:space="preserve"> </w:t>
-      </w:r>
-      <w:r>
-        <w:t xml:space="preserve">decided by Section 10 across both databases; the rule’s reading is plain cross-entropy (three of four comparisons).</w:t>
-      </w:r>
-    </w:p>
-    <w:p>
-      <w:pPr>
-        <w:numPr>
-          <w:ilvl w:val="0"/>
-          <w:numId w:val="1041"/>
-        </w:numPr>
-        <w:pStyle w:val="Compact"/>
-      </w:pPr>
-      <w:r>
-        <w:rPr>
-          <w:bCs/>
-          <w:b/>
-        </w:rPr>
-        <w:t xml:space="preserve">Pretraining corpus (TO FREEZE):</w:t>
-      </w:r>
-    </w:p>
-    <w:p>
-      <w:pPr>
-        <w:numPr>
-          <w:ilvl w:val="1"/>
-          <w:numId w:val="1043"/>
-        </w:numPr>
-        <w:pStyle w:val="Compact"/>
-      </w:pPr>
-      <w:r>
-        <w:t xml:space="preserve">non-cohort stays plus training-split stays (inputs only, no labels);</w:t>
-      </w:r>
-    </w:p>
-    <w:p>
-      <w:pPr>
-        <w:numPr>
-          <w:ilvl w:val="1"/>
-          <w:numId w:val="1043"/>
-        </w:numPr>
-        <w:pStyle w:val="Compact"/>
-      </w:pPr>
-      <w:r>
-        <w:t xml:space="preserve">excluding every stay of a validation, test or protected patient.</w:t>
-      </w:r>
-    </w:p>
-    <w:p>
-      <w:pPr>
-        <w:numPr>
-          <w:ilvl w:val="0"/>
-          <w:numId w:val="1041"/>
-        </w:numPr>
-        <w:pStyle w:val="Compact"/>
-      </w:pPr>
-      <w:r>
-        <w:rPr>
-          <w:bCs/>
-          <w:b/>
-        </w:rPr>
-        <w:t xml:space="preserve">Final-release encoder (TO FREEZE):</w:t>
-      </w:r>
-      <w:r>
-        <w:t xml:space="preserve"> </w:t>
-      </w:r>
-      <w:r>
-        <w:t xml:space="preserve">Section 5.3.</w:t>
-      </w:r>
-    </w:p>
-    <w:p>
-      <w:pPr>
-        <w:numPr>
-          <w:ilvl w:val="0"/>
-          <w:numId w:val="1041"/>
-        </w:numPr>
-        <w:pStyle w:val="Compact"/>
-      </w:pPr>
-      <w:r>
-        <w:rPr>
-          <w:bCs/>
-          <w:b/>
-        </w:rPr>
-        <w:t xml:space="preserve">eICU leave-hospital-out (TO FREEZE):</w:t>
-      </w:r>
-      <w:r>
-        <w:t xml:space="preserve"> </w:t>
-      </w:r>
-      <w:r>
-        <w:t xml:space="preserve">hospital grouping and the minimum events per hospital.</w:t>
-      </w:r>
-    </w:p>
-    <w:p>
-      <w:pPr>
-        <w:numPr>
-          <w:ilvl w:val="0"/>
-          <w:numId w:val="1041"/>
-        </w:numPr>
-        <w:pStyle w:val="Compact"/>
-      </w:pPr>
-      <w:r>
-        <w:rPr>
-          <w:bCs/>
-          <w:b/>
-        </w:rPr>
-        <w:t xml:space="preserve">Then:</w:t>
       </w:r>
     </w:p>
     <w:p>
@@ -6034,7 +6542,7 @@
         <w:pStyle w:val="Compact"/>
       </w:pPr>
       <w:r>
-        <w:t xml:space="preserve">freeze this protocol (commit);</w:t>
+        <w:t xml:space="preserve">the union of the MIMIC-IV and eICU shortlists: GRU-D, TCN, flat OSTA, SSL-CNN→flat (pooled encoder);</w:t>
       </w:r>
     </w:p>
     <w:p>
@@ -6046,19 +6554,7 @@
         <w:pStyle w:val="Compact"/>
       </w:pPr>
       <w:r>
-        <w:t xml:space="preserve">declare</w:t>
-      </w:r>
-      <w:r>
-        <w:t xml:space="preserve"> </w:t>
-      </w:r>
-      <w:r>
-        <w:rPr>
-          <w:rStyle w:val="VerbatimChar"/>
-        </w:rPr>
-        <w:t xml:space="preserve">PRIOR_TEST_EXPOSURE</w:t>
-      </w:r>
-      <w:r>
-        <w:t xml:space="preserve">;</w:t>
+        <w:t xml:space="preserve">OSTA, CNN–Transformer, boosted trees and logistic regression;</w:t>
       </w:r>
     </w:p>
     <w:p>
@@ -6070,7 +6566,7 @@
         <w:pStyle w:val="Compact"/>
       </w:pPr>
       <w:r>
-        <w:t xml:space="preserve">open the holdout once;</w:t>
+        <w:t xml:space="preserve">signature boosted trees;</w:t>
       </w:r>
     </w:p>
     <w:p>
@@ -6082,154 +6578,224 @@
         <w:pStyle w:val="Compact"/>
       </w:pPr>
       <w:r>
-        <w:t xml:space="preserve">report every prespecified arm and analysis, whatever its result.</w:t>
-      </w:r>
-    </w:p>
-    <w:p>
-      <w:pPr>
-        <w:numPr>
-          <w:ilvl w:val="0"/>
-          <w:numId w:val="1041"/>
-        </w:numPr>
-        <w:pStyle w:val="Compact"/>
-      </w:pPr>
-      <w:r>
-        <w:rPr>
-          <w:bCs/>
-          <w:b/>
-        </w:rPr>
-        <w:t xml:space="preserve">Reporting standards:</w:t>
-      </w:r>
-      <w:r>
-        <w:t xml:space="preserve"> </w:t>
-      </w:r>
-      <w:r>
-        <w:t xml:space="preserve">TRIPOD+AI for reporting and PROBAST+AI for the risk-of-bias assessment.</w:t>
-      </w:r>
-    </w:p>
-    <w:bookmarkEnd w:id="30"/>
-    <w:bookmarkStart w:id="31" w:name="reproducibility"/>
-    <w:p>
-      <w:pPr>
-        <w:pStyle w:val="Heading2"/>
-      </w:pPr>
-      <w:r>
-        <w:t xml:space="preserve">12. Reproducibility</w:t>
-      </w:r>
-    </w:p>
-    <w:p>
-      <w:pPr>
-        <w:numPr>
-          <w:ilvl w:val="0"/>
+        <w:t xml:space="preserve">the D1 pair, labelled exploratory.</w:t>
+      </w:r>
+    </w:p>
+    <w:p>
+      <w:pPr>
+        <w:numPr>
+          <w:ilvl w:val="0"/>
+          <w:numId w:val="1043"/>
+        </w:numPr>
+        <w:pStyle w:val="Compact"/>
+      </w:pPr>
+      <w:r>
+        <w:rPr>
+          <w:bCs/>
+          <w:b/>
+        </w:rPr>
+        <w:t xml:space="preserve">Loss (decided 24 Oct 2026):</w:t>
+      </w:r>
+      <w:r>
+        <w:t xml:space="preserve"> </w:t>
+      </w:r>
+      <w:r>
+        <w:t xml:space="preserve">plain cross-entropy for every arm, by the Section 10 rule (first in three of four validation comparisons). The utility-weighted loss is kept selectable and runs once as a prespecified secondary comparator on</w:t>
+      </w:r>
+      <w:r>
+        <w:t xml:space="preserve"> </w:t>
+      </w:r>
+      <w:r>
+        <w:rPr>
+          <w:rStyle w:val="VerbatimChar"/>
+        </w:rPr>
+        <w:t xml:space="preserve">ssl_cnn_osta</w:t>
+      </w:r>
+      <w:r>
+        <w:t xml:space="preserve"> </w:t>
+      </w:r>
+      <w:r>
+        <w:t xml:space="preserve">only, where it ranked first on MIMIC-IV validation; it cannot replace the primary.</w:t>
+      </w:r>
+    </w:p>
+    <w:p>
+      <w:pPr>
+        <w:numPr>
+          <w:ilvl w:val="0"/>
+          <w:numId w:val="1043"/>
+        </w:numPr>
+        <w:pStyle w:val="Compact"/>
+      </w:pPr>
+      <w:r>
+        <w:rPr>
+          <w:bCs/>
+          <w:b/>
+        </w:rPr>
+        <w:t xml:space="preserve">Project model (TO FREEZE by stage 1b, Section 10b):</w:t>
+      </w:r>
+      <w:r>
+        <w:t xml:space="preserve"> </w:t>
+      </w:r>
+      <w:r>
+        <w:rPr>
+          <w:rStyle w:val="VerbatimChar"/>
+        </w:rPr>
+        <w:t xml:space="preserve">flat_osta</w:t>
+      </w:r>
+      <w:r>
+        <w:t xml:space="preserve"> </w:t>
+      </w:r>
+      <w:r>
+        <w:t xml:space="preserve">or</w:t>
+      </w:r>
+      <w:r>
+        <w:t xml:space="preserve"> </w:t>
+      </w:r>
+      <w:r>
+        <w:rPr>
+          <w:rStyle w:val="VerbatimChar"/>
+        </w:rPr>
+        <w:t xml:space="preserve">flat_osta_heads</w:t>
+      </w:r>
+      <w:r>
+        <w:t xml:space="preserve">, with the input-dropout setting chosen on validation; it replaces</w:t>
+      </w:r>
+      <w:r>
+        <w:t xml:space="preserve"> </w:t>
+      </w:r>
+      <w:r>
+        <w:rPr>
+          <w:rStyle w:val="VerbatimChar"/>
+        </w:rPr>
+        <w:t xml:space="preserve">flat_osta</w:t>
+      </w:r>
+      <w:r>
+        <w:t xml:space="preserve"> </w:t>
+      </w:r>
+      <w:r>
+        <w:t xml:space="preserve">in the arm list.</w:t>
+      </w:r>
+    </w:p>
+    <w:p>
+      <w:pPr>
+        <w:numPr>
+          <w:ilvl w:val="0"/>
+          <w:numId w:val="1043"/>
+        </w:numPr>
+        <w:pStyle w:val="Compact"/>
+      </w:pPr>
+      <w:r>
+        <w:rPr>
+          <w:bCs/>
+          <w:b/>
+        </w:rPr>
+        <w:t xml:space="preserve">Operating point and alarm policy (TO FREEZE by stage 1b):</w:t>
+      </w:r>
+      <w:r>
+        <w:t xml:space="preserve"> </w:t>
+      </w:r>
+      <w:r>
+        <w:t xml:space="preserve">quantile operating point and the policy chosen by rule 10b.2.4, unless rule 3 fails.</w:t>
+      </w:r>
+    </w:p>
+    <w:p>
+      <w:pPr>
+        <w:numPr>
+          <w:ilvl w:val="0"/>
+          <w:numId w:val="1043"/>
+        </w:numPr>
+        <w:pStyle w:val="Compact"/>
+      </w:pPr>
+      <w:r>
+        <w:rPr>
+          <w:bCs/>
+          <w:b/>
+        </w:rPr>
+        <w:t xml:space="preserve">Pretraining corpus (TO FREEZE):</w:t>
+      </w:r>
+    </w:p>
+    <w:p>
+      <w:pPr>
+        <w:numPr>
+          <w:ilvl w:val="1"/>
           <w:numId w:val="1045"/>
         </w:numPr>
         <w:pStyle w:val="Compact"/>
       </w:pPr>
       <w:r>
-        <w:t xml:space="preserve">Each notebook embeds its code with SHA-256 checks and runs with</w:t>
-      </w:r>
-      <w:r>
-        <w:t xml:space="preserve"> </w:t>
-      </w:r>
-      <w:r>
-        <w:rPr>
-          <w:bCs/>
-          <w:b/>
-        </w:rPr>
-        <w:t xml:space="preserve">Run all</w:t>
-      </w:r>
-      <w:r>
-        <w:t xml:space="preserve"> </w:t>
-      </w:r>
-      <w:r>
-        <w:t xml:space="preserve">only. No manual or AI-assistant edits are made between runs.</w:t>
-      </w:r>
-    </w:p>
-    <w:p>
-      <w:pPr>
-        <w:numPr>
-          <w:ilvl w:val="0"/>
+        <w:t xml:space="preserve">non-cohort stays plus training-split stays (inputs only, no labels);</w:t>
+      </w:r>
+    </w:p>
+    <w:p>
+      <w:pPr>
+        <w:numPr>
+          <w:ilvl w:val="1"/>
           <w:numId w:val="1045"/>
         </w:numPr>
         <w:pStyle w:val="Compact"/>
       </w:pPr>
       <w:r>
-        <w:t xml:space="preserve">Stages are cached under keys built from code, data and configuration:</w:t>
-      </w:r>
-      <w:r>
-        <w:t xml:space="preserve"> </w:t>
-      </w:r>
-      <w:r>
-        <w:rPr>
-          <w:rStyle w:val="VerbatimChar"/>
-        </w:rPr>
-        <w:t xml:space="preserve">COHORT_KEY</w:t>
-      </w:r>
-      <w:r>
-        <w:t xml:space="preserve">,</w:t>
-      </w:r>
-      <w:r>
-        <w:t xml:space="preserve"> </w:t>
-      </w:r>
-      <w:r>
-        <w:rPr>
-          <w:rStyle w:val="VerbatimChar"/>
-        </w:rPr>
-        <w:t xml:space="preserve">RAW_STAGE_KEY</w:t>
-      </w:r>
-      <w:r>
-        <w:t xml:space="preserve">,</w:t>
-      </w:r>
-      <w:r>
-        <w:t xml:space="preserve"> </w:t>
-      </w:r>
-      <w:r>
-        <w:rPr>
-          <w:rStyle w:val="VerbatimChar"/>
-        </w:rPr>
-        <w:t xml:space="preserve">SUPP_KEY</w:t>
-      </w:r>
-      <w:r>
-        <w:t xml:space="preserve">,</w:t>
-      </w:r>
-      <w:r>
-        <w:t xml:space="preserve"> </w:t>
-      </w:r>
-      <w:r>
-        <w:rPr>
-          <w:rStyle w:val="VerbatimChar"/>
-        </w:rPr>
-        <w:t xml:space="preserve">DATA_KEY</w:t>
-      </w:r>
-      <w:r>
-        <w:t xml:space="preserve">,</w:t>
-      </w:r>
-      <w:r>
-        <w:t xml:space="preserve"> </w:t>
-      </w:r>
-      <w:r>
-        <w:rPr>
-          <w:rStyle w:val="VerbatimChar"/>
-        </w:rPr>
-        <w:t xml:space="preserve">SSL_KEY</w:t>
-      </w:r>
-      <w:r>
-        <w:t xml:space="preserve"> </w:t>
-      </w:r>
-      <w:r>
-        <w:t xml:space="preserve">and</w:t>
-      </w:r>
-      <w:r>
-        <w:t xml:space="preserve"> </w:t>
-      </w:r>
-      <w:r>
-        <w:rPr>
-          <w:rStyle w:val="VerbatimChar"/>
-        </w:rPr>
-        <w:t xml:space="preserve">RUN_KEY</w:t>
-      </w:r>
-      <w:r>
-        <w:t xml:space="preserve">.</w:t>
+        <w:t xml:space="preserve">excluding every stay of a validation, test or protected patient.</w:t>
+      </w:r>
+    </w:p>
+    <w:p>
+      <w:pPr>
+        <w:numPr>
+          <w:ilvl w:val="0"/>
+          <w:numId w:val="1043"/>
+        </w:numPr>
+        <w:pStyle w:val="Compact"/>
+      </w:pPr>
+      <w:r>
+        <w:rPr>
+          <w:bCs/>
+          <w:b/>
+        </w:rPr>
+        <w:t xml:space="preserve">Final-release encoder (TO FREEZE):</w:t>
+      </w:r>
+      <w:r>
+        <w:t xml:space="preserve"> </w:t>
+      </w:r>
+      <w:r>
+        <w:t xml:space="preserve">Section 5.3.</w:t>
+      </w:r>
+    </w:p>
+    <w:p>
+      <w:pPr>
+        <w:numPr>
+          <w:ilvl w:val="0"/>
+          <w:numId w:val="1043"/>
+        </w:numPr>
+        <w:pStyle w:val="Compact"/>
+      </w:pPr>
+      <w:r>
+        <w:rPr>
+          <w:bCs/>
+          <w:b/>
+        </w:rPr>
+        <w:t xml:space="preserve">eICU leave-hospital-out (TO FREEZE):</w:t>
+      </w:r>
+      <w:r>
+        <w:t xml:space="preserve"> </w:t>
+      </w:r>
+      <w:r>
+        <w:t xml:space="preserve">hospital grouping and the minimum events per hospital.</w:t>
+      </w:r>
+    </w:p>
+    <w:p>
+      <w:pPr>
+        <w:numPr>
+          <w:ilvl w:val="0"/>
+          <w:numId w:val="1043"/>
+        </w:numPr>
+        <w:pStyle w:val="Compact"/>
+      </w:pPr>
+      <w:r>
+        <w:rPr>
+          <w:bCs/>
+          <w:b/>
+        </w:rPr>
+        <w:t xml:space="preserve">Then:</w:t>
       </w:r>
     </w:p>
     <w:p>
@@ -6241,7 +6807,7 @@
         <w:pStyle w:val="Compact"/>
       </w:pPr>
       <w:r>
-        <w:t xml:space="preserve">A changed input produces a new key.</w:t>
+        <w:t xml:space="preserve">freeze this protocol (commit);</w:t>
       </w:r>
     </w:p>
     <w:p>
@@ -6253,7 +6819,7 @@
         <w:pStyle w:val="Compact"/>
       </w:pPr>
       <w:r>
-        <w:t xml:space="preserve">A per-run</w:t>
+        <w:t xml:space="preserve">declare</w:t>
       </w:r>
       <w:r>
         <w:t xml:space="preserve"> </w:t>
@@ -6262,13 +6828,10 @@
         <w:rPr>
           <w:rStyle w:val="VerbatimChar"/>
         </w:rPr>
-        <w:t xml:space="preserve">contract.json</w:t>
-      </w:r>
-      <w:r>
-        <w:t xml:space="preserve"> </w:t>
-      </w:r>
-      <w:r>
-        <w:t xml:space="preserve">refuses a changed contract.</w:t>
+        <w:t xml:space="preserve">PRIOR_TEST_EXPOSURE</w:t>
+      </w:r>
+      <w:r>
+        <w:t xml:space="preserve">;</w:t>
       </w:r>
     </w:p>
     <w:p>
@@ -6280,9 +6843,219 @@
         <w:pStyle w:val="Compact"/>
       </w:pPr>
       <w:r>
+        <w:t xml:space="preserve">open the holdout once;</w:t>
+      </w:r>
+    </w:p>
+    <w:p>
+      <w:pPr>
+        <w:numPr>
+          <w:ilvl w:val="1"/>
+          <w:numId w:val="1046"/>
+        </w:numPr>
+        <w:pStyle w:val="Compact"/>
+      </w:pPr>
+      <w:r>
+        <w:t xml:space="preserve">report every prespecified arm and analysis, whatever its result.</w:t>
+      </w:r>
+    </w:p>
+    <w:p>
+      <w:pPr>
+        <w:numPr>
+          <w:ilvl w:val="0"/>
+          <w:numId w:val="1043"/>
+        </w:numPr>
+        <w:pStyle w:val="Compact"/>
+      </w:pPr>
+      <w:r>
+        <w:rPr>
+          <w:bCs/>
+          <w:b/>
+        </w:rPr>
+        <w:t xml:space="preserve">Reporting standards:</w:t>
+      </w:r>
+      <w:r>
+        <w:t xml:space="preserve"> </w:t>
+      </w:r>
+      <w:r>
+        <w:t xml:space="preserve">TRIPOD+AI for reporting and PROBAST+AI for the risk-of-bias assessment.</w:t>
+      </w:r>
+    </w:p>
+    <w:bookmarkEnd w:id="34"/>
+    <w:bookmarkStart w:id="35" w:name="reproducibility"/>
+    <w:p>
+      <w:pPr>
+        <w:pStyle w:val="Heading2"/>
+      </w:pPr>
+      <w:r>
+        <w:t xml:space="preserve">12. Reproducibility</w:t>
+      </w:r>
+    </w:p>
+    <w:p>
+      <w:pPr>
+        <w:numPr>
+          <w:ilvl w:val="0"/>
+          <w:numId w:val="1047"/>
+        </w:numPr>
+        <w:pStyle w:val="Compact"/>
+      </w:pPr>
+      <w:r>
+        <w:t xml:space="preserve">Each notebook embeds its code with SHA-256 checks and runs with</w:t>
+      </w:r>
+      <w:r>
+        <w:t xml:space="preserve"> </w:t>
+      </w:r>
+      <w:r>
+        <w:rPr>
+          <w:bCs/>
+          <w:b/>
+        </w:rPr>
+        <w:t xml:space="preserve">Run all</w:t>
+      </w:r>
+      <w:r>
+        <w:t xml:space="preserve"> </w:t>
+      </w:r>
+      <w:r>
+        <w:t xml:space="preserve">only. No manual or AI-assistant edits are made between runs.</w:t>
+      </w:r>
+    </w:p>
+    <w:p>
+      <w:pPr>
+        <w:numPr>
+          <w:ilvl w:val="0"/>
+          <w:numId w:val="1047"/>
+        </w:numPr>
+        <w:pStyle w:val="Compact"/>
+      </w:pPr>
+      <w:r>
+        <w:t xml:space="preserve">Stages are cached under keys built from code, data and configuration:</w:t>
+      </w:r>
+      <w:r>
+        <w:t xml:space="preserve"> </w:t>
+      </w:r>
+      <w:r>
         <w:rPr>
           <w:rStyle w:val="VerbatimChar"/>
         </w:rPr>
+        <w:t xml:space="preserve">COHORT_KEY</w:t>
+      </w:r>
+      <w:r>
+        <w:t xml:space="preserve">,</w:t>
+      </w:r>
+      <w:r>
+        <w:t xml:space="preserve"> </w:t>
+      </w:r>
+      <w:r>
+        <w:rPr>
+          <w:rStyle w:val="VerbatimChar"/>
+        </w:rPr>
+        <w:t xml:space="preserve">RAW_STAGE_KEY</w:t>
+      </w:r>
+      <w:r>
+        <w:t xml:space="preserve">,</w:t>
+      </w:r>
+      <w:r>
+        <w:t xml:space="preserve"> </w:t>
+      </w:r>
+      <w:r>
+        <w:rPr>
+          <w:rStyle w:val="VerbatimChar"/>
+        </w:rPr>
+        <w:t xml:space="preserve">SUPP_KEY</w:t>
+      </w:r>
+      <w:r>
+        <w:t xml:space="preserve">,</w:t>
+      </w:r>
+      <w:r>
+        <w:t xml:space="preserve"> </w:t>
+      </w:r>
+      <w:r>
+        <w:rPr>
+          <w:rStyle w:val="VerbatimChar"/>
+        </w:rPr>
+        <w:t xml:space="preserve">DATA_KEY</w:t>
+      </w:r>
+      <w:r>
+        <w:t xml:space="preserve">,</w:t>
+      </w:r>
+      <w:r>
+        <w:t xml:space="preserve"> </w:t>
+      </w:r>
+      <w:r>
+        <w:rPr>
+          <w:rStyle w:val="VerbatimChar"/>
+        </w:rPr>
+        <w:t xml:space="preserve">SSL_KEY</w:t>
+      </w:r>
+      <w:r>
+        <w:t xml:space="preserve"> </w:t>
+      </w:r>
+      <w:r>
+        <w:t xml:space="preserve">and</w:t>
+      </w:r>
+      <w:r>
+        <w:t xml:space="preserve"> </w:t>
+      </w:r>
+      <w:r>
+        <w:rPr>
+          <w:rStyle w:val="VerbatimChar"/>
+        </w:rPr>
+        <w:t xml:space="preserve">RUN_KEY</w:t>
+      </w:r>
+      <w:r>
+        <w:t xml:space="preserve">.</w:t>
+      </w:r>
+    </w:p>
+    <w:p>
+      <w:pPr>
+        <w:numPr>
+          <w:ilvl w:val="1"/>
+          <w:numId w:val="1048"/>
+        </w:numPr>
+        <w:pStyle w:val="Compact"/>
+      </w:pPr>
+      <w:r>
+        <w:t xml:space="preserve">A changed input produces a new key.</w:t>
+      </w:r>
+    </w:p>
+    <w:p>
+      <w:pPr>
+        <w:numPr>
+          <w:ilvl w:val="1"/>
+          <w:numId w:val="1048"/>
+        </w:numPr>
+        <w:pStyle w:val="Compact"/>
+      </w:pPr>
+      <w:r>
+        <w:t xml:space="preserve">A per-run</w:t>
+      </w:r>
+      <w:r>
+        <w:t xml:space="preserve"> </w:t>
+      </w:r>
+      <w:r>
+        <w:rPr>
+          <w:rStyle w:val="VerbatimChar"/>
+        </w:rPr>
+        <w:t xml:space="preserve">contract.json</w:t>
+      </w:r>
+      <w:r>
+        <w:t xml:space="preserve"> </w:t>
+      </w:r>
+      <w:r>
+        <w:t xml:space="preserve">refuses a changed contract.</w:t>
+      </w:r>
+    </w:p>
+    <w:p>
+      <w:pPr>
+        <w:numPr>
+          <w:ilvl w:val="1"/>
+          <w:numId w:val="1048"/>
+        </w:numPr>
+        <w:pStyle w:val="Compact"/>
+      </w:pPr>
+      <w:r>
+        <w:rPr>
+          <w:rStyle w:val="VerbatimChar"/>
+        </w:rPr>
         <w:t xml:space="preserve">FORCE_*</w:t>
       </w:r>
       <w:r>
@@ -6296,7 +7069,7 @@
       <w:pPr>
         <w:numPr>
           <w:ilvl w:val="0"/>
-          <w:numId w:val="1045"/>
+          <w:numId w:val="1047"/>
         </w:numPr>
         <w:pStyle w:val="Compact"/>
       </w:pPr>
@@ -6335,7 +7108,7 @@
       <w:pPr>
         <w:numPr>
           <w:ilvl w:val="0"/>
-          <w:numId w:val="1045"/>
+          <w:numId w:val="1047"/>
         </w:numPr>
         <w:pStyle w:val="Compact"/>
       </w:pPr>
@@ -6356,7 +7129,7 @@
       <w:pPr>
         <w:numPr>
           <w:ilvl w:val="0"/>
-          <w:numId w:val="1045"/>
+          <w:numId w:val="1047"/>
         </w:numPr>
         <w:pStyle w:val="Compact"/>
       </w:pPr>
@@ -6368,7 +7141,7 @@
       <w:pPr>
         <w:numPr>
           <w:ilvl w:val="0"/>
-          <w:numId w:val="1045"/>
+          <w:numId w:val="1047"/>
         </w:numPr>
         <w:pStyle w:val="Compact"/>
       </w:pPr>
@@ -6376,8 +7149,8 @@
         <w:t xml:space="preserve">Only one heavy notebook runs on the project Drive at a time.</w:t>
       </w:r>
     </w:p>
-    <w:bookmarkEnd w:id="31"/>
-    <w:bookmarkStart w:id="32" w:name="legacy-external-validation-notebook-b"/>
+    <w:bookmarkEnd w:id="35"/>
+    <w:bookmarkStart w:id="36" w:name="legacy-external-validation-notebook-b"/>
     <w:p>
       <w:pPr>
         <w:pStyle w:val="Heading2"/>
@@ -6491,7 +7264,7 @@
       <w:pPr>
         <w:numPr>
           <w:ilvl w:val="0"/>
-          <w:numId w:val="1047"/>
+          <w:numId w:val="1049"/>
         </w:numPr>
         <w:pStyle w:val="Compact"/>
       </w:pPr>
@@ -6513,7 +7286,7 @@
       <w:pPr>
         <w:numPr>
           <w:ilvl w:val="0"/>
-          <w:numId w:val="1047"/>
+          <w:numId w:val="1049"/>
         </w:numPr>
         <w:pStyle w:val="Compact"/>
       </w:pPr>
@@ -6535,7 +7308,7 @@
       <w:pPr>
         <w:numPr>
           <w:ilvl w:val="0"/>
-          <w:numId w:val="1047"/>
+          <w:numId w:val="1049"/>
         </w:numPr>
         <w:pStyle w:val="Compact"/>
       </w:pPr>
@@ -6590,7 +7363,7 @@
       <w:pPr>
         <w:numPr>
           <w:ilvl w:val="0"/>
-          <w:numId w:val="1047"/>
+          <w:numId w:val="1049"/>
         </w:numPr>
         <w:pStyle w:val="Compact"/>
       </w:pPr>
@@ -6608,8 +7381,8 @@
         <w:t xml:space="preserve">not yet run on real data; it awaits the original model folders.</w:t>
       </w:r>
     </w:p>
-    <w:bookmarkEnd w:id="32"/>
-    <w:bookmarkStart w:id="36" w:name="Xe149fb2478db8da35cf9b6ef25933425736707f"/>
+    <w:bookmarkEnd w:id="36"/>
+    <w:bookmarkStart w:id="40" w:name="Xe149fb2478db8da35cf9b6ef25933425736707f"/>
     <w:p>
       <w:pPr>
         <w:pStyle w:val="Heading2"/>
@@ -6626,7 +7399,7 @@
         <w:t xml:space="preserve">The models and the pipeline were built in three stages. Each stage was triggered by a finding from the one before. All numbers are causal; results from the earlier leaky pipeline are never reported.</w:t>
       </w:r>
     </w:p>
-    <w:bookmarkStart w:id="33" w:name="X735e13a538b82c8e9d481869e251d3414058621"/>
+    <w:bookmarkStart w:id="37" w:name="X735e13a538b82c8e9d481869e251d3414058621"/>
     <w:p>
       <w:pPr>
         <w:pStyle w:val="Heading3"/>
@@ -6852,8 +7625,8 @@
         </w:tc>
       </w:tr>
     </w:tbl>
-    <w:bookmarkEnd w:id="33"/>
-    <w:bookmarkStart w:id="34" w:name="X02b04979c6e494c5ca74ff48a676d02b1c052ef"/>
+    <w:bookmarkEnd w:id="37"/>
+    <w:bookmarkStart w:id="38" w:name="X02b04979c6e494c5ca74ff48a676d02b1c052ef"/>
     <w:p>
       <w:pPr>
         <w:pStyle w:val="Heading3"/>
@@ -6884,7 +7657,7 @@
       <w:pPr>
         <w:numPr>
           <w:ilvl w:val="0"/>
-          <w:numId w:val="1048"/>
+          <w:numId w:val="1050"/>
         </w:numPr>
         <w:pStyle w:val="Compact"/>
       </w:pPr>
@@ -6896,7 +7669,7 @@
       <w:pPr>
         <w:numPr>
           <w:ilvl w:val="0"/>
-          <w:numId w:val="1048"/>
+          <w:numId w:val="1050"/>
         </w:numPr>
         <w:pStyle w:val="Compact"/>
       </w:pPr>
@@ -6908,7 +7681,7 @@
       <w:pPr>
         <w:numPr>
           <w:ilvl w:val="1"/>
-          <w:numId w:val="1049"/>
+          <w:numId w:val="1051"/>
         </w:numPr>
         <w:pStyle w:val="Compact"/>
       </w:pPr>
@@ -6920,7 +7693,7 @@
       <w:pPr>
         <w:numPr>
           <w:ilvl w:val="1"/>
-          <w:numId w:val="1049"/>
+          <w:numId w:val="1051"/>
         </w:numPr>
         <w:pStyle w:val="Compact"/>
       </w:pPr>
@@ -6932,7 +7705,7 @@
       <w:pPr>
         <w:numPr>
           <w:ilvl w:val="1"/>
-          <w:numId w:val="1049"/>
+          <w:numId w:val="1051"/>
         </w:numPr>
         <w:pStyle w:val="Compact"/>
       </w:pPr>
@@ -6944,7 +7717,7 @@
       <w:pPr>
         <w:numPr>
           <w:ilvl w:val="1"/>
-          <w:numId w:val="1049"/>
+          <w:numId w:val="1051"/>
         </w:numPr>
         <w:pStyle w:val="Compact"/>
       </w:pPr>
@@ -6956,7 +7729,7 @@
       <w:pPr>
         <w:numPr>
           <w:ilvl w:val="0"/>
-          <w:numId w:val="1048"/>
+          <w:numId w:val="1050"/>
         </w:numPr>
         <w:pStyle w:val="Compact"/>
       </w:pPr>
@@ -6968,7 +7741,7 @@
       <w:pPr>
         <w:numPr>
           <w:ilvl w:val="0"/>
-          <w:numId w:val="1048"/>
+          <w:numId w:val="1050"/>
         </w:numPr>
         <w:pStyle w:val="Compact"/>
       </w:pPr>
@@ -6980,7 +7753,7 @@
       <w:pPr>
         <w:numPr>
           <w:ilvl w:val="0"/>
-          <w:numId w:val="1048"/>
+          <w:numId w:val="1050"/>
         </w:numPr>
         <w:pStyle w:val="Compact"/>
       </w:pPr>
@@ -7000,7 +7773,7 @@
       <w:pPr>
         <w:numPr>
           <w:ilvl w:val="0"/>
-          <w:numId w:val="1050"/>
+          <w:numId w:val="1052"/>
         </w:numPr>
         <w:pStyle w:val="Compact"/>
       </w:pPr>
@@ -7012,7 +7785,7 @@
       <w:pPr>
         <w:numPr>
           <w:ilvl w:val="0"/>
-          <w:numId w:val="1050"/>
+          <w:numId w:val="1052"/>
         </w:numPr>
         <w:pStyle w:val="Compact"/>
       </w:pPr>
@@ -7488,8 +8261,8 @@
         <w:t xml:space="preserve">): hourly OSTA exceeded qSOFA on MIMIC-IV by +0.28 AUROC (95 % CI 0.21 to 0.35). In eICU, onset-anchored, the models were not better than qSOFA or SIRS.</w:t>
       </w:r>
     </w:p>
-    <w:bookmarkEnd w:id="34"/>
-    <w:bookmarkStart w:id="35" w:name="stage-3-v11-this-protocol"/>
+    <w:bookmarkEnd w:id="38"/>
+    <w:bookmarkStart w:id="39" w:name="stage-3-v11-this-protocol"/>
     <w:p>
       <w:pPr>
         <w:pStyle w:val="Heading3"/>
@@ -7510,7 +8283,7 @@
       <w:pPr>
         <w:numPr>
           <w:ilvl w:val="0"/>
-          <w:numId w:val="1051"/>
+          <w:numId w:val="1053"/>
         </w:numPr>
         <w:pStyle w:val="Compact"/>
       </w:pPr>
@@ -7532,7 +8305,7 @@
       <w:pPr>
         <w:numPr>
           <w:ilvl w:val="0"/>
-          <w:numId w:val="1051"/>
+          <w:numId w:val="1053"/>
         </w:numPr>
         <w:pStyle w:val="Compact"/>
       </w:pPr>
@@ -7554,7 +8327,7 @@
       <w:pPr>
         <w:numPr>
           <w:ilvl w:val="1"/>
-          <w:numId w:val="1052"/>
+          <w:numId w:val="1054"/>
         </w:numPr>
         <w:pStyle w:val="Compact"/>
       </w:pPr>
@@ -7566,7 +8339,7 @@
       <w:pPr>
         <w:numPr>
           <w:ilvl w:val="1"/>
-          <w:numId w:val="1052"/>
+          <w:numId w:val="1054"/>
         </w:numPr>
         <w:pStyle w:val="Compact"/>
       </w:pPr>
@@ -7578,7 +8351,7 @@
       <w:pPr>
         <w:numPr>
           <w:ilvl w:val="1"/>
-          <w:numId w:val="1052"/>
+          <w:numId w:val="1054"/>
         </w:numPr>
         <w:pStyle w:val="Compact"/>
       </w:pPr>
@@ -7590,7 +8363,7 @@
       <w:pPr>
         <w:numPr>
           <w:ilvl w:val="0"/>
-          <w:numId w:val="1051"/>
+          <w:numId w:val="1053"/>
         </w:numPr>
         <w:pStyle w:val="Compact"/>
       </w:pPr>
@@ -7608,9 +8381,9 @@
         <w:t xml:space="preserve">It was retired.</w:t>
       </w:r>
     </w:p>
-    <w:bookmarkEnd w:id="35"/>
-    <w:bookmarkEnd w:id="36"/>
-    <w:bookmarkStart w:id="37" w:name="X0296bd26dd3c8397ebfff3644d5772bc7e084f6"/>
+    <w:bookmarkEnd w:id="39"/>
+    <w:bookmarkEnd w:id="40"/>
+    <w:bookmarkStart w:id="41" w:name="X0296bd26dd3c8397ebfff3644d5772bc7e084f6"/>
     <w:p>
       <w:pPr>
         <w:pStyle w:val="Heading2"/>
@@ -7623,7 +8396,7 @@
       <w:pPr>
         <w:numPr>
           <w:ilvl w:val="0"/>
-          <w:numId w:val="1053"/>
+          <w:numId w:val="1055"/>
         </w:numPr>
         <w:pStyle w:val="Compact"/>
       </w:pPr>
@@ -7650,7 +8423,7 @@
       <w:pPr>
         <w:numPr>
           <w:ilvl w:val="0"/>
-          <w:numId w:val="1053"/>
+          <w:numId w:val="1055"/>
         </w:numPr>
         <w:pStyle w:val="Compact"/>
       </w:pPr>
@@ -7662,7 +8435,7 @@
       <w:pPr>
         <w:numPr>
           <w:ilvl w:val="0"/>
-          <w:numId w:val="1053"/>
+          <w:numId w:val="1055"/>
         </w:numPr>
         <w:pStyle w:val="Compact"/>
       </w:pPr>
@@ -7685,8 +8458,8 @@
         <w:t xml:space="preserve">notebook embeds the earlier label worker (Section 4); the repository copy carries the interval-units fix.</w:t>
       </w:r>
     </w:p>
-    <w:bookmarkEnd w:id="37"/>
-    <w:bookmarkEnd w:id="38"/>
+    <w:bookmarkEnd w:id="41"/>
+    <w:bookmarkEnd w:id="42"/>
     <w:sectPr/>
   </w:body>
 </w:document>
@@ -8132,15 +8905,6 @@
     <w:abstractNumId w:val="991"/>
   </w:num>
   <w:num w:numId="1041">
-    <w:abstractNumId w:val="991"/>
-  </w:num>
-  <w:num w:numId="1042">
-    <w:abstractNumId w:val="991"/>
-  </w:num>
-  <w:num w:numId="1043">
-    <w:abstractNumId w:val="991"/>
-  </w:num>
-  <w:num w:numId="1044">
     <w:abstractNumId w:val="99411"/>
     <w:lvlOverride w:ilvl="0">
       <w:startOverride w:val="1"/>
@@ -8170,11 +8934,47 @@
       <w:startOverride w:val="1"/>
     </w:lvlOverride>
   </w:num>
+  <w:num w:numId="1042">
+    <w:abstractNumId w:val="991"/>
+  </w:num>
+  <w:num w:numId="1043">
+    <w:abstractNumId w:val="991"/>
+  </w:num>
+  <w:num w:numId="1044">
+    <w:abstractNumId w:val="991"/>
+  </w:num>
   <w:num w:numId="1045">
     <w:abstractNumId w:val="991"/>
   </w:num>
   <w:num w:numId="1046">
-    <w:abstractNumId w:val="991"/>
+    <w:abstractNumId w:val="99411"/>
+    <w:lvlOverride w:ilvl="0">
+      <w:startOverride w:val="1"/>
+    </w:lvlOverride>
+    <w:lvlOverride w:ilvl="1">
+      <w:startOverride w:val="1"/>
+    </w:lvlOverride>
+    <w:lvlOverride w:ilvl="2">
+      <w:startOverride w:val="1"/>
+    </w:lvlOverride>
+    <w:lvlOverride w:ilvl="3">
+      <w:startOverride w:val="1"/>
+    </w:lvlOverride>
+    <w:lvlOverride w:ilvl="4">
+      <w:startOverride w:val="1"/>
+    </w:lvlOverride>
+    <w:lvlOverride w:ilvl="5">
+      <w:startOverride w:val="1"/>
+    </w:lvlOverride>
+    <w:lvlOverride w:ilvl="6">
+      <w:startOverride w:val="1"/>
+    </w:lvlOverride>
+    <w:lvlOverride w:ilvl="7">
+      <w:startOverride w:val="1"/>
+    </w:lvlOverride>
+    <w:lvlOverride w:ilvl="8">
+      <w:startOverride w:val="1"/>
+    </w:lvlOverride>
   </w:num>
   <w:num w:numId="1047">
     <w:abstractNumId w:val="991"/>
@@ -8195,6 +8995,12 @@
     <w:abstractNumId w:val="991"/>
   </w:num>
   <w:num w:numId="1053">
+    <w:abstractNumId w:val="991"/>
+  </w:num>
+  <w:num w:numId="1054">
+    <w:abstractNumId w:val="991"/>
+  </w:num>
+  <w:num w:numId="1055">
     <w:abstractNumId w:val="991"/>
   </w:num>
 </w:numbering>

</xml_diff>

<commit_message>
Protocol 10b: organ heads limited to the six SOFA organs plus one any-organ head; quantile point for both thresholds with a minimum-hours fallback; power statement
Co-Authored-By: Claude Fable 5.1 <noreply@anthropic.com>
Claude-Session: https://claude.ai/code/session_01LgDqxV9dzSvE8XpquGaBd5
</commit_message>
<xml_diff>
--- a/dev/protocol/Study_Protocol_v11.docx
+++ b/dev/protocol/Study_Protocol_v11.docx
@@ -6001,7 +6001,40 @@
               <w:jc w:val="left"/>
             </w:pPr>
             <w:r>
-              <w:t xml:space="preserve">Each head is a linear readout on the shared stay representation, trained jointly with the sepsis head on its own target: whether that organ’s SOFA component worsens within 6, 12 and 24 h (the targets already defined for self-supervised pretraining,</w:t>
+              <w:t xml:space="preserve">Seven heads, each a linear readout on the shared stay representation, trained jointly with the sepsis head on its own label-free target: for each of the six SOFA organs (respiration, coagulation, liver, cardiovascular, central nervous system, renal), whether that organ’s SOFA component rises within 6, 12 and 24 h; and one</w:t>
+            </w:r>
+            <w:r>
+              <w:t xml:space="preserve"> </w:t>
+            </w:r>
+            <w:r>
+              <w:t xml:space="preserve">“</w:t>
+            </w:r>
+            <w:r>
+              <w:t xml:space="preserve">any organ</w:t>
+            </w:r>
+            <w:r>
+              <w:t xml:space="preserve">”</w:t>
+            </w:r>
+            <w:r>
+              <w:t xml:space="preserve"> </w:t>
+            </w:r>
+            <w:r>
+              <w:t xml:space="preserve">head for a rise in any component. These are the per-component form of the</w:t>
+            </w:r>
+            <w:r>
+              <w:t xml:space="preserve"> </w:t>
+            </w:r>
+            <w:r>
+              <w:rPr>
+                <w:rStyle w:val="VerbatimChar"/>
+              </w:rPr>
+              <w:t xml:space="preserve">worsen</w:t>
+            </w:r>
+            <w:r>
+              <w:t xml:space="preserve"> </w:t>
+            </w:r>
+            <w:r>
+              <w:t xml:space="preserve">target already built for self-supervised pretraining in</w:t>
             </w:r>
             <w:r>
               <w:t xml:space="preserve"> </w:t>
@@ -6013,37 +6046,34 @@
               <w:t xml:space="preserve">ssl_targets</w:t>
             </w:r>
             <w:r>
-              <w:t xml:space="preserve">). Auxiliary loss weight 0.2, fixed. Heads never feed back into the sepsis risk</w:t>
-            </w:r>
-          </w:p>
-        </w:tc>
-        <w:tc>
-          <w:tcPr/>
-          <w:p>
-            <w:pPr>
-              <w:pStyle w:val="Compact"/>
-              <w:jc w:val="left"/>
-            </w:pPr>
-            <w:r>
-              <w:t xml:space="preserve">Six SOFA organs plus the eight other groups of the V11 mapping; groups with no SOFA target carry only the 6 h</w:t>
-            </w:r>
-            <w:r>
               <w:t xml:space="preserve"> </w:t>
             </w:r>
             <w:r>
-              <w:t xml:space="preserve">“</w:t>
-            </w:r>
-            <w:r>
-              <w:t xml:space="preserve">any worsening</w:t>
-            </w:r>
-            <w:r>
-              <w:t xml:space="preserve">”</w:t>
+              <w:t xml:space="preserve">(which currently reduces over components with</w:t>
             </w:r>
             <w:r>
               <w:t xml:space="preserve"> </w:t>
             </w:r>
             <w:r>
-              <w:t xml:space="preserve">target</w:t>
+              <w:rPr>
+                <w:rStyle w:val="VerbatimChar"/>
+              </w:rPr>
+              <w:t xml:space="preserve">.any(-1)</w:t>
+            </w:r>
+            <w:r>
+              <w:t xml:space="preserve">; stage 1b keeps the per-component values). Auxiliary loss weight 0.2, fixed in advance and not tuned. Heads never feed back into the sepsis risk</w:t>
+            </w:r>
+          </w:p>
+        </w:tc>
+        <w:tc>
+          <w:tcPr/>
+          <w:p>
+            <w:pPr>
+              <w:pStyle w:val="Compact"/>
+              <w:jc w:val="left"/>
+            </w:pPr>
+            <w:r>
+              <w:t xml:space="preserve">The eight non-SOFA predictor groups of the V11 mapping get no head: they have no organ-failure target, and a head without its own target would be decoration</w:t>
             </w:r>
           </w:p>
         </w:tc>
@@ -6158,19 +6188,19 @@
               <w:t xml:space="preserve">quantile operating point</w:t>
             </w:r>
             <w:r>
-              <w:t xml:space="preserve">: the budget threshold is found on the calibration split as before, then carried to any scored population as an alarm rate, not a probability: the fraction of calibration hours at or above the threshold is computed, and on the scored population the alarm fires on the same fraction of its own hours (the same quantile of its own score distribution). The quantile is label-free, so it can be set on a new hospital’s unlabelled hours</w:t>
-            </w:r>
-          </w:p>
-        </w:tc>
-        <w:tc>
-          <w:tcPr/>
-          <w:p>
-            <w:pPr>
-              <w:pStyle w:val="Compact"/>
-              <w:jc w:val="left"/>
-            </w:pPr>
-            <w:r>
-              <w:t xml:space="preserve">Budget 0.5 false alarms per patient-day on the calibration split, unchanged</w:t>
+              <w:t xml:space="preserve">: each threshold (budget and utility) is found on the calibration split exactly as before, then carried to any scored population as an alarm rate, not a probability: the fraction of calibration hours at or above the threshold is recorded, and on the scored population the alarm fires on the same fraction of its own hours (the same quantile of its own score distribution). The quantile is label-free, so it can be set on a new hospital’s unlabelled hours. It needs at least 10,000 scored hours; below that the absolute threshold is used and the fallback is recorded</w:t>
+            </w:r>
+          </w:p>
+        </w:tc>
+        <w:tc>
+          <w:tcPr/>
+          <w:p>
+            <w:pPr>
+              <w:pStyle w:val="Compact"/>
+              <w:jc w:val="left"/>
+            </w:pPr>
+            <w:r>
+              <w:t xml:space="preserve">Budget 0.5 false alarms per patient-day on the calibration split, unchanged. Applied to internal rows and to transfer rows</w:t>
             </w:r>
           </w:p>
         </w:tc>
@@ -6196,7 +6226,40 @@
               <w:jc w:val="left"/>
             </w:pPr>
             <w:r>
-              <w:t xml:space="preserve">Persistence 1 h (as now) vs 2 h; cooldown 6 h (as now, kept); fresh-information hours: alarms allowed in every hour (as now) vs only in hours in which at least one predictor was newly charted</w:t>
+              <w:t xml:space="preserve">Persistence 1 h (as now) vs 2 h (risk at or above the operating point in the current and the previous hour); cooldown 6 h (as now, kept); fresh-information hours: alarms allowed in every hour (as now) vs only in hours in which at least one predictor was newly charted (age channel under 1 h, the same</w:t>
+            </w:r>
+            <w:r>
+              <w:t xml:space="preserve"> </w:t>
+            </w:r>
+            <w:r>
+              <w:t xml:space="preserve">“</w:t>
+            </w:r>
+            <w:r>
+              <w:t xml:space="preserve">fresh</w:t>
+            </w:r>
+            <w:r>
+              <w:t xml:space="preserve">”</w:t>
+            </w:r>
+            <w:r>
+              <w:t xml:space="preserve"> </w:t>
+            </w:r>
+            <w:r>
+              <w:t xml:space="preserve">rule</w:t>
+            </w:r>
+            <w:r>
+              <w:t xml:space="preserve"> </w:t>
+            </w:r>
+            <w:r>
+              <w:rPr>
+                <w:rStyle w:val="VerbatimChar"/>
+              </w:rPr>
+              <w:t xml:space="preserve">ssl_targets</w:t>
+            </w:r>
+            <w:r>
+              <w:t xml:space="preserve"> </w:t>
+            </w:r>
+            <w:r>
+              <w:t xml:space="preserve">uses)</w:t>
             </w:r>
           </w:p>
         </w:tc>
@@ -6355,7 +6418,7 @@
         <w:t xml:space="preserve"> </w:t>
       </w:r>
       <w:r>
-        <w:t xml:space="preserve">The quantile operating point replaces the absolute threshold for every event metric and every transfer row in stage 2 if, on the validation splits, it keeps the false-alarm rate within 0.5 per patient-day on both databases and raises no model to silence. Otherwise the absolute threshold stays and the silence is reported as found.</w:t>
+        <w:t xml:space="preserve">The quantile operating point replaces the absolute threshold for every event metric and every transfer row in stage 2 if, on the validation splits, it keeps the false-alarm rate within 0.5 per patient-day on both databases and leaves no model silent. Otherwise the absolute threshold stays and the silence is reported as found. The PhysioNet utility on internal rows keeps the absolute utility threshold, for comparability; on transfer rows both forms are reported.</w:t>
       </w:r>
     </w:p>
     <w:p>
@@ -6400,6 +6463,28 @@
       </w:r>
       <w:r>
         <w:t xml:space="preserve">Predictor set, label, splits, calibration, bootstrap, horizon (6 h) and every other setting stay as in Section 1 to 9.</w:t>
+      </w:r>
+    </w:p>
+    <w:p>
+      <w:pPr>
+        <w:numPr>
+          <w:ilvl w:val="0"/>
+          <w:numId w:val="1041"/>
+        </w:numPr>
+        <w:pStyle w:val="Compact"/>
+      </w:pPr>
+      <w:r>
+        <w:rPr>
+          <w:bCs/>
+          <w:b/>
+        </w:rPr>
+        <w:t xml:space="preserve">Power, stated plainly.</w:t>
+      </w:r>
+      <w:r>
+        <w:t xml:space="preserve"> </w:t>
+      </w:r>
+      <w:r>
+        <w:t xml:space="preserve">Each validation split holds about 35 septic stays (MIMIC-IV) and about 22 (eICU). The rules above will be noisy, and early stopping already uses the same validation split, so validation numbers are optimistic for every configuration alike. That is why rule 1 defaults to the simpler model unless the heads are at least as good, and why none of these choices is a result: the result is the holdout.</w:t>
       </w:r>
     </w:p>
     <w:bookmarkEnd w:id="31"/>

</xml_diff>

<commit_message>
Stage 1b: concise cell skipped in stage 1b; summary names the silence cause and treats undefined heads as uninformative; protocol 10b states both silence mechanisms
Co-Authored-By: Claude Fable 5.1 <noreply@anthropic.com>
Claude-Session: https://claude.ai/code/session_01LgDqxV9dzSvE8XpquGaBd5
</commit_message>
<xml_diff>
--- a/dev/protocol/Study_Protocol_v11.docx
+++ b/dev/protocol/Study_Protocol_v11.docx
@@ -5856,7 +5856,22 @@
         <w:t xml:space="preserve"> </w:t>
       </w:r>
       <w:r>
-        <w:t xml:space="preserve">Stage 1 left three things undecided that stage 2 needs: (1) the project’s own architecture, after the organ grouping was not supported on either database; (2) the alarm threshold, after an absolute probability threshold set on the calibration split left OSTA, OSTA@bce and OSTA@tls silent on the eICU test split (no alarm within the false-alarm budget); (3) the alarm policy, which the consultants’ study will tune and which must exist before their answers can be used.</w:t>
+        <w:t xml:space="preserve">Stage 1 left three things undecided that stage 2 needs: (1) the project’s own architecture, after the organ grouping was not supported on either database; (2) the alarm threshold, after OSTA, OSTA@bce and OSTA@tls were silent on the eICU test split (no alarm within the false-alarm budget). Two mechanisms can produce that silence and the run outputs seen so far do not separate them: a scale shift (the absolute probability chosen on the calibration split fires there but not on the scored population), which the quantile operating point removes; or a budget that is unattainable on the calibration split (every threshold that fires at all exceeds 0.5 false alarms per patient-day there, so the rule selects</w:t>
+      </w:r>
+      <w:r>
+        <w:t xml:space="preserve"> </w:t>
+      </w:r>
+      <w:r>
+        <w:t xml:space="preserve">“</w:t>
+      </w:r>
+      <w:r>
+        <w:t xml:space="preserve">never alarm</w:t>
+      </w:r>
+      <w:r>
+        <w:t xml:space="preserve">”</w:t>
+      </w:r>
+      <w:r>
+        <w:t xml:space="preserve">), which no re-expression of the threshold can fix and which must then be reported as the finding it is. Stage 1b records the calibration alarm fraction of every chosen threshold so the cause is stated, not guessed; (3) the alarm policy, which the consultants’ study will tune and which must exist before their answers can be used.</w:t>
       </w:r>
     </w:p>
     <w:bookmarkStart w:id="30" w:name="Xa2a3df0fb6d41ee25c9705cf39e9693433a214a"/>
@@ -6418,7 +6433,7 @@
         <w:t xml:space="preserve"> </w:t>
       </w:r>
       <w:r>
-        <w:t xml:space="preserve">The quantile operating point replaces the absolute threshold for every event metric and every transfer row in stage 2 if, on the validation splits, it keeps the false-alarm rate within 0.5 per patient-day on both databases and leaves no model silent. Otherwise the absolute threshold stays and the silence is reported as found. The PhysioNet utility on internal rows keeps the absolute utility threshold, for comparability; on transfer rows both forms are reported.</w:t>
+        <w:t xml:space="preserve">The quantile operating point replaces the absolute threshold for every event metric and every transfer row in stage 2 if, on the validation splits, it keeps the false-alarm rate within 0.5 per patient-day on both databases and leaves no model silent. Otherwise the absolute threshold stays and the silence is reported as found, with its cause (scale shift, or a budget unattainable on the calibration split) named from the recorded calibration alarm fraction. The PhysioNet utility on internal rows keeps the absolute utility threshold, for comparability; on transfer rows both forms are reported.</w:t>
       </w:r>
     </w:p>
     <w:p>

</xml_diff>

<commit_message>
Protocol 10b: literature basis for the four rules, warning-time tie-break in rule 4, per-hospital alarm volume in stage 2, proposed pooled-training arm; notebook rebuilt
Co-Authored-By: Claude Fable 5.1 <noreply@anthropic.com>
Claude-Session: https://claude.ai/code/session_01LgDqxV9dzSvE8XpquGaBd5
</commit_message>
<xml_diff>
--- a/dev/protocol/Study_Protocol_v11.docx
+++ b/dev/protocol/Study_Protocol_v11.docx
@@ -2,7 +2,7 @@
 <file path=word/document.xml><?xml version="1.0" encoding="utf-8"?>
 <w:document xmlns:w="http://schemas.openxmlformats.org/wordprocessingml/2006/main" xmlns:m="http://schemas.openxmlformats.org/officeDocument/2006/math" xmlns:r="http://schemas.openxmlformats.org/officeDocument/2006/relationships" xmlns:o="urn:schemas-microsoft-com:office:office" xmlns:v="urn:schemas-microsoft-com:vml" xmlns:w10="urn:schemas-microsoft-com:office:word" xmlns:a="http://schemas.openxmlformats.org/drawingml/2006/main" xmlns:pic="http://schemas.openxmlformats.org/drawingml/2006/picture" xmlns:wp="http://schemas.openxmlformats.org/drawingml/2006/wordprocessingDrawing">
   <w:body>
-    <w:bookmarkStart w:id="42" w:name="X2351f334f17781296d91bfff42ea2b910f98989"/>
+    <w:bookmarkStart w:id="43" w:name="X2351f334f17781296d91bfff42ea2b910f98989"/>
     <w:p>
       <w:pPr>
         <w:pStyle w:val="Heading1"/>
@@ -5799,7 +5799,7 @@
       </w:r>
     </w:p>
     <w:bookmarkEnd w:id="29"/>
-    <w:bookmarkStart w:id="33" w:name="X107348d32c6f3016a98df991ad75d6f5e69b687"/>
+    <w:bookmarkStart w:id="34" w:name="X107348d32c6f3016a98df991ad75d6f5e69b687"/>
     <w:p>
       <w:pPr>
         <w:pStyle w:val="Heading2"/>
@@ -6455,7 +6455,7 @@
         <w:t xml:space="preserve"> </w:t>
       </w:r>
       <w:r>
-        <w:t xml:space="preserve">Among the four policy combinations (persistence 1 or 2 h × all hours or fresh hours), the one with the highest validation event sensitivity at or under the budget, averaged over both databases, is the stage-2 default. Ties go to the simpler policy. The consultants’ study may move the budget and the persistence; that change is recorded, dated, before the holdout opens.</w:t>
+        <w:t xml:space="preserve">Among the four policy combinations (persistence 1 or 2 h × all hours or fresh hours), the one with the highest validation event sensitivity at or under the budget, averaged over both databases, is the stage-2 default; at equal sensitivity the longer median warning time wins (a persistence rule costs an hour of warning, which only matters if it buys nothing); then the simpler policy. The consultants’ study may move the budget and the persistence; that change is recorded, dated, before the holdout opens.</w:t>
       </w:r>
     </w:p>
     <w:p>
@@ -6493,6 +6493,28 @@
           <w:bCs/>
           <w:b/>
         </w:rPr>
+        <w:t xml:space="preserve">Per-hospital alarm volume in stage 2.</w:t>
+      </w:r>
+      <w:r>
+        <w:t xml:space="preserve"> </w:t>
+      </w:r>
+      <w:r>
+        <w:t xml:space="preserve">Where the quantile operating point is adopted, the leave-hospital-out evaluation on eICU sets the quantile per held-out hospital when that hospital has at least 10,000 scored hours, and pooled otherwise. A ward experiences its own alarm volume, not the network’s average; deployed systems fix that volume per site (one new alert per 35 patients per day in the Kaiser Permanente deterioration programme).</w:t>
+      </w:r>
+    </w:p>
+    <w:p>
+      <w:pPr>
+        <w:numPr>
+          <w:ilvl w:val="0"/>
+          <w:numId w:val="1041"/>
+        </w:numPr>
+        <w:pStyle w:val="Compact"/>
+      </w:pPr>
+      <w:r>
+        <w:rPr>
+          <w:bCs/>
+          <w:b/>
+        </w:rPr>
         <w:t xml:space="preserve">Power, stated plainly.</w:t>
       </w:r>
       <w:r>
@@ -6503,12 +6525,70 @@
       </w:r>
     </w:p>
     <w:bookmarkEnd w:id="31"/>
-    <w:bookmarkStart w:id="32" w:name="b.3-outputs-and-audit-trail"/>
+    <w:bookmarkStart w:id="32" w:name="X6144da9730dc65da781d073c4b4a0a850200478"/>
     <w:p>
       <w:pPr>
         <w:pStyle w:val="Heading3"/>
       </w:pPr>
       <w:r>
+        <w:t xml:space="preserve">10b.2a Literature basis for the four rules (added 25 Oct 2026)</w:t>
+      </w:r>
+    </w:p>
+    <w:p>
+      <w:pPr>
+        <w:numPr>
+          <w:ilvl w:val="0"/>
+          <w:numId w:val="1042"/>
+        </w:numPr>
+        <w:pStyle w:val="Compact"/>
+      </w:pPr>
+      <w:r>
+        <w:t xml:space="preserve">Rules 1 and 4 rank by what a ward experiences: patients caught and alarms raised at a fixed burden, not AUROC. Deployed systems that changed outcomes fixed the alert volume and routed alerts through a screening team (Kaiser Permanente Advance Alert Monitor; COMPOSER at UC San Diego, which also abstains on unfamiliar inputs). The conformal abstention policy of Section 9 stays as the secondary policy for the same reason.</w:t>
+      </w:r>
+    </w:p>
+    <w:p>
+      <w:pPr>
+        <w:numPr>
+          <w:ilvl w:val="0"/>
+          <w:numId w:val="1042"/>
+        </w:numPr>
+        <w:pStyle w:val="Compact"/>
+      </w:pPr>
+      <w:r>
+        <w:t xml:space="preserve">Rule 2 withholds an organ reading that is near chance (AUROC under 0.60 on both databases): an explanation that is wrong more often than it is right is worse than none (automation bias, BMJ Digit Health 2026 review).</w:t>
+      </w:r>
+    </w:p>
+    <w:p>
+      <w:pPr>
+        <w:numPr>
+          <w:ilvl w:val="0"/>
+          <w:numId w:val="1042"/>
+        </w:numPr>
+        <w:pStyle w:val="Compact"/>
+      </w:pPr>
+      <w:r>
+        <w:t xml:space="preserve">Rule 3 carries alarm volume, not probability, across hospitals because scale shift between ICU databases is large (29 features differ materially between MIMIC-IV and eICU in the 2026 multi-centre sepsis study) and the budget is a per-site quantity.</w:t>
+      </w:r>
+    </w:p>
+    <w:p>
+      <w:pPr>
+        <w:numPr>
+          <w:ilvl w:val="0"/>
+          <w:numId w:val="1042"/>
+        </w:numPr>
+        <w:pStyle w:val="Compact"/>
+      </w:pPr>
+      <w:r>
+        <w:t xml:space="preserve">The multi-centre sepsis study (npj Digit Med 2026, HiRID/MIMIC-IV/eICU, 216,536 stays) found that fine-tuning a source model on a new site consistently underperformed, that retraining or pooled (fusion) training did best with small or large target data, and that supervised domain adaptation helped with medium target data. Stage 2 therefore adds a prespecified pooled-training arm (Section 11) rather than a fine-tuning arm.</w:t>
+      </w:r>
+    </w:p>
+    <w:bookmarkEnd w:id="32"/>
+    <w:bookmarkStart w:id="33" w:name="b.3-outputs-and-audit-trail"/>
+    <w:p>
+      <w:pPr>
+        <w:pStyle w:val="Heading3"/>
+      </w:pPr>
+      <w:r>
         <w:t xml:space="preserve">10b.3 Outputs and audit trail</w:t>
       </w:r>
     </w:p>
@@ -6516,7 +6596,7 @@
       <w:pPr>
         <w:numPr>
           <w:ilvl w:val="0"/>
-          <w:numId w:val="1042"/>
+          <w:numId w:val="1043"/>
         </w:numPr>
         <w:pStyle w:val="Compact"/>
       </w:pPr>
@@ -6528,7 +6608,7 @@
       <w:pPr>
         <w:numPr>
           <w:ilvl w:val="0"/>
-          <w:numId w:val="1042"/>
+          <w:numId w:val="1043"/>
         </w:numPr>
         <w:pStyle w:val="Compact"/>
       </w:pPr>
@@ -6567,7 +6647,7 @@
       <w:pPr>
         <w:numPr>
           <w:ilvl w:val="0"/>
-          <w:numId w:val="1042"/>
+          <w:numId w:val="1043"/>
         </w:numPr>
         <w:pStyle w:val="Compact"/>
       </w:pPr>
@@ -6575,9 +6655,9 @@
         <w:t xml:space="preserve">The outcome of rules 1 to 4 is appended to this section with the run key and date, and Section 11 is updated in the same commit. That commit is the stage-2 freeze candidate.</w:t>
       </w:r>
     </w:p>
-    <w:bookmarkEnd w:id="32"/>
     <w:bookmarkEnd w:id="33"/>
-    <w:bookmarkStart w:id="34" w:name="stage-2-full-cohort"/>
+    <w:bookmarkEnd w:id="34"/>
+    <w:bookmarkStart w:id="35" w:name="stage-2-full-cohort"/>
     <w:p>
       <w:pPr>
         <w:pStyle w:val="Heading2"/>
@@ -6590,7 +6670,7 @@
       <w:pPr>
         <w:numPr>
           <w:ilvl w:val="0"/>
-          <w:numId w:val="1043"/>
+          <w:numId w:val="1044"/>
         </w:numPr>
         <w:pStyle w:val="Compact"/>
       </w:pPr>
@@ -6621,7 +6701,7 @@
       <w:pPr>
         <w:numPr>
           <w:ilvl w:val="0"/>
-          <w:numId w:val="1043"/>
+          <w:numId w:val="1044"/>
         </w:numPr>
         <w:pStyle w:val="Compact"/>
       </w:pPr>
@@ -6631,187 +6711,6 @@
           <w:b/>
         </w:rPr>
         <w:t xml:space="preserve">Arms (TO FREEZE):</w:t>
-      </w:r>
-    </w:p>
-    <w:p>
-      <w:pPr>
-        <w:numPr>
-          <w:ilvl w:val="1"/>
-          <w:numId w:val="1044"/>
-        </w:numPr>
-        <w:pStyle w:val="Compact"/>
-      </w:pPr>
-      <w:r>
-        <w:t xml:space="preserve">the union of the MIMIC-IV and eICU shortlists: GRU-D, TCN, flat OSTA, SSL-CNN→flat (pooled encoder);</w:t>
-      </w:r>
-    </w:p>
-    <w:p>
-      <w:pPr>
-        <w:numPr>
-          <w:ilvl w:val="1"/>
-          <w:numId w:val="1044"/>
-        </w:numPr>
-        <w:pStyle w:val="Compact"/>
-      </w:pPr>
-      <w:r>
-        <w:t xml:space="preserve">OSTA, CNN–Transformer, boosted trees and logistic regression;</w:t>
-      </w:r>
-    </w:p>
-    <w:p>
-      <w:pPr>
-        <w:numPr>
-          <w:ilvl w:val="1"/>
-          <w:numId w:val="1044"/>
-        </w:numPr>
-        <w:pStyle w:val="Compact"/>
-      </w:pPr>
-      <w:r>
-        <w:t xml:space="preserve">signature boosted trees;</w:t>
-      </w:r>
-    </w:p>
-    <w:p>
-      <w:pPr>
-        <w:numPr>
-          <w:ilvl w:val="1"/>
-          <w:numId w:val="1044"/>
-        </w:numPr>
-        <w:pStyle w:val="Compact"/>
-      </w:pPr>
-      <w:r>
-        <w:t xml:space="preserve">the D1 pair, labelled exploratory.</w:t>
-      </w:r>
-    </w:p>
-    <w:p>
-      <w:pPr>
-        <w:numPr>
-          <w:ilvl w:val="0"/>
-          <w:numId w:val="1043"/>
-        </w:numPr>
-        <w:pStyle w:val="Compact"/>
-      </w:pPr>
-      <w:r>
-        <w:rPr>
-          <w:bCs/>
-          <w:b/>
-        </w:rPr>
-        <w:t xml:space="preserve">Loss (decided 24 Oct 2026):</w:t>
-      </w:r>
-      <w:r>
-        <w:t xml:space="preserve"> </w:t>
-      </w:r>
-      <w:r>
-        <w:t xml:space="preserve">plain cross-entropy for every arm, by the Section 10 rule (first in three of four validation comparisons). The utility-weighted loss is kept selectable and runs once as a prespecified secondary comparator on</w:t>
-      </w:r>
-      <w:r>
-        <w:t xml:space="preserve"> </w:t>
-      </w:r>
-      <w:r>
-        <w:rPr>
-          <w:rStyle w:val="VerbatimChar"/>
-        </w:rPr>
-        <w:t xml:space="preserve">ssl_cnn_osta</w:t>
-      </w:r>
-      <w:r>
-        <w:t xml:space="preserve"> </w:t>
-      </w:r>
-      <w:r>
-        <w:t xml:space="preserve">only, where it ranked first on MIMIC-IV validation; it cannot replace the primary.</w:t>
-      </w:r>
-    </w:p>
-    <w:p>
-      <w:pPr>
-        <w:numPr>
-          <w:ilvl w:val="0"/>
-          <w:numId w:val="1043"/>
-        </w:numPr>
-        <w:pStyle w:val="Compact"/>
-      </w:pPr>
-      <w:r>
-        <w:rPr>
-          <w:bCs/>
-          <w:b/>
-        </w:rPr>
-        <w:t xml:space="preserve">Project model (TO FREEZE by stage 1b, Section 10b):</w:t>
-      </w:r>
-      <w:r>
-        <w:t xml:space="preserve"> </w:t>
-      </w:r>
-      <w:r>
-        <w:rPr>
-          <w:rStyle w:val="VerbatimChar"/>
-        </w:rPr>
-        <w:t xml:space="preserve">flat_osta</w:t>
-      </w:r>
-      <w:r>
-        <w:t xml:space="preserve"> </w:t>
-      </w:r>
-      <w:r>
-        <w:t xml:space="preserve">or</w:t>
-      </w:r>
-      <w:r>
-        <w:t xml:space="preserve"> </w:t>
-      </w:r>
-      <w:r>
-        <w:rPr>
-          <w:rStyle w:val="VerbatimChar"/>
-        </w:rPr>
-        <w:t xml:space="preserve">flat_osta_heads</w:t>
-      </w:r>
-      <w:r>
-        <w:t xml:space="preserve">, with the input-dropout setting chosen on validation; it replaces</w:t>
-      </w:r>
-      <w:r>
-        <w:t xml:space="preserve"> </w:t>
-      </w:r>
-      <w:r>
-        <w:rPr>
-          <w:rStyle w:val="VerbatimChar"/>
-        </w:rPr>
-        <w:t xml:space="preserve">flat_osta</w:t>
-      </w:r>
-      <w:r>
-        <w:t xml:space="preserve"> </w:t>
-      </w:r>
-      <w:r>
-        <w:t xml:space="preserve">in the arm list.</w:t>
-      </w:r>
-    </w:p>
-    <w:p>
-      <w:pPr>
-        <w:numPr>
-          <w:ilvl w:val="0"/>
-          <w:numId w:val="1043"/>
-        </w:numPr>
-        <w:pStyle w:val="Compact"/>
-      </w:pPr>
-      <w:r>
-        <w:rPr>
-          <w:bCs/>
-          <w:b/>
-        </w:rPr>
-        <w:t xml:space="preserve">Operating point and alarm policy (TO FREEZE by stage 1b):</w:t>
-      </w:r>
-      <w:r>
-        <w:t xml:space="preserve"> </w:t>
-      </w:r>
-      <w:r>
-        <w:t xml:space="preserve">quantile operating point and the policy chosen by rule 10b.2.4, unless rule 3 fails.</w:t>
-      </w:r>
-    </w:p>
-    <w:p>
-      <w:pPr>
-        <w:numPr>
-          <w:ilvl w:val="0"/>
-          <w:numId w:val="1043"/>
-        </w:numPr>
-        <w:pStyle w:val="Compact"/>
-      </w:pPr>
-      <w:r>
-        <w:rPr>
-          <w:bCs/>
-          <w:b/>
-        </w:rPr>
-        <w:t xml:space="preserve">Pretraining corpus (TO FREEZE):</w:t>
       </w:r>
     </w:p>
     <w:p>
@@ -6823,7 +6722,7 @@
         <w:pStyle w:val="Compact"/>
       </w:pPr>
       <w:r>
-        <w:t xml:space="preserve">non-cohort stays plus training-split stays (inputs only, no labels);</w:t>
+        <w:t xml:space="preserve">the union of the MIMIC-IV and eICU shortlists: GRU-D, TCN, flat OSTA, SSL-CNN→flat (pooled encoder);</w:t>
       </w:r>
     </w:p>
     <w:p>
@@ -6835,67 +6734,186 @@
         <w:pStyle w:val="Compact"/>
       </w:pPr>
       <w:r>
-        <w:t xml:space="preserve">excluding every stay of a validation, test or protected patient.</w:t>
-      </w:r>
-    </w:p>
-    <w:p>
-      <w:pPr>
-        <w:numPr>
-          <w:ilvl w:val="0"/>
-          <w:numId w:val="1043"/>
-        </w:numPr>
-        <w:pStyle w:val="Compact"/>
-      </w:pPr>
-      <w:r>
-        <w:rPr>
-          <w:bCs/>
-          <w:b/>
-        </w:rPr>
-        <w:t xml:space="preserve">Final-release encoder (TO FREEZE):</w:t>
-      </w:r>
-      <w:r>
-        <w:t xml:space="preserve"> </w:t>
-      </w:r>
-      <w:r>
-        <w:t xml:space="preserve">Section 5.3.</w:t>
-      </w:r>
-    </w:p>
-    <w:p>
-      <w:pPr>
-        <w:numPr>
-          <w:ilvl w:val="0"/>
-          <w:numId w:val="1043"/>
-        </w:numPr>
-        <w:pStyle w:val="Compact"/>
-      </w:pPr>
-      <w:r>
-        <w:rPr>
-          <w:bCs/>
-          <w:b/>
-        </w:rPr>
-        <w:t xml:space="preserve">eICU leave-hospital-out (TO FREEZE):</w:t>
-      </w:r>
-      <w:r>
-        <w:t xml:space="preserve"> </w:t>
-      </w:r>
-      <w:r>
-        <w:t xml:space="preserve">hospital grouping and the minimum events per hospital.</w:t>
-      </w:r>
-    </w:p>
-    <w:p>
-      <w:pPr>
-        <w:numPr>
-          <w:ilvl w:val="0"/>
-          <w:numId w:val="1043"/>
-        </w:numPr>
-        <w:pStyle w:val="Compact"/>
-      </w:pPr>
-      <w:r>
-        <w:rPr>
-          <w:bCs/>
-          <w:b/>
-        </w:rPr>
-        <w:t xml:space="preserve">Then:</w:t>
+        <w:t xml:space="preserve">OSTA, CNN–Transformer, boosted trees and logistic regression;</w:t>
+      </w:r>
+    </w:p>
+    <w:p>
+      <w:pPr>
+        <w:numPr>
+          <w:ilvl w:val="1"/>
+          <w:numId w:val="1045"/>
+        </w:numPr>
+        <w:pStyle w:val="Compact"/>
+      </w:pPr>
+      <w:r>
+        <w:t xml:space="preserve">signature boosted trees;</w:t>
+      </w:r>
+    </w:p>
+    <w:p>
+      <w:pPr>
+        <w:numPr>
+          <w:ilvl w:val="1"/>
+          <w:numId w:val="1045"/>
+        </w:numPr>
+        <w:pStyle w:val="Compact"/>
+      </w:pPr>
+      <w:r>
+        <w:t xml:space="preserve">the D1 pair, labelled exploratory;</w:t>
+      </w:r>
+    </w:p>
+    <w:p>
+      <w:pPr>
+        <w:numPr>
+          <w:ilvl w:val="1"/>
+          <w:numId w:val="1045"/>
+        </w:numPr>
+        <w:pStyle w:val="Compact"/>
+      </w:pPr>
+      <w:r>
+        <w:rPr>
+          <w:bCs/>
+          <w:b/>
+        </w:rPr>
+        <w:t xml:space="preserve">(proposed 25 Oct 2026, to confirm before the freeze)</w:t>
+      </w:r>
+      <w:r>
+        <w:t xml:space="preserve"> </w:t>
+      </w:r>
+      <w:r>
+        <w:t xml:space="preserve">a pooled-training arm: the project model and GRU-D trained once on the MIMIC-IV and eICU development splits together (same hours, same label, one normaliser per database), evaluated on each database’s test split and leave-hospital-out on eICU. Basis: pooled training was the best strategy for small and large target data in the 2026 multi-centre sepsis study; fine-tuning was not.</w:t>
+      </w:r>
+    </w:p>
+    <w:p>
+      <w:pPr>
+        <w:numPr>
+          <w:ilvl w:val="0"/>
+          <w:numId w:val="1044"/>
+        </w:numPr>
+        <w:pStyle w:val="Compact"/>
+      </w:pPr>
+      <w:r>
+        <w:rPr>
+          <w:bCs/>
+          <w:b/>
+        </w:rPr>
+        <w:t xml:space="preserve">Loss (decided 24 Oct 2026):</w:t>
+      </w:r>
+      <w:r>
+        <w:t xml:space="preserve"> </w:t>
+      </w:r>
+      <w:r>
+        <w:t xml:space="preserve">plain cross-entropy for every arm, by the Section 10 rule (first in three of four validation comparisons). The utility-weighted loss is kept selectable and runs once as a prespecified secondary comparator on</w:t>
+      </w:r>
+      <w:r>
+        <w:t xml:space="preserve"> </w:t>
+      </w:r>
+      <w:r>
+        <w:rPr>
+          <w:rStyle w:val="VerbatimChar"/>
+        </w:rPr>
+        <w:t xml:space="preserve">ssl_cnn_osta</w:t>
+      </w:r>
+      <w:r>
+        <w:t xml:space="preserve"> </w:t>
+      </w:r>
+      <w:r>
+        <w:t xml:space="preserve">only, where it ranked first on MIMIC-IV validation; it cannot replace the primary.</w:t>
+      </w:r>
+    </w:p>
+    <w:p>
+      <w:pPr>
+        <w:numPr>
+          <w:ilvl w:val="0"/>
+          <w:numId w:val="1044"/>
+        </w:numPr>
+        <w:pStyle w:val="Compact"/>
+      </w:pPr>
+      <w:r>
+        <w:rPr>
+          <w:bCs/>
+          <w:b/>
+        </w:rPr>
+        <w:t xml:space="preserve">Project model (TO FREEZE by stage 1b, Section 10b):</w:t>
+      </w:r>
+      <w:r>
+        <w:t xml:space="preserve"> </w:t>
+      </w:r>
+      <w:r>
+        <w:rPr>
+          <w:rStyle w:val="VerbatimChar"/>
+        </w:rPr>
+        <w:t xml:space="preserve">flat_osta</w:t>
+      </w:r>
+      <w:r>
+        <w:t xml:space="preserve"> </w:t>
+      </w:r>
+      <w:r>
+        <w:t xml:space="preserve">or</w:t>
+      </w:r>
+      <w:r>
+        <w:t xml:space="preserve"> </w:t>
+      </w:r>
+      <w:r>
+        <w:rPr>
+          <w:rStyle w:val="VerbatimChar"/>
+        </w:rPr>
+        <w:t xml:space="preserve">flat_osta_heads</w:t>
+      </w:r>
+      <w:r>
+        <w:t xml:space="preserve">, with the input-dropout setting chosen on validation; it replaces</w:t>
+      </w:r>
+      <w:r>
+        <w:t xml:space="preserve"> </w:t>
+      </w:r>
+      <w:r>
+        <w:rPr>
+          <w:rStyle w:val="VerbatimChar"/>
+        </w:rPr>
+        <w:t xml:space="preserve">flat_osta</w:t>
+      </w:r>
+      <w:r>
+        <w:t xml:space="preserve"> </w:t>
+      </w:r>
+      <w:r>
+        <w:t xml:space="preserve">in the arm list.</w:t>
+      </w:r>
+    </w:p>
+    <w:p>
+      <w:pPr>
+        <w:numPr>
+          <w:ilvl w:val="0"/>
+          <w:numId w:val="1044"/>
+        </w:numPr>
+        <w:pStyle w:val="Compact"/>
+      </w:pPr>
+      <w:r>
+        <w:rPr>
+          <w:bCs/>
+          <w:b/>
+        </w:rPr>
+        <w:t xml:space="preserve">Operating point and alarm policy (TO FREEZE by stage 1b):</w:t>
+      </w:r>
+      <w:r>
+        <w:t xml:space="preserve"> </w:t>
+      </w:r>
+      <w:r>
+        <w:t xml:space="preserve">quantile operating point and the policy chosen by rule 10b.2.4, unless rule 3 fails.</w:t>
+      </w:r>
+    </w:p>
+    <w:p>
+      <w:pPr>
+        <w:numPr>
+          <w:ilvl w:val="0"/>
+          <w:numId w:val="1044"/>
+        </w:numPr>
+        <w:pStyle w:val="Compact"/>
+      </w:pPr>
+      <w:r>
+        <w:rPr>
+          <w:bCs/>
+          <w:b/>
+        </w:rPr>
+        <w:t xml:space="preserve">Pretraining corpus (TO FREEZE):</w:t>
       </w:r>
     </w:p>
     <w:p>
@@ -6907,7 +6925,7 @@
         <w:pStyle w:val="Compact"/>
       </w:pPr>
       <w:r>
-        <w:t xml:space="preserve">freeze this protocol (commit);</w:t>
+        <w:t xml:space="preserve">non-cohort stays plus training-split stays (inputs only, no labels);</w:t>
       </w:r>
     </w:p>
     <w:p>
@@ -6919,6 +6937,90 @@
         <w:pStyle w:val="Compact"/>
       </w:pPr>
       <w:r>
+        <w:t xml:space="preserve">excluding every stay of a validation, test or protected patient.</w:t>
+      </w:r>
+    </w:p>
+    <w:p>
+      <w:pPr>
+        <w:numPr>
+          <w:ilvl w:val="0"/>
+          <w:numId w:val="1044"/>
+        </w:numPr>
+        <w:pStyle w:val="Compact"/>
+      </w:pPr>
+      <w:r>
+        <w:rPr>
+          <w:bCs/>
+          <w:b/>
+        </w:rPr>
+        <w:t xml:space="preserve">Final-release encoder (TO FREEZE):</w:t>
+      </w:r>
+      <w:r>
+        <w:t xml:space="preserve"> </w:t>
+      </w:r>
+      <w:r>
+        <w:t xml:space="preserve">Section 5.3.</w:t>
+      </w:r>
+    </w:p>
+    <w:p>
+      <w:pPr>
+        <w:numPr>
+          <w:ilvl w:val="0"/>
+          <w:numId w:val="1044"/>
+        </w:numPr>
+        <w:pStyle w:val="Compact"/>
+      </w:pPr>
+      <w:r>
+        <w:rPr>
+          <w:bCs/>
+          <w:b/>
+        </w:rPr>
+        <w:t xml:space="preserve">eICU leave-hospital-out (TO FREEZE):</w:t>
+      </w:r>
+      <w:r>
+        <w:t xml:space="preserve"> </w:t>
+      </w:r>
+      <w:r>
+        <w:t xml:space="preserve">hospital grouping and the minimum events per hospital.</w:t>
+      </w:r>
+    </w:p>
+    <w:p>
+      <w:pPr>
+        <w:numPr>
+          <w:ilvl w:val="0"/>
+          <w:numId w:val="1044"/>
+        </w:numPr>
+        <w:pStyle w:val="Compact"/>
+      </w:pPr>
+      <w:r>
+        <w:rPr>
+          <w:bCs/>
+          <w:b/>
+        </w:rPr>
+        <w:t xml:space="preserve">Then:</w:t>
+      </w:r>
+    </w:p>
+    <w:p>
+      <w:pPr>
+        <w:numPr>
+          <w:ilvl w:val="1"/>
+          <w:numId w:val="1047"/>
+        </w:numPr>
+        <w:pStyle w:val="Compact"/>
+      </w:pPr>
+      <w:r>
+        <w:t xml:space="preserve">freeze this protocol (commit);</w:t>
+      </w:r>
+    </w:p>
+    <w:p>
+      <w:pPr>
+        <w:numPr>
+          <w:ilvl w:val="1"/>
+          <w:numId w:val="1047"/>
+        </w:numPr>
+        <w:pStyle w:val="Compact"/>
+      </w:pPr>
+      <w:r>
         <w:t xml:space="preserve">declare</w:t>
       </w:r>
       <w:r>
@@ -6938,7 +7040,7 @@
       <w:pPr>
         <w:numPr>
           <w:ilvl w:val="1"/>
-          <w:numId w:val="1046"/>
+          <w:numId w:val="1047"/>
         </w:numPr>
         <w:pStyle w:val="Compact"/>
       </w:pPr>
@@ -6950,7 +7052,7 @@
       <w:pPr>
         <w:numPr>
           <w:ilvl w:val="1"/>
-          <w:numId w:val="1046"/>
+          <w:numId w:val="1047"/>
         </w:numPr>
         <w:pStyle w:val="Compact"/>
       </w:pPr>
@@ -6962,7 +7064,7 @@
       <w:pPr>
         <w:numPr>
           <w:ilvl w:val="0"/>
-          <w:numId w:val="1043"/>
+          <w:numId w:val="1044"/>
         </w:numPr>
         <w:pStyle w:val="Compact"/>
       </w:pPr>
@@ -6980,8 +7082,8 @@
         <w:t xml:space="preserve">TRIPOD+AI for reporting and PROBAST+AI for the risk-of-bias assessment.</w:t>
       </w:r>
     </w:p>
-    <w:bookmarkEnd w:id="34"/>
-    <w:bookmarkStart w:id="35" w:name="reproducibility"/>
+    <w:bookmarkEnd w:id="35"/>
+    <w:bookmarkStart w:id="36" w:name="reproducibility"/>
     <w:p>
       <w:pPr>
         <w:pStyle w:val="Heading2"/>
@@ -6994,7 +7096,7 @@
       <w:pPr>
         <w:numPr>
           <w:ilvl w:val="0"/>
-          <w:numId w:val="1047"/>
+          <w:numId w:val="1048"/>
         </w:numPr>
         <w:pStyle w:val="Compact"/>
       </w:pPr>
@@ -7022,7 +7124,7 @@
       <w:pPr>
         <w:numPr>
           <w:ilvl w:val="0"/>
-          <w:numId w:val="1047"/>
+          <w:numId w:val="1048"/>
         </w:numPr>
         <w:pStyle w:val="Compact"/>
       </w:pPr>
@@ -7109,131 +7211,131 @@
       <w:pPr>
         <w:numPr>
           <w:ilvl w:val="1"/>
+          <w:numId w:val="1049"/>
+        </w:numPr>
+        <w:pStyle w:val="Compact"/>
+      </w:pPr>
+      <w:r>
+        <w:t xml:space="preserve">A changed input produces a new key.</w:t>
+      </w:r>
+    </w:p>
+    <w:p>
+      <w:pPr>
+        <w:numPr>
+          <w:ilvl w:val="1"/>
+          <w:numId w:val="1049"/>
+        </w:numPr>
+        <w:pStyle w:val="Compact"/>
+      </w:pPr>
+      <w:r>
+        <w:t xml:space="preserve">A per-run</w:t>
+      </w:r>
+      <w:r>
+        <w:t xml:space="preserve"> </w:t>
+      </w:r>
+      <w:r>
+        <w:rPr>
+          <w:rStyle w:val="VerbatimChar"/>
+        </w:rPr>
+        <w:t xml:space="preserve">contract.json</w:t>
+      </w:r>
+      <w:r>
+        <w:t xml:space="preserve"> </w:t>
+      </w:r>
+      <w:r>
+        <w:t xml:space="preserve">refuses a changed contract.</w:t>
+      </w:r>
+    </w:p>
+    <w:p>
+      <w:pPr>
+        <w:numPr>
+          <w:ilvl w:val="1"/>
+          <w:numId w:val="1049"/>
+        </w:numPr>
+        <w:pStyle w:val="Compact"/>
+      </w:pPr>
+      <w:r>
+        <w:rPr>
+          <w:rStyle w:val="VerbatimChar"/>
+        </w:rPr>
+        <w:t xml:space="preserve">FORCE_*</w:t>
+      </w:r>
+      <w:r>
+        <w:t xml:space="preserve"> </w:t>
+      </w:r>
+      <w:r>
+        <w:t xml:space="preserve">settings stay False.</w:t>
+      </w:r>
+    </w:p>
+    <w:p>
+      <w:pPr>
+        <w:numPr>
+          <w:ilvl w:val="0"/>
           <w:numId w:val="1048"/>
         </w:numPr>
         <w:pStyle w:val="Compact"/>
       </w:pPr>
       <w:r>
-        <w:t xml:space="preserve">A changed input produces a new key.</w:t>
-      </w:r>
-    </w:p>
-    <w:p>
-      <w:pPr>
-        <w:numPr>
-          <w:ilvl w:val="1"/>
+        <w:t xml:space="preserve">Each arm writes</w:t>
+      </w:r>
+      <w:r>
+        <w:t xml:space="preserve"> </w:t>
+      </w:r>
+      <w:r>
+        <w:rPr>
+          <w:rStyle w:val="VerbatimChar"/>
+        </w:rPr>
+        <w:t xml:space="preserve">completed.json</w:t>
+      </w:r>
+      <w:r>
+        <w:t xml:space="preserve">. Every run writes</w:t>
+      </w:r>
+      <w:r>
+        <w:t xml:space="preserve"> </w:t>
+      </w:r>
+      <w:r>
+        <w:rPr>
+          <w:rStyle w:val="VerbatimChar"/>
+        </w:rPr>
+        <w:t xml:space="preserve">run_protocol.json</w:t>
+      </w:r>
+      <w:r>
+        <w:t xml:space="preserve"> </w:t>
+      </w:r>
+      <w:r>
+        <w:t xml:space="preserve">with the configuration, the feature list and the rules.</w:t>
+      </w:r>
+    </w:p>
+    <w:p>
+      <w:pPr>
+        <w:numPr>
+          <w:ilvl w:val="0"/>
           <w:numId w:val="1048"/>
         </w:numPr>
         <w:pStyle w:val="Compact"/>
       </w:pPr>
       <w:r>
-        <w:t xml:space="preserve">A per-run</w:t>
-      </w:r>
-      <w:r>
-        <w:t xml:space="preserve"> </w:t>
-      </w:r>
-      <w:r>
         <w:rPr>
           <w:rStyle w:val="VerbatimChar"/>
         </w:rPr>
-        <w:t xml:space="preserve">contract.json</w:t>
-      </w:r>
-      <w:r>
-        <w:t xml:space="preserve"> </w:t>
-      </w:r>
-      <w:r>
-        <w:t xml:space="preserve">refuses a changed contract.</w:t>
-      </w:r>
-    </w:p>
-    <w:p>
-      <w:pPr>
-        <w:numPr>
-          <w:ilvl w:val="1"/>
+        <w:t xml:space="preserve">_11</w:t>
+      </w:r>
+      <w:r>
+        <w:t xml:space="preserve"> </w:t>
+      </w:r>
+      <w:r>
+        <w:t xml:space="preserve">runs 212 engineering self-tests before training, covering causality, split leakage, scorer agreement and the loss definitions. The repository copy has one more.</w:t>
+      </w:r>
+    </w:p>
+    <w:p>
+      <w:pPr>
+        <w:numPr>
+          <w:ilvl w:val="0"/>
           <w:numId w:val="1048"/>
         </w:numPr>
         <w:pStyle w:val="Compact"/>
       </w:pPr>
       <w:r>
-        <w:rPr>
-          <w:rStyle w:val="VerbatimChar"/>
-        </w:rPr>
-        <w:t xml:space="preserve">FORCE_*</w:t>
-      </w:r>
-      <w:r>
-        <w:t xml:space="preserve"> </w:t>
-      </w:r>
-      <w:r>
-        <w:t xml:space="preserve">settings stay False.</w:t>
-      </w:r>
-    </w:p>
-    <w:p>
-      <w:pPr>
-        <w:numPr>
-          <w:ilvl w:val="0"/>
-          <w:numId w:val="1047"/>
-        </w:numPr>
-        <w:pStyle w:val="Compact"/>
-      </w:pPr>
-      <w:r>
-        <w:t xml:space="preserve">Each arm writes</w:t>
-      </w:r>
-      <w:r>
-        <w:t xml:space="preserve"> </w:t>
-      </w:r>
-      <w:r>
-        <w:rPr>
-          <w:rStyle w:val="VerbatimChar"/>
-        </w:rPr>
-        <w:t xml:space="preserve">completed.json</w:t>
-      </w:r>
-      <w:r>
-        <w:t xml:space="preserve">. Every run writes</w:t>
-      </w:r>
-      <w:r>
-        <w:t xml:space="preserve"> </w:t>
-      </w:r>
-      <w:r>
-        <w:rPr>
-          <w:rStyle w:val="VerbatimChar"/>
-        </w:rPr>
-        <w:t xml:space="preserve">run_protocol.json</w:t>
-      </w:r>
-      <w:r>
-        <w:t xml:space="preserve"> </w:t>
-      </w:r>
-      <w:r>
-        <w:t xml:space="preserve">with the configuration, the feature list and the rules.</w:t>
-      </w:r>
-    </w:p>
-    <w:p>
-      <w:pPr>
-        <w:numPr>
-          <w:ilvl w:val="0"/>
-          <w:numId w:val="1047"/>
-        </w:numPr>
-        <w:pStyle w:val="Compact"/>
-      </w:pPr>
-      <w:r>
-        <w:rPr>
-          <w:rStyle w:val="VerbatimChar"/>
-        </w:rPr>
-        <w:t xml:space="preserve">_11</w:t>
-      </w:r>
-      <w:r>
-        <w:t xml:space="preserve"> </w:t>
-      </w:r>
-      <w:r>
-        <w:t xml:space="preserve">runs 212 engineering self-tests before training, covering causality, split leakage, scorer agreement and the loss definitions. The repository copy has one more.</w:t>
-      </w:r>
-    </w:p>
-    <w:p>
-      <w:pPr>
-        <w:numPr>
-          <w:ilvl w:val="0"/>
-          <w:numId w:val="1047"/>
-        </w:numPr>
-        <w:pStyle w:val="Compact"/>
-      </w:pPr>
-      <w:r>
         <w:t xml:space="preserve">A synthetic fixture run of the whole notebook must pass before any notebook is released.</w:t>
       </w:r>
     </w:p>
@@ -7241,7 +7343,7 @@
       <w:pPr>
         <w:numPr>
           <w:ilvl w:val="0"/>
-          <w:numId w:val="1047"/>
+          <w:numId w:val="1048"/>
         </w:numPr>
         <w:pStyle w:val="Compact"/>
       </w:pPr>
@@ -7249,8 +7351,8 @@
         <w:t xml:space="preserve">Only one heavy notebook runs on the project Drive at a time.</w:t>
       </w:r>
     </w:p>
-    <w:bookmarkEnd w:id="35"/>
-    <w:bookmarkStart w:id="36" w:name="legacy-external-validation-notebook-b"/>
+    <w:bookmarkEnd w:id="36"/>
+    <w:bookmarkStart w:id="37" w:name="legacy-external-validation-notebook-b"/>
     <w:p>
       <w:pPr>
         <w:pStyle w:val="Heading2"/>
@@ -7364,7 +7466,7 @@
       <w:pPr>
         <w:numPr>
           <w:ilvl w:val="0"/>
-          <w:numId w:val="1049"/>
+          <w:numId w:val="1050"/>
         </w:numPr>
         <w:pStyle w:val="Compact"/>
       </w:pPr>
@@ -7386,7 +7488,7 @@
       <w:pPr>
         <w:numPr>
           <w:ilvl w:val="0"/>
-          <w:numId w:val="1049"/>
+          <w:numId w:val="1050"/>
         </w:numPr>
         <w:pStyle w:val="Compact"/>
       </w:pPr>
@@ -7408,7 +7510,7 @@
       <w:pPr>
         <w:numPr>
           <w:ilvl w:val="0"/>
-          <w:numId w:val="1049"/>
+          <w:numId w:val="1050"/>
         </w:numPr>
         <w:pStyle w:val="Compact"/>
       </w:pPr>
@@ -7463,7 +7565,7 @@
       <w:pPr>
         <w:numPr>
           <w:ilvl w:val="0"/>
-          <w:numId w:val="1049"/>
+          <w:numId w:val="1050"/>
         </w:numPr>
         <w:pStyle w:val="Compact"/>
       </w:pPr>
@@ -7481,8 +7583,8 @@
         <w:t xml:space="preserve">not yet run on real data; it awaits the original model folders.</w:t>
       </w:r>
     </w:p>
-    <w:bookmarkEnd w:id="36"/>
-    <w:bookmarkStart w:id="40" w:name="Xe149fb2478db8da35cf9b6ef25933425736707f"/>
+    <w:bookmarkEnd w:id="37"/>
+    <w:bookmarkStart w:id="41" w:name="Xe149fb2478db8da35cf9b6ef25933425736707f"/>
     <w:p>
       <w:pPr>
         <w:pStyle w:val="Heading2"/>
@@ -7499,7 +7601,7 @@
         <w:t xml:space="preserve">The models and the pipeline were built in three stages. Each stage was triggered by a finding from the one before. All numbers are causal; results from the earlier leaky pipeline are never reported.</w:t>
       </w:r>
     </w:p>
-    <w:bookmarkStart w:id="37" w:name="X735e13a538b82c8e9d481869e251d3414058621"/>
+    <w:bookmarkStart w:id="38" w:name="X735e13a538b82c8e9d481869e251d3414058621"/>
     <w:p>
       <w:pPr>
         <w:pStyle w:val="Heading3"/>
@@ -7725,8 +7827,8 @@
         </w:tc>
       </w:tr>
     </w:tbl>
-    <w:bookmarkEnd w:id="37"/>
-    <w:bookmarkStart w:id="38" w:name="X02b04979c6e494c5ca74ff48a676d02b1c052ef"/>
+    <w:bookmarkEnd w:id="38"/>
+    <w:bookmarkStart w:id="39" w:name="X02b04979c6e494c5ca74ff48a676d02b1c052ef"/>
     <w:p>
       <w:pPr>
         <w:pStyle w:val="Heading3"/>
@@ -7757,7 +7859,7 @@
       <w:pPr>
         <w:numPr>
           <w:ilvl w:val="0"/>
-          <w:numId w:val="1050"/>
+          <w:numId w:val="1051"/>
         </w:numPr>
         <w:pStyle w:val="Compact"/>
       </w:pPr>
@@ -7769,7 +7871,7 @@
       <w:pPr>
         <w:numPr>
           <w:ilvl w:val="0"/>
-          <w:numId w:val="1050"/>
+          <w:numId w:val="1051"/>
         </w:numPr>
         <w:pStyle w:val="Compact"/>
       </w:pPr>
@@ -7781,83 +7883,83 @@
       <w:pPr>
         <w:numPr>
           <w:ilvl w:val="1"/>
+          <w:numId w:val="1052"/>
+        </w:numPr>
+        <w:pStyle w:val="Compact"/>
+      </w:pPr>
+      <w:r>
+        <w:t xml:space="preserve">as extra inputs (observer features);</w:t>
+      </w:r>
+    </w:p>
+    <w:p>
+      <w:pPr>
+        <w:numPr>
+          <w:ilvl w:val="1"/>
+          <w:numId w:val="1052"/>
+        </w:numPr>
+        <w:pStyle w:val="Compact"/>
+      </w:pPr>
+      <w:r>
+        <w:t xml:space="preserve">added at the output (output fusion);</w:t>
+      </w:r>
+    </w:p>
+    <w:p>
+      <w:pPr>
+        <w:numPr>
+          <w:ilvl w:val="1"/>
+          <w:numId w:val="1052"/>
+        </w:numPr>
+        <w:pStyle w:val="Compact"/>
+      </w:pPr>
+      <w:r>
+        <w:t xml:space="preserve">steering OSTA’s cross-organ attention through learned gates (gated guidance);</w:t>
+      </w:r>
+    </w:p>
+    <w:p>
+      <w:pPr>
+        <w:numPr>
+          <w:ilvl w:val="1"/>
+          <w:numId w:val="1052"/>
+        </w:numPr>
+        <w:pStyle w:val="Compact"/>
+      </w:pPr>
+      <w:r>
+        <w:t xml:space="preserve">the same steering always on, as a control for the gate (ungated guidance);</w:t>
+      </w:r>
+    </w:p>
+    <w:p>
+      <w:pPr>
+        <w:numPr>
+          <w:ilvl w:val="0"/>
           <w:numId w:val="1051"/>
         </w:numPr>
         <w:pStyle w:val="Compact"/>
       </w:pPr>
       <w:r>
-        <w:t xml:space="preserve">as extra inputs (observer features);</w:t>
-      </w:r>
-    </w:p>
-    <w:p>
-      <w:pPr>
-        <w:numPr>
-          <w:ilvl w:val="1"/>
+        <w:t xml:space="preserve">CNN–Transformer;</w:t>
+      </w:r>
+    </w:p>
+    <w:p>
+      <w:pPr>
+        <w:numPr>
+          <w:ilvl w:val="0"/>
           <w:numId w:val="1051"/>
         </w:numPr>
         <w:pStyle w:val="Compact"/>
       </w:pPr>
       <w:r>
-        <w:t xml:space="preserve">added at the output (output fusion);</w:t>
-      </w:r>
-    </w:p>
-    <w:p>
-      <w:pPr>
-        <w:numPr>
-          <w:ilvl w:val="1"/>
+        <w:t xml:space="preserve">L2 logistic regression;</w:t>
+      </w:r>
+    </w:p>
+    <w:p>
+      <w:pPr>
+        <w:numPr>
+          <w:ilvl w:val="0"/>
           <w:numId w:val="1051"/>
         </w:numPr>
         <w:pStyle w:val="Compact"/>
       </w:pPr>
       <w:r>
-        <w:t xml:space="preserve">steering OSTA’s cross-organ attention through learned gates (gated guidance);</w:t>
-      </w:r>
-    </w:p>
-    <w:p>
-      <w:pPr>
-        <w:numPr>
-          <w:ilvl w:val="1"/>
-          <w:numId w:val="1051"/>
-        </w:numPr>
-        <w:pStyle w:val="Compact"/>
-      </w:pPr>
-      <w:r>
-        <w:t xml:space="preserve">the same steering always on, as a control for the gate (ungated guidance);</w:t>
-      </w:r>
-    </w:p>
-    <w:p>
-      <w:pPr>
-        <w:numPr>
-          <w:ilvl w:val="0"/>
-          <w:numId w:val="1050"/>
-        </w:numPr>
-        <w:pStyle w:val="Compact"/>
-      </w:pPr>
-      <w:r>
-        <w:t xml:space="preserve">CNN–Transformer;</w:t>
-      </w:r>
-    </w:p>
-    <w:p>
-      <w:pPr>
-        <w:numPr>
-          <w:ilvl w:val="0"/>
-          <w:numId w:val="1050"/>
-        </w:numPr>
-        <w:pStyle w:val="Compact"/>
-      </w:pPr>
-      <w:r>
-        <w:t xml:space="preserve">L2 logistic regression;</w:t>
-      </w:r>
-    </w:p>
-    <w:p>
-      <w:pPr>
-        <w:numPr>
-          <w:ilvl w:val="0"/>
-          <w:numId w:val="1050"/>
-        </w:numPr>
-        <w:pStyle w:val="Compact"/>
-      </w:pPr>
-      <w:r>
         <w:t xml:space="preserve">histogram gradient-boosted trees.</w:t>
       </w:r>
     </w:p>
@@ -7873,7 +7975,7 @@
       <w:pPr>
         <w:numPr>
           <w:ilvl w:val="0"/>
-          <w:numId w:val="1052"/>
+          <w:numId w:val="1053"/>
         </w:numPr>
         <w:pStyle w:val="Compact"/>
       </w:pPr>
@@ -7885,7 +7987,7 @@
       <w:pPr>
         <w:numPr>
           <w:ilvl w:val="0"/>
-          <w:numId w:val="1052"/>
+          <w:numId w:val="1053"/>
         </w:numPr>
         <w:pStyle w:val="Compact"/>
       </w:pPr>
@@ -8361,8 +8463,8 @@
         <w:t xml:space="preserve">): hourly OSTA exceeded qSOFA on MIMIC-IV by +0.28 AUROC (95 % CI 0.21 to 0.35). In eICU, onset-anchored, the models were not better than qSOFA or SIRS.</w:t>
       </w:r>
     </w:p>
-    <w:bookmarkEnd w:id="38"/>
-    <w:bookmarkStart w:id="39" w:name="stage-3-v11-this-protocol"/>
+    <w:bookmarkEnd w:id="39"/>
+    <w:bookmarkStart w:id="40" w:name="stage-3-v11-this-protocol"/>
     <w:p>
       <w:pPr>
         <w:pStyle w:val="Heading3"/>
@@ -8383,7 +8485,7 @@
       <w:pPr>
         <w:numPr>
           <w:ilvl w:val="0"/>
-          <w:numId w:val="1053"/>
+          <w:numId w:val="1054"/>
         </w:numPr>
         <w:pStyle w:val="Compact"/>
       </w:pPr>
@@ -8405,7 +8507,7 @@
       <w:pPr>
         <w:numPr>
           <w:ilvl w:val="0"/>
-          <w:numId w:val="1053"/>
+          <w:numId w:val="1054"/>
         </w:numPr>
         <w:pStyle w:val="Compact"/>
       </w:pPr>
@@ -8427,47 +8529,47 @@
       <w:pPr>
         <w:numPr>
           <w:ilvl w:val="1"/>
+          <w:numId w:val="1055"/>
+        </w:numPr>
+        <w:pStyle w:val="Compact"/>
+      </w:pPr>
+      <w:r>
+        <w:t xml:space="preserve">testing the organ hypothesis directly (flat OSTA);</w:t>
+      </w:r>
+    </w:p>
+    <w:p>
+      <w:pPr>
+        <w:numPr>
+          <w:ilvl w:val="1"/>
+          <w:numId w:val="1055"/>
+        </w:numPr>
+        <w:pStyle w:val="Compact"/>
+      </w:pPr>
+      <w:r>
+        <w:t xml:space="preserve">adding models built for irregular ICU data (GRU-D, TCN, the winner’s method);</w:t>
+      </w:r>
+    </w:p>
+    <w:p>
+      <w:pPr>
+        <w:numPr>
+          <w:ilvl w:val="1"/>
+          <w:numId w:val="1055"/>
+        </w:numPr>
+        <w:pStyle w:val="Compact"/>
+      </w:pPr>
+      <w:r>
+        <w:t xml:space="preserve">using scarce labels better (self-supervised pretraining, per-channel encoders, event attention, the hazard head), with a loss aligned to the utility score.</w:t>
+      </w:r>
+    </w:p>
+    <w:p>
+      <w:pPr>
+        <w:numPr>
+          <w:ilvl w:val="0"/>
           <w:numId w:val="1054"/>
         </w:numPr>
         <w:pStyle w:val="Compact"/>
       </w:pPr>
       <w:r>
-        <w:t xml:space="preserve">testing the organ hypothesis directly (flat OSTA);</w:t>
-      </w:r>
-    </w:p>
-    <w:p>
-      <w:pPr>
-        <w:numPr>
-          <w:ilvl w:val="1"/>
-          <w:numId w:val="1054"/>
-        </w:numPr>
-        <w:pStyle w:val="Compact"/>
-      </w:pPr>
-      <w:r>
-        <w:t xml:space="preserve">adding models built for irregular ICU data (GRU-D, TCN, the winner’s method);</w:t>
-      </w:r>
-    </w:p>
-    <w:p>
-      <w:pPr>
-        <w:numPr>
-          <w:ilvl w:val="1"/>
-          <w:numId w:val="1054"/>
-        </w:numPr>
-        <w:pStyle w:val="Compact"/>
-      </w:pPr>
-      <w:r>
-        <w:t xml:space="preserve">using scarce labels better (self-supervised pretraining, per-channel encoders, event attention, the hazard head), with a loss aligned to the utility score.</w:t>
-      </w:r>
-    </w:p>
-    <w:p>
-      <w:pPr>
-        <w:numPr>
-          <w:ilvl w:val="0"/>
-          <w:numId w:val="1053"/>
-        </w:numPr>
-        <w:pStyle w:val="Compact"/>
-      </w:pPr>
-      <w:r>
         <w:rPr>
           <w:bCs/>
           <w:b/>
@@ -8481,9 +8583,9 @@
         <w:t xml:space="preserve">It was retired.</w:t>
       </w:r>
     </w:p>
-    <w:bookmarkEnd w:id="39"/>
     <w:bookmarkEnd w:id="40"/>
-    <w:bookmarkStart w:id="41" w:name="X0296bd26dd3c8397ebfff3644d5772bc7e084f6"/>
+    <w:bookmarkEnd w:id="41"/>
+    <w:bookmarkStart w:id="42" w:name="X0296bd26dd3c8397ebfff3644d5772bc7e084f6"/>
     <w:p>
       <w:pPr>
         <w:pStyle w:val="Heading2"/>
@@ -8496,7 +8598,7 @@
       <w:pPr>
         <w:numPr>
           <w:ilvl w:val="0"/>
-          <w:numId w:val="1055"/>
+          <w:numId w:val="1056"/>
         </w:numPr>
         <w:pStyle w:val="Compact"/>
       </w:pPr>
@@ -8523,7 +8625,7 @@
       <w:pPr>
         <w:numPr>
           <w:ilvl w:val="0"/>
-          <w:numId w:val="1055"/>
+          <w:numId w:val="1056"/>
         </w:numPr>
         <w:pStyle w:val="Compact"/>
       </w:pPr>
@@ -8535,7 +8637,7 @@
       <w:pPr>
         <w:numPr>
           <w:ilvl w:val="0"/>
-          <w:numId w:val="1055"/>
+          <w:numId w:val="1056"/>
         </w:numPr>
         <w:pStyle w:val="Compact"/>
       </w:pPr>
@@ -8558,8 +8660,8 @@
         <w:t xml:space="preserve">notebook embeds the earlier label worker (Section 4); the repository copy carries the interval-units fix.</w:t>
       </w:r>
     </w:p>
-    <w:bookmarkEnd w:id="41"/>
     <w:bookmarkEnd w:id="42"/>
+    <w:bookmarkEnd w:id="43"/>
     <w:sectPr/>
   </w:body>
 </w:document>
@@ -9047,6 +9149,9 @@
     <w:abstractNumId w:val="991"/>
   </w:num>
   <w:num w:numId="1046">
+    <w:abstractNumId w:val="991"/>
+  </w:num>
+  <w:num w:numId="1047">
     <w:abstractNumId w:val="99411"/>
     <w:lvlOverride w:ilvl="0">
       <w:startOverride w:val="1"/>
@@ -9076,9 +9181,6 @@
       <w:startOverride w:val="1"/>
     </w:lvlOverride>
   </w:num>
-  <w:num w:numId="1047">
-    <w:abstractNumId w:val="991"/>
-  </w:num>
   <w:num w:numId="1048">
     <w:abstractNumId w:val="991"/>
   </w:num>
@@ -9101,6 +9203,9 @@
     <w:abstractNumId w:val="991"/>
   </w:num>
   <w:num w:numId="1055">
+    <w:abstractNumId w:val="991"/>
+  </w:num>
+  <w:num w:numId="1056">
     <w:abstractNumId w:val="991"/>
   </w:num>
 </w:numbering>

</xml_diff>

<commit_message>
Protocol 10c: pathophysiology study, all-comers cohort for stage 2 (exclusion 7 dropped, incident primary), physiology-only predictor arms, recognition-to-anticipation pretraining
Co-Authored-By: Claude Fable 5.1 <noreply@anthropic.com>
Claude-Session: https://claude.ai/code/session_01LgDqxV9dzSvE8XpquGaBd5
</commit_message>
<xml_diff>
--- a/dev/protocol/Study_Protocol_v11.docx
+++ b/dev/protocol/Study_Protocol_v11.docx
@@ -2,7 +2,7 @@
 <file path=word/document.xml><?xml version="1.0" encoding="utf-8"?>
 <w:document xmlns:w="http://schemas.openxmlformats.org/wordprocessingml/2006/main" xmlns:m="http://schemas.openxmlformats.org/officeDocument/2006/math" xmlns:r="http://schemas.openxmlformats.org/officeDocument/2006/relationships" xmlns:o="urn:schemas-microsoft-com:office:office" xmlns:v="urn:schemas-microsoft-com:vml" xmlns:w10="urn:schemas-microsoft-com:office:word" xmlns:a="http://schemas.openxmlformats.org/drawingml/2006/main" xmlns:pic="http://schemas.openxmlformats.org/drawingml/2006/picture" xmlns:wp="http://schemas.openxmlformats.org/drawingml/2006/wordprocessingDrawing">
   <w:body>
-    <w:bookmarkStart w:id="43" w:name="X2351f334f17781296d91bfff42ea2b910f98989"/>
+    <w:bookmarkStart w:id="46" w:name="X2351f334f17781296d91bfff42ea2b910f98989"/>
     <w:p>
       <w:pPr>
         <w:pStyle w:val="Heading1"/>
@@ -6657,12 +6657,531 @@
     </w:p>
     <w:bookmarkEnd w:id="33"/>
     <w:bookmarkEnd w:id="34"/>
-    <w:bookmarkStart w:id="35" w:name="stage-2-full-cohort"/>
+    <w:bookmarkStart w:id="37" w:name="Xeee41a197e0aa17e9e980612ff0ae143f9f5b10"/>
     <w:p>
       <w:pPr>
         <w:pStyle w:val="Heading2"/>
       </w:pPr>
       <w:r>
+        <w:t xml:space="preserve">10c. Pathophysiology study and the arrived-septic patients (added 29 Oct 2026)</w:t>
+      </w:r>
+    </w:p>
+    <w:p>
+      <w:pPr>
+        <w:pStyle w:val="FirstParagraph"/>
+      </w:pPr>
+      <w:r>
+        <w:rPr>
+          <w:bCs/>
+          <w:b/>
+        </w:rPr>
+        <w:t xml:space="preserve">Decision (project partner and candidate, 29 Oct 2026).</w:t>
+      </w:r>
+      <w:r>
+        <w:t xml:space="preserve"> </w:t>
+      </w:r>
+      <w:r>
+        <w:t xml:space="preserve">The patients who arrive in the ICU already septic are the majority of septic ICU patients. The stage-1 cohort excludes them (YAIB exclusion 7: onset before the sixth ICU hour) and so learns sepsis physiology from the minority who become septic later. Two consequences follow for stage 2, and one study precedes it. None of this is driven by a test-split result; it is driven by clinical reasoning and by the event counts of Section 10 (45 eICU events).</w:t>
+      </w:r>
+    </w:p>
+    <w:bookmarkStart w:id="35" w:name="X2f223e7305813159a6636e0ede6a23ef324ea88"/>
+    <w:p>
+      <w:pPr>
+        <w:pStyle w:val="Heading3"/>
+      </w:pPr>
+      <w:r>
+        <w:t xml:space="preserve">10c.1 The pathophysiology study (notebook</w:t>
+      </w:r>
+      <w:r>
+        <w:t xml:space="preserve"> </w:t>
+      </w:r>
+      <w:r>
+        <w:rPr>
+          <w:rStyle w:val="VerbatimChar"/>
+        </w:rPr>
+        <w:t xml:space="preserve">_13_pathophysiology</w:t>
+      </w:r>
+      <w:r>
+        <w:t xml:space="preserve">; descriptive; before the freeze)</w:t>
+      </w:r>
+    </w:p>
+    <w:p>
+      <w:pPr>
+        <w:pStyle w:val="FirstParagraph"/>
+      </w:pPr>
+      <w:r>
+        <w:rPr>
+          <w:bCs/>
+          <w:b/>
+        </w:rPr>
+        <w:t xml:space="preserve">Purpose.</w:t>
+      </w:r>
+      <w:r>
+        <w:t xml:space="preserve"> </w:t>
+      </w:r>
+      <w:r>
+        <w:t xml:space="preserve">To describe, in both databases, which physiological patterns precede and accompany sepsis, which of them are shared across the two hospital systems, and which are artefacts of practice (how often things are measured). The output shapes the stage-2 predictor sets by a procedure fixed here; it estimates no model.</w:t>
+      </w:r>
+    </w:p>
+    <w:p>
+      <w:pPr>
+        <w:pStyle w:val="BodyText"/>
+      </w:pPr>
+      <w:r>
+        <w:rPr>
+          <w:bCs/>
+          <w:b/>
+        </w:rPr>
+        <w:t xml:space="preserve">Who is in it (training-split and non-cohort patients only; never validation, test or protected patients):</w:t>
+      </w:r>
+    </w:p>
+    <w:p>
+      <w:pPr>
+        <w:numPr>
+          <w:ilvl w:val="0"/>
+          <w:numId w:val="1044"/>
+        </w:numPr>
+        <w:pStyle w:val="Compact"/>
+      </w:pPr>
+      <w:r>
+        <w:rPr>
+          <w:iCs/>
+          <w:i/>
+        </w:rPr>
+        <w:t xml:space="preserve">Incident</w:t>
+      </w:r>
+      <w:r>
+        <w:t xml:space="preserve"> </w:t>
+      </w:r>
+      <w:r>
+        <w:t xml:space="preserve">(ICU-acquired): cohort stays with onset at or after the sixth ICU hour, training and observer-fit splits.</w:t>
+      </w:r>
+    </w:p>
+    <w:p>
+      <w:pPr>
+        <w:numPr>
+          <w:ilvl w:val="0"/>
+          <w:numId w:val="1044"/>
+        </w:numPr>
+        <w:pStyle w:val="Compact"/>
+      </w:pPr>
+      <w:r>
+        <w:rPr>
+          <w:iCs/>
+          <w:i/>
+        </w:rPr>
+        <w:t xml:space="preserve">Arrived septic</w:t>
+      </w:r>
+      <w:r>
+        <w:t xml:space="preserve"> </w:t>
+      </w:r>
+      <w:r>
+        <w:t xml:space="preserve">(prevalent): sampled candidate stays excluded by YAIB exclusion 7 (onset before the sixth ICU hour, including onset before ICU admission), whose hourly features already exist in the unlabelled corpus and whose onset exists in the label batches. No label extraction is repeated.</w:t>
+      </w:r>
+    </w:p>
+    <w:p>
+      <w:pPr>
+        <w:numPr>
+          <w:ilvl w:val="0"/>
+          <w:numId w:val="1044"/>
+        </w:numPr>
+        <w:pStyle w:val="Compact"/>
+      </w:pPr>
+      <w:r>
+        <w:rPr>
+          <w:iCs/>
+          <w:i/>
+        </w:rPr>
+        <w:t xml:space="preserve">Controls</w:t>
+      </w:r>
+      <w:r>
+        <w:t xml:space="preserve">: cohort stays with no onset, training and observer-fit splits.</w:t>
+      </w:r>
+    </w:p>
+    <w:p>
+      <w:pPr>
+        <w:pStyle w:val="FirstParagraph"/>
+      </w:pPr>
+      <w:r>
+        <w:rPr>
+          <w:bCs/>
+          <w:b/>
+        </w:rPr>
+        <w:t xml:space="preserve">What is measured.</w:t>
+      </w:r>
+      <w:r>
+        <w:t xml:space="preserve"> </w:t>
+      </w:r>
+      <w:r>
+        <w:t xml:space="preserve">For a fixed list of physiological channels (vital signs, blood gas, haematology, chemistry, lactate, inflammatory markers, urine output; and the six SOFA components), only</w:t>
+      </w:r>
+      <w:r>
+        <w:t xml:space="preserve"> </w:t>
+      </w:r>
+      <w:r>
+        <w:rPr>
+          <w:iCs/>
+          <w:i/>
+        </w:rPr>
+        <w:t xml:space="preserve">fresh</w:t>
+      </w:r>
+      <w:r>
+        <w:t xml:space="preserve"> </w:t>
+      </w:r>
+      <w:r>
+        <w:t xml:space="preserve">measurements (age under 1 h) are used for values, so that carry-forward and imputation do not manufacture trajectories. Measurement frequency per stay-hour is reported separately as the practice signal.</w:t>
+      </w:r>
+    </w:p>
+    <w:p>
+      <w:pPr>
+        <w:pStyle w:val="BodyText"/>
+      </w:pPr>
+      <w:r>
+        <w:rPr>
+          <w:bCs/>
+          <w:b/>
+        </w:rPr>
+        <w:t xml:space="preserve">Alignments.</w:t>
+      </w:r>
+      <w:r>
+        <w:t xml:space="preserve"> </w:t>
+      </w:r>
+      <w:r>
+        <w:t xml:space="preserve">Hours relative to onset (incident: −24 to +6; arrived septic: onset to +24) and hours since ICU admission (all groups: 1 to 30), in 4-hour bins: median, quartiles, number of stays with a fresh value, measurement rate.</w:t>
+      </w:r>
+    </w:p>
+    <w:p>
+      <w:pPr>
+        <w:pStyle w:val="BodyText"/>
+      </w:pPr>
+      <w:r>
+        <w:rPr>
+          <w:bCs/>
+          <w:b/>
+        </w:rPr>
+        <w:t xml:space="preserve">Comparisons (Cliff’s delta on fresh values, with 95 % bootstrap intervals by stay):</w:t>
+      </w:r>
+    </w:p>
+    <w:p>
+      <w:pPr>
+        <w:numPr>
+          <w:ilvl w:val="0"/>
+          <w:numId w:val="1045"/>
+        </w:numPr>
+        <w:pStyle w:val="Compact"/>
+      </w:pPr>
+      <w:r>
+        <w:t xml:space="preserve">Incident versus controls, by hour since admission: the baseline difference of patients who will become septic.</w:t>
+      </w:r>
+    </w:p>
+    <w:p>
+      <w:pPr>
+        <w:numPr>
+          <w:ilvl w:val="0"/>
+          <w:numId w:val="1045"/>
+        </w:numPr>
+        <w:pStyle w:val="Compact"/>
+      </w:pPr>
+      <w:r>
+        <w:t xml:space="preserve">Incident in the 12 h before onset versus controls at matched hours: the pre-onset signal.</w:t>
+      </w:r>
+    </w:p>
+    <w:p>
+      <w:pPr>
+        <w:numPr>
+          <w:ilvl w:val="0"/>
+          <w:numId w:val="1045"/>
+        </w:numPr>
+        <w:pStyle w:val="Compact"/>
+      </w:pPr>
+      <w:r>
+        <w:t xml:space="preserve">Arrived septic versus incident, both in the 12 h after onset: whether the two routes to sepsis look alike once sepsis is present.</w:t>
+      </w:r>
+    </w:p>
+    <w:p>
+      <w:pPr>
+        <w:numPr>
+          <w:ilvl w:val="0"/>
+          <w:numId w:val="1045"/>
+        </w:numPr>
+        <w:pStyle w:val="Compact"/>
+      </w:pPr>
+      <w:r>
+        <w:t xml:space="preserve">Arrived septic in the first 12 ICU hours versus incident in the 12 h before onset: whether early-arrived sepsis resembles impending sepsis.</w:t>
+      </w:r>
+    </w:p>
+    <w:p>
+      <w:pPr>
+        <w:numPr>
+          <w:ilvl w:val="0"/>
+          <w:numId w:val="1045"/>
+        </w:numPr>
+        <w:pStyle w:val="Compact"/>
+      </w:pPr>
+      <w:r>
+        <w:t xml:space="preserve">Rate of change: per-stay slope of fresh values over the 12 h before onset (incident), the first 12 h (arrived septic) and hours 7 to 18 (controls).</w:t>
+      </w:r>
+    </w:p>
+    <w:p>
+      <w:pPr>
+        <w:pStyle w:val="FirstParagraph"/>
+      </w:pPr>
+      <w:r>
+        <w:rPr>
+          <w:bCs/>
+          <w:b/>
+        </w:rPr>
+        <w:t xml:space="preserve">Cross-database rule (fixed now).</w:t>
+      </w:r>
+      <w:r>
+        <w:t xml:space="preserve"> </w:t>
+      </w:r>
+      <w:r>
+        <w:t xml:space="preserve">A channel’s pattern is</w:t>
+      </w:r>
+      <w:r>
+        <w:t xml:space="preserve"> </w:t>
+      </w:r>
+      <w:r>
+        <w:rPr>
+          <w:iCs/>
+          <w:i/>
+        </w:rPr>
+        <w:t xml:space="preserve">shared</w:t>
+      </w:r>
+      <w:r>
+        <w:t xml:space="preserve"> </w:t>
+      </w:r>
+      <w:r>
+        <w:t xml:space="preserve">when its delta has the same sign and |delta| ≥ 0.147 in both databases;</w:t>
+      </w:r>
+      <w:r>
+        <w:t xml:space="preserve"> </w:t>
+      </w:r>
+      <w:r>
+        <w:rPr>
+          <w:iCs/>
+          <w:i/>
+        </w:rPr>
+        <w:t xml:space="preserve">strong shared</w:t>
+      </w:r>
+      <w:r>
+        <w:t xml:space="preserve"> </w:t>
+      </w:r>
+      <w:r>
+        <w:t xml:space="preserve">at ≥ 0.33;</w:t>
+      </w:r>
+      <w:r>
+        <w:t xml:space="preserve"> </w:t>
+      </w:r>
+      <w:r>
+        <w:rPr>
+          <w:iCs/>
+          <w:i/>
+        </w:rPr>
+        <w:t xml:space="preserve">database-specific</w:t>
+      </w:r>
+      <w:r>
+        <w:t xml:space="preserve"> </w:t>
+      </w:r>
+      <w:r>
+        <w:t xml:space="preserve">when the threshold is met in one database only;</w:t>
+      </w:r>
+      <w:r>
+        <w:t xml:space="preserve"> </w:t>
+      </w:r>
+      <w:r>
+        <w:rPr>
+          <w:iCs/>
+          <w:i/>
+        </w:rPr>
+        <w:t xml:space="preserve">no signal</w:t>
+      </w:r>
+      <w:r>
+        <w:t xml:space="preserve"> </w:t>
+      </w:r>
+      <w:r>
+        <w:t xml:space="preserve">otherwise. The same rule applies to measurement rates, which identifies practice differences.</w:t>
+      </w:r>
+    </w:p>
+    <w:p>
+      <w:pPr>
+        <w:pStyle w:val="BodyText"/>
+      </w:pPr>
+      <w:r>
+        <w:rPr>
+          <w:bCs/>
+          <w:b/>
+        </w:rPr>
+        <w:t xml:space="preserve">Outputs.</w:t>
+      </w:r>
+      <w:r>
+        <w:t xml:space="preserve"> </w:t>
+      </w:r>
+      <w:r>
+        <w:t xml:space="preserve">Aggregate tables (CSV), small-multiple figures,</w:t>
+      </w:r>
+      <w:r>
+        <w:t xml:space="preserve"> </w:t>
+      </w:r>
+      <w:r>
+        <w:rPr>
+          <w:rStyle w:val="VerbatimChar"/>
+        </w:rPr>
+        <w:t xml:space="preserve">shared_physiology.json</w:t>
+      </w:r>
+      <w:r>
+        <w:t xml:space="preserve">, with counts under 11 masked. No patient-level data leave the runtime.</w:t>
+      </w:r>
+    </w:p>
+    <w:bookmarkEnd w:id="35"/>
+    <w:bookmarkStart w:id="36" w:name="Xf2b8a0fdb4b3289f880ee442699d88004b4d756"/>
+    <w:p>
+      <w:pPr>
+        <w:pStyle w:val="Heading3"/>
+      </w:pPr>
+      <w:r>
+        <w:t xml:space="preserve">10c.2 Consequences for stage 2 (prespecified here; TO FREEZE with Section 11)</w:t>
+      </w:r>
+    </w:p>
+    <w:p>
+      <w:pPr>
+        <w:numPr>
+          <w:ilvl w:val="0"/>
+          <w:numId w:val="1046"/>
+        </w:numPr>
+        <w:pStyle w:val="Compact"/>
+      </w:pPr>
+      <w:r>
+        <w:rPr>
+          <w:bCs/>
+          <w:b/>
+        </w:rPr>
+        <w:t xml:space="preserve">All-comers cohort.</w:t>
+      </w:r>
+      <w:r>
+        <w:t xml:space="preserve"> </w:t>
+      </w:r>
+      <w:r>
+        <w:t xml:space="preserve">The stage-2 cohort keeps YAIB exclusions 1 to 6 and drops exclusion 7: stays with onset before the sixth ICU hour (including before admission) stay in the cohort. Their hours before onset, if any, are scored as now; their hours from onset to onset + 6 h carry the positive label; later hours are not scored. The warning model is trained on all comers.</w:t>
+      </w:r>
+      <w:r>
+        <w:t xml:space="preserve"> </w:t>
+      </w:r>
+      <w:r>
+        <w:rPr>
+          <w:bCs/>
+          <w:b/>
+        </w:rPr>
+        <w:t xml:space="preserve">The primary evaluation stays the incident cohort</w:t>
+      </w:r>
+      <w:r>
+        <w:t xml:space="preserve"> </w:t>
+      </w:r>
+      <w:r>
+        <w:t xml:space="preserve">(onset at or after 6 h), reported exactly as in stage 1 so that it remains comparable with Section 10 and with the literature. The all-comers evaluation is a prespecified secondary, reported stratified: incident, arrived septic, controls. This makes the model learn sepsis physiology from every septic patient and tests it on the patients who can be warned.</w:t>
+      </w:r>
+    </w:p>
+    <w:p>
+      <w:pPr>
+        <w:numPr>
+          <w:ilvl w:val="0"/>
+          <w:numId w:val="1046"/>
+        </w:numPr>
+        <w:pStyle w:val="Compact"/>
+      </w:pPr>
+      <w:r>
+        <w:rPr>
+          <w:bCs/>
+          <w:b/>
+        </w:rPr>
+        <w:t xml:space="preserve">Predictor-set arms.</w:t>
+      </w:r>
+      <w:r>
+        <w:t xml:space="preserve"> </w:t>
+      </w:r>
+      <w:r>
+        <w:t xml:space="preserve">Beside the full 659-predictor set: (a)</w:t>
+      </w:r>
+      <w:r>
+        <w:t xml:space="preserve"> </w:t>
+      </w:r>
+      <w:r>
+        <w:rPr>
+          <w:iCs/>
+          <w:i/>
+        </w:rPr>
+        <w:t xml:space="preserve">physiology only</w:t>
+      </w:r>
+      <w:r>
+        <w:t xml:space="preserve">, defined by class from the feature registry (raw measurements, derived criteria and ratios, renal windows, handcrafted physiology features, with their masks and ages, age and sex; no exposures, devices, medications, imaging, fluids, charted states, admission context, comorbidity flags or prophylaxis); (b)</w:t>
+      </w:r>
+      <w:r>
+        <w:t xml:space="preserve"> </w:t>
+      </w:r>
+      <w:r>
+        <w:rPr>
+          <w:iCs/>
+          <w:i/>
+        </w:rPr>
+        <w:t xml:space="preserve">shared physiology</w:t>
+      </w:r>
+      <w:r>
+        <w:t xml:space="preserve">, the channels the 10c.1 rule marks shared in both databases, applied to (a); (c) variant of (a) without the mask and age channels, to measure how much of home performance is charting practice. Judged by transfer and leave-hospital-out as well as at home.</w:t>
+      </w:r>
+    </w:p>
+    <w:p>
+      <w:pPr>
+        <w:numPr>
+          <w:ilvl w:val="0"/>
+          <w:numId w:val="1046"/>
+        </w:numPr>
+        <w:pStyle w:val="Compact"/>
+      </w:pPr>
+      <w:r>
+        <w:rPr>
+          <w:bCs/>
+          <w:b/>
+        </w:rPr>
+        <w:t xml:space="preserve">Recognition-to-anticipation pretraining.</w:t>
+      </w:r>
+      <w:r>
+        <w:t xml:space="preserve"> </w:t>
+      </w:r>
+      <w:r>
+        <w:t xml:space="preserve">A prespecified self-supervised variant: the encoder is first trained to recognise sepsis present in the first 6 h of the arrived-septic stays against non-septic stays (a label-free task with respect to the warning target), then the warning model is trained on the cohort. One arm beside the existing self-supervised pair.</w:t>
+      </w:r>
+    </w:p>
+    <w:p>
+      <w:pPr>
+        <w:numPr>
+          <w:ilvl w:val="0"/>
+          <w:numId w:val="1046"/>
+        </w:numPr>
+        <w:pStyle w:val="Compact"/>
+      </w:pPr>
+      <w:r>
+        <w:rPr>
+          <w:bCs/>
+          <w:b/>
+        </w:rPr>
+        <w:t xml:space="preserve">Build consequence.</w:t>
+      </w:r>
+      <w:r>
+        <w:t xml:space="preserve"> </w:t>
+      </w:r>
+      <w:r>
+        <w:t xml:space="preserve">Dropping exclusion 7 changes the cohort key; labels are reused (the label batches cover every candidate), the cohort step reruns, and features are built for the added stays. Recorded here before any stage-2 result exists.</w:t>
+      </w:r>
+    </w:p>
+    <w:bookmarkEnd w:id="36"/>
+    <w:bookmarkEnd w:id="37"/>
+    <w:bookmarkStart w:id="38" w:name="stage-2-full-cohort"/>
+    <w:p>
+      <w:pPr>
+        <w:pStyle w:val="Heading2"/>
+      </w:pPr>
+      <w:r>
         <w:t xml:space="preserve">11. Stage 2, full cohort</w:t>
       </w:r>
     </w:p>
@@ -6670,7 +7189,7 @@
       <w:pPr>
         <w:numPr>
           <w:ilvl w:val="0"/>
-          <w:numId w:val="1044"/>
+          <w:numId w:val="1047"/>
         </w:numPr>
         <w:pStyle w:val="Compact"/>
       </w:pPr>
@@ -6701,7 +7220,7 @@
       <w:pPr>
         <w:numPr>
           <w:ilvl w:val="0"/>
-          <w:numId w:val="1044"/>
+          <w:numId w:val="1047"/>
         </w:numPr>
         <w:pStyle w:val="Compact"/>
       </w:pPr>
@@ -6717,7 +7236,7 @@
       <w:pPr>
         <w:numPr>
           <w:ilvl w:val="1"/>
-          <w:numId w:val="1045"/>
+          <w:numId w:val="1048"/>
         </w:numPr>
         <w:pStyle w:val="Compact"/>
       </w:pPr>
@@ -6729,7 +7248,7 @@
       <w:pPr>
         <w:numPr>
           <w:ilvl w:val="1"/>
-          <w:numId w:val="1045"/>
+          <w:numId w:val="1048"/>
         </w:numPr>
         <w:pStyle w:val="Compact"/>
       </w:pPr>
@@ -6741,7 +7260,7 @@
       <w:pPr>
         <w:numPr>
           <w:ilvl w:val="1"/>
-          <w:numId w:val="1045"/>
+          <w:numId w:val="1048"/>
         </w:numPr>
         <w:pStyle w:val="Compact"/>
       </w:pPr>
@@ -6753,7 +7272,7 @@
       <w:pPr>
         <w:numPr>
           <w:ilvl w:val="1"/>
-          <w:numId w:val="1045"/>
+          <w:numId w:val="1048"/>
         </w:numPr>
         <w:pStyle w:val="Compact"/>
       </w:pPr>
@@ -6765,7 +7284,7 @@
       <w:pPr>
         <w:numPr>
           <w:ilvl w:val="1"/>
-          <w:numId w:val="1045"/>
+          <w:numId w:val="1048"/>
         </w:numPr>
         <w:pStyle w:val="Compact"/>
       </w:pPr>
@@ -6787,7 +7306,7 @@
       <w:pPr>
         <w:numPr>
           <w:ilvl w:val="0"/>
-          <w:numId w:val="1044"/>
+          <w:numId w:val="1047"/>
         </w:numPr>
         <w:pStyle w:val="Compact"/>
       </w:pPr>
@@ -6824,7 +7343,67 @@
       <w:pPr>
         <w:numPr>
           <w:ilvl w:val="0"/>
-          <w:numId w:val="1044"/>
+          <w:numId w:val="1047"/>
+        </w:numPr>
+        <w:pStyle w:val="Compact"/>
+      </w:pPr>
+      <w:r>
+        <w:rPr>
+          <w:bCs/>
+          <w:b/>
+        </w:rPr>
+        <w:t xml:space="preserve">Cohort (decided 29 Oct 2026, Section 10c.2):</w:t>
+      </w:r>
+      <w:r>
+        <w:t xml:space="preserve"> </w:t>
+      </w:r>
+      <w:r>
+        <w:t xml:space="preserve">all comers (YAIB exclusion 7 dropped); primary evaluation on the incident cohort, secondary stratified on all comers.</w:t>
+      </w:r>
+    </w:p>
+    <w:p>
+      <w:pPr>
+        <w:numPr>
+          <w:ilvl w:val="0"/>
+          <w:numId w:val="1047"/>
+        </w:numPr>
+        <w:pStyle w:val="Compact"/>
+      </w:pPr>
+      <w:r>
+        <w:rPr>
+          <w:bCs/>
+          <w:b/>
+        </w:rPr>
+        <w:t xml:space="preserve">Predictor-set arms (Section 10c.2):</w:t>
+      </w:r>
+      <w:r>
+        <w:t xml:space="preserve"> </w:t>
+      </w:r>
+      <w:r>
+        <w:t xml:space="preserve">full 659; physiology only; shared physiology; physiology only without mask and age channels.</w:t>
+      </w:r>
+    </w:p>
+    <w:p>
+      <w:pPr>
+        <w:numPr>
+          <w:ilvl w:val="0"/>
+          <w:numId w:val="1047"/>
+        </w:numPr>
+        <w:pStyle w:val="Compact"/>
+      </w:pPr>
+      <w:r>
+        <w:rPr>
+          <w:bCs/>
+          <w:b/>
+        </w:rPr>
+        <w:t xml:space="preserve">Recognition-to-anticipation pretraining arm (Section 10c.2).</w:t>
+      </w:r>
+    </w:p>
+    <w:p>
+      <w:pPr>
+        <w:numPr>
+          <w:ilvl w:val="0"/>
+          <w:numId w:val="1047"/>
         </w:numPr>
         <w:pStyle w:val="Compact"/>
       </w:pPr>
@@ -6882,7 +7461,7 @@
       <w:pPr>
         <w:numPr>
           <w:ilvl w:val="0"/>
-          <w:numId w:val="1044"/>
+          <w:numId w:val="1047"/>
         </w:numPr>
         <w:pStyle w:val="Compact"/>
       </w:pPr>
@@ -6904,7 +7483,7 @@
       <w:pPr>
         <w:numPr>
           <w:ilvl w:val="0"/>
-          <w:numId w:val="1044"/>
+          <w:numId w:val="1047"/>
         </w:numPr>
         <w:pStyle w:val="Compact"/>
       </w:pPr>
@@ -6914,297 +7493,6 @@
           <w:b/>
         </w:rPr>
         <w:t xml:space="preserve">Pretraining corpus (TO FREEZE):</w:t>
-      </w:r>
-    </w:p>
-    <w:p>
-      <w:pPr>
-        <w:numPr>
-          <w:ilvl w:val="1"/>
-          <w:numId w:val="1046"/>
-        </w:numPr>
-        <w:pStyle w:val="Compact"/>
-      </w:pPr>
-      <w:r>
-        <w:t xml:space="preserve">non-cohort stays plus training-split stays (inputs only, no labels);</w:t>
-      </w:r>
-    </w:p>
-    <w:p>
-      <w:pPr>
-        <w:numPr>
-          <w:ilvl w:val="1"/>
-          <w:numId w:val="1046"/>
-        </w:numPr>
-        <w:pStyle w:val="Compact"/>
-      </w:pPr>
-      <w:r>
-        <w:t xml:space="preserve">excluding every stay of a validation, test or protected patient.</w:t>
-      </w:r>
-    </w:p>
-    <w:p>
-      <w:pPr>
-        <w:numPr>
-          <w:ilvl w:val="0"/>
-          <w:numId w:val="1044"/>
-        </w:numPr>
-        <w:pStyle w:val="Compact"/>
-      </w:pPr>
-      <w:r>
-        <w:rPr>
-          <w:bCs/>
-          <w:b/>
-        </w:rPr>
-        <w:t xml:space="preserve">Final-release encoder (TO FREEZE):</w:t>
-      </w:r>
-      <w:r>
-        <w:t xml:space="preserve"> </w:t>
-      </w:r>
-      <w:r>
-        <w:t xml:space="preserve">Section 5.3.</w:t>
-      </w:r>
-    </w:p>
-    <w:p>
-      <w:pPr>
-        <w:numPr>
-          <w:ilvl w:val="0"/>
-          <w:numId w:val="1044"/>
-        </w:numPr>
-        <w:pStyle w:val="Compact"/>
-      </w:pPr>
-      <w:r>
-        <w:rPr>
-          <w:bCs/>
-          <w:b/>
-        </w:rPr>
-        <w:t xml:space="preserve">eICU leave-hospital-out (TO FREEZE):</w:t>
-      </w:r>
-      <w:r>
-        <w:t xml:space="preserve"> </w:t>
-      </w:r>
-      <w:r>
-        <w:t xml:space="preserve">hospital grouping and the minimum events per hospital.</w:t>
-      </w:r>
-    </w:p>
-    <w:p>
-      <w:pPr>
-        <w:numPr>
-          <w:ilvl w:val="0"/>
-          <w:numId w:val="1044"/>
-        </w:numPr>
-        <w:pStyle w:val="Compact"/>
-      </w:pPr>
-      <w:r>
-        <w:rPr>
-          <w:bCs/>
-          <w:b/>
-        </w:rPr>
-        <w:t xml:space="preserve">Then:</w:t>
-      </w:r>
-    </w:p>
-    <w:p>
-      <w:pPr>
-        <w:numPr>
-          <w:ilvl w:val="1"/>
-          <w:numId w:val="1047"/>
-        </w:numPr>
-        <w:pStyle w:val="Compact"/>
-      </w:pPr>
-      <w:r>
-        <w:t xml:space="preserve">freeze this protocol (commit);</w:t>
-      </w:r>
-    </w:p>
-    <w:p>
-      <w:pPr>
-        <w:numPr>
-          <w:ilvl w:val="1"/>
-          <w:numId w:val="1047"/>
-        </w:numPr>
-        <w:pStyle w:val="Compact"/>
-      </w:pPr>
-      <w:r>
-        <w:t xml:space="preserve">declare</w:t>
-      </w:r>
-      <w:r>
-        <w:t xml:space="preserve"> </w:t>
-      </w:r>
-      <w:r>
-        <w:rPr>
-          <w:rStyle w:val="VerbatimChar"/>
-        </w:rPr>
-        <w:t xml:space="preserve">PRIOR_TEST_EXPOSURE</w:t>
-      </w:r>
-      <w:r>
-        <w:t xml:space="preserve">;</w:t>
-      </w:r>
-    </w:p>
-    <w:p>
-      <w:pPr>
-        <w:numPr>
-          <w:ilvl w:val="1"/>
-          <w:numId w:val="1047"/>
-        </w:numPr>
-        <w:pStyle w:val="Compact"/>
-      </w:pPr>
-      <w:r>
-        <w:t xml:space="preserve">open the holdout once;</w:t>
-      </w:r>
-    </w:p>
-    <w:p>
-      <w:pPr>
-        <w:numPr>
-          <w:ilvl w:val="1"/>
-          <w:numId w:val="1047"/>
-        </w:numPr>
-        <w:pStyle w:val="Compact"/>
-      </w:pPr>
-      <w:r>
-        <w:t xml:space="preserve">report every prespecified arm and analysis, whatever its result.</w:t>
-      </w:r>
-    </w:p>
-    <w:p>
-      <w:pPr>
-        <w:numPr>
-          <w:ilvl w:val="0"/>
-          <w:numId w:val="1044"/>
-        </w:numPr>
-        <w:pStyle w:val="Compact"/>
-      </w:pPr>
-      <w:r>
-        <w:rPr>
-          <w:bCs/>
-          <w:b/>
-        </w:rPr>
-        <w:t xml:space="preserve">Reporting standards:</w:t>
-      </w:r>
-      <w:r>
-        <w:t xml:space="preserve"> </w:t>
-      </w:r>
-      <w:r>
-        <w:t xml:space="preserve">TRIPOD+AI for reporting and PROBAST+AI for the risk-of-bias assessment.</w:t>
-      </w:r>
-    </w:p>
-    <w:bookmarkEnd w:id="35"/>
-    <w:bookmarkStart w:id="36" w:name="reproducibility"/>
-    <w:p>
-      <w:pPr>
-        <w:pStyle w:val="Heading2"/>
-      </w:pPr>
-      <w:r>
-        <w:t xml:space="preserve">12. Reproducibility</w:t>
-      </w:r>
-    </w:p>
-    <w:p>
-      <w:pPr>
-        <w:numPr>
-          <w:ilvl w:val="0"/>
-          <w:numId w:val="1048"/>
-        </w:numPr>
-        <w:pStyle w:val="Compact"/>
-      </w:pPr>
-      <w:r>
-        <w:t xml:space="preserve">Each notebook embeds its code with SHA-256 checks and runs with</w:t>
-      </w:r>
-      <w:r>
-        <w:t xml:space="preserve"> </w:t>
-      </w:r>
-      <w:r>
-        <w:rPr>
-          <w:bCs/>
-          <w:b/>
-        </w:rPr>
-        <w:t xml:space="preserve">Run all</w:t>
-      </w:r>
-      <w:r>
-        <w:t xml:space="preserve"> </w:t>
-      </w:r>
-      <w:r>
-        <w:t xml:space="preserve">only. No manual or AI-assistant edits are made between runs.</w:t>
-      </w:r>
-    </w:p>
-    <w:p>
-      <w:pPr>
-        <w:numPr>
-          <w:ilvl w:val="0"/>
-          <w:numId w:val="1048"/>
-        </w:numPr>
-        <w:pStyle w:val="Compact"/>
-      </w:pPr>
-      <w:r>
-        <w:t xml:space="preserve">Stages are cached under keys built from code, data and configuration:</w:t>
-      </w:r>
-      <w:r>
-        <w:t xml:space="preserve"> </w:t>
-      </w:r>
-      <w:r>
-        <w:rPr>
-          <w:rStyle w:val="VerbatimChar"/>
-        </w:rPr>
-        <w:t xml:space="preserve">COHORT_KEY</w:t>
-      </w:r>
-      <w:r>
-        <w:t xml:space="preserve">,</w:t>
-      </w:r>
-      <w:r>
-        <w:t xml:space="preserve"> </w:t>
-      </w:r>
-      <w:r>
-        <w:rPr>
-          <w:rStyle w:val="VerbatimChar"/>
-        </w:rPr>
-        <w:t xml:space="preserve">RAW_STAGE_KEY</w:t>
-      </w:r>
-      <w:r>
-        <w:t xml:space="preserve">,</w:t>
-      </w:r>
-      <w:r>
-        <w:t xml:space="preserve"> </w:t>
-      </w:r>
-      <w:r>
-        <w:rPr>
-          <w:rStyle w:val="VerbatimChar"/>
-        </w:rPr>
-        <w:t xml:space="preserve">SUPP_KEY</w:t>
-      </w:r>
-      <w:r>
-        <w:t xml:space="preserve">,</w:t>
-      </w:r>
-      <w:r>
-        <w:t xml:space="preserve"> </w:t>
-      </w:r>
-      <w:r>
-        <w:rPr>
-          <w:rStyle w:val="VerbatimChar"/>
-        </w:rPr>
-        <w:t xml:space="preserve">DATA_KEY</w:t>
-      </w:r>
-      <w:r>
-        <w:t xml:space="preserve">,</w:t>
-      </w:r>
-      <w:r>
-        <w:t xml:space="preserve"> </w:t>
-      </w:r>
-      <w:r>
-        <w:rPr>
-          <w:rStyle w:val="VerbatimChar"/>
-        </w:rPr>
-        <w:t xml:space="preserve">SSL_KEY</w:t>
-      </w:r>
-      <w:r>
-        <w:t xml:space="preserve"> </w:t>
-      </w:r>
-      <w:r>
-        <w:t xml:space="preserve">and</w:t>
-      </w:r>
-      <w:r>
-        <w:t xml:space="preserve"> </w:t>
-      </w:r>
-      <w:r>
-        <w:rPr>
-          <w:rStyle w:val="VerbatimChar"/>
-        </w:rPr>
-        <w:t xml:space="preserve">RUN_KEY</w:t>
-      </w:r>
-      <w:r>
-        <w:t xml:space="preserve">.</w:t>
       </w:r>
     </w:p>
     <w:p>
@@ -7216,7 +7504,7 @@
         <w:pStyle w:val="Compact"/>
       </w:pPr>
       <w:r>
-        <w:t xml:space="preserve">A changed input produces a new key.</w:t>
+        <w:t xml:space="preserve">non-cohort stays plus training-split stays (inputs only, no labels);</w:t>
       </w:r>
     </w:p>
     <w:p>
@@ -7228,6 +7516,297 @@
         <w:pStyle w:val="Compact"/>
       </w:pPr>
       <w:r>
+        <w:t xml:space="preserve">excluding every stay of a validation, test or protected patient.</w:t>
+      </w:r>
+    </w:p>
+    <w:p>
+      <w:pPr>
+        <w:numPr>
+          <w:ilvl w:val="0"/>
+          <w:numId w:val="1047"/>
+        </w:numPr>
+        <w:pStyle w:val="Compact"/>
+      </w:pPr>
+      <w:r>
+        <w:rPr>
+          <w:bCs/>
+          <w:b/>
+        </w:rPr>
+        <w:t xml:space="preserve">Final-release encoder (TO FREEZE):</w:t>
+      </w:r>
+      <w:r>
+        <w:t xml:space="preserve"> </w:t>
+      </w:r>
+      <w:r>
+        <w:t xml:space="preserve">Section 5.3.</w:t>
+      </w:r>
+    </w:p>
+    <w:p>
+      <w:pPr>
+        <w:numPr>
+          <w:ilvl w:val="0"/>
+          <w:numId w:val="1047"/>
+        </w:numPr>
+        <w:pStyle w:val="Compact"/>
+      </w:pPr>
+      <w:r>
+        <w:rPr>
+          <w:bCs/>
+          <w:b/>
+        </w:rPr>
+        <w:t xml:space="preserve">eICU leave-hospital-out (TO FREEZE):</w:t>
+      </w:r>
+      <w:r>
+        <w:t xml:space="preserve"> </w:t>
+      </w:r>
+      <w:r>
+        <w:t xml:space="preserve">hospital grouping and the minimum events per hospital.</w:t>
+      </w:r>
+    </w:p>
+    <w:p>
+      <w:pPr>
+        <w:numPr>
+          <w:ilvl w:val="0"/>
+          <w:numId w:val="1047"/>
+        </w:numPr>
+        <w:pStyle w:val="Compact"/>
+      </w:pPr>
+      <w:r>
+        <w:rPr>
+          <w:bCs/>
+          <w:b/>
+        </w:rPr>
+        <w:t xml:space="preserve">Then:</w:t>
+      </w:r>
+    </w:p>
+    <w:p>
+      <w:pPr>
+        <w:numPr>
+          <w:ilvl w:val="1"/>
+          <w:numId w:val="1050"/>
+        </w:numPr>
+        <w:pStyle w:val="Compact"/>
+      </w:pPr>
+      <w:r>
+        <w:t xml:space="preserve">freeze this protocol (commit);</w:t>
+      </w:r>
+    </w:p>
+    <w:p>
+      <w:pPr>
+        <w:numPr>
+          <w:ilvl w:val="1"/>
+          <w:numId w:val="1050"/>
+        </w:numPr>
+        <w:pStyle w:val="Compact"/>
+      </w:pPr>
+      <w:r>
+        <w:t xml:space="preserve">declare</w:t>
+      </w:r>
+      <w:r>
+        <w:t xml:space="preserve"> </w:t>
+      </w:r>
+      <w:r>
+        <w:rPr>
+          <w:rStyle w:val="VerbatimChar"/>
+        </w:rPr>
+        <w:t xml:space="preserve">PRIOR_TEST_EXPOSURE</w:t>
+      </w:r>
+      <w:r>
+        <w:t xml:space="preserve">;</w:t>
+      </w:r>
+    </w:p>
+    <w:p>
+      <w:pPr>
+        <w:numPr>
+          <w:ilvl w:val="1"/>
+          <w:numId w:val="1050"/>
+        </w:numPr>
+        <w:pStyle w:val="Compact"/>
+      </w:pPr>
+      <w:r>
+        <w:t xml:space="preserve">open the holdout once;</w:t>
+      </w:r>
+    </w:p>
+    <w:p>
+      <w:pPr>
+        <w:numPr>
+          <w:ilvl w:val="1"/>
+          <w:numId w:val="1050"/>
+        </w:numPr>
+        <w:pStyle w:val="Compact"/>
+      </w:pPr>
+      <w:r>
+        <w:t xml:space="preserve">report every prespecified arm and analysis, whatever its result.</w:t>
+      </w:r>
+    </w:p>
+    <w:p>
+      <w:pPr>
+        <w:numPr>
+          <w:ilvl w:val="0"/>
+          <w:numId w:val="1047"/>
+        </w:numPr>
+        <w:pStyle w:val="Compact"/>
+      </w:pPr>
+      <w:r>
+        <w:rPr>
+          <w:bCs/>
+          <w:b/>
+        </w:rPr>
+        <w:t xml:space="preserve">Reporting standards:</w:t>
+      </w:r>
+      <w:r>
+        <w:t xml:space="preserve"> </w:t>
+      </w:r>
+      <w:r>
+        <w:t xml:space="preserve">TRIPOD+AI for reporting and PROBAST+AI for the risk-of-bias assessment.</w:t>
+      </w:r>
+    </w:p>
+    <w:bookmarkEnd w:id="38"/>
+    <w:bookmarkStart w:id="39" w:name="reproducibility"/>
+    <w:p>
+      <w:pPr>
+        <w:pStyle w:val="Heading2"/>
+      </w:pPr>
+      <w:r>
+        <w:t xml:space="preserve">12. Reproducibility</w:t>
+      </w:r>
+    </w:p>
+    <w:p>
+      <w:pPr>
+        <w:numPr>
+          <w:ilvl w:val="0"/>
+          <w:numId w:val="1051"/>
+        </w:numPr>
+        <w:pStyle w:val="Compact"/>
+      </w:pPr>
+      <w:r>
+        <w:t xml:space="preserve">Each notebook embeds its code with SHA-256 checks and runs with</w:t>
+      </w:r>
+      <w:r>
+        <w:t xml:space="preserve"> </w:t>
+      </w:r>
+      <w:r>
+        <w:rPr>
+          <w:bCs/>
+          <w:b/>
+        </w:rPr>
+        <w:t xml:space="preserve">Run all</w:t>
+      </w:r>
+      <w:r>
+        <w:t xml:space="preserve"> </w:t>
+      </w:r>
+      <w:r>
+        <w:t xml:space="preserve">only. No manual or AI-assistant edits are made between runs.</w:t>
+      </w:r>
+    </w:p>
+    <w:p>
+      <w:pPr>
+        <w:numPr>
+          <w:ilvl w:val="0"/>
+          <w:numId w:val="1051"/>
+        </w:numPr>
+        <w:pStyle w:val="Compact"/>
+      </w:pPr>
+      <w:r>
+        <w:t xml:space="preserve">Stages are cached under keys built from code, data and configuration:</w:t>
+      </w:r>
+      <w:r>
+        <w:t xml:space="preserve"> </w:t>
+      </w:r>
+      <w:r>
+        <w:rPr>
+          <w:rStyle w:val="VerbatimChar"/>
+        </w:rPr>
+        <w:t xml:space="preserve">COHORT_KEY</w:t>
+      </w:r>
+      <w:r>
+        <w:t xml:space="preserve">,</w:t>
+      </w:r>
+      <w:r>
+        <w:t xml:space="preserve"> </w:t>
+      </w:r>
+      <w:r>
+        <w:rPr>
+          <w:rStyle w:val="VerbatimChar"/>
+        </w:rPr>
+        <w:t xml:space="preserve">RAW_STAGE_KEY</w:t>
+      </w:r>
+      <w:r>
+        <w:t xml:space="preserve">,</w:t>
+      </w:r>
+      <w:r>
+        <w:t xml:space="preserve"> </w:t>
+      </w:r>
+      <w:r>
+        <w:rPr>
+          <w:rStyle w:val="VerbatimChar"/>
+        </w:rPr>
+        <w:t xml:space="preserve">SUPP_KEY</w:t>
+      </w:r>
+      <w:r>
+        <w:t xml:space="preserve">,</w:t>
+      </w:r>
+      <w:r>
+        <w:t xml:space="preserve"> </w:t>
+      </w:r>
+      <w:r>
+        <w:rPr>
+          <w:rStyle w:val="VerbatimChar"/>
+        </w:rPr>
+        <w:t xml:space="preserve">DATA_KEY</w:t>
+      </w:r>
+      <w:r>
+        <w:t xml:space="preserve">,</w:t>
+      </w:r>
+      <w:r>
+        <w:t xml:space="preserve"> </w:t>
+      </w:r>
+      <w:r>
+        <w:rPr>
+          <w:rStyle w:val="VerbatimChar"/>
+        </w:rPr>
+        <w:t xml:space="preserve">SSL_KEY</w:t>
+      </w:r>
+      <w:r>
+        <w:t xml:space="preserve"> </w:t>
+      </w:r>
+      <w:r>
+        <w:t xml:space="preserve">and</w:t>
+      </w:r>
+      <w:r>
+        <w:t xml:space="preserve"> </w:t>
+      </w:r>
+      <w:r>
+        <w:rPr>
+          <w:rStyle w:val="VerbatimChar"/>
+        </w:rPr>
+        <w:t xml:space="preserve">RUN_KEY</w:t>
+      </w:r>
+      <w:r>
+        <w:t xml:space="preserve">.</w:t>
+      </w:r>
+    </w:p>
+    <w:p>
+      <w:pPr>
+        <w:numPr>
+          <w:ilvl w:val="1"/>
+          <w:numId w:val="1052"/>
+        </w:numPr>
+        <w:pStyle w:val="Compact"/>
+      </w:pPr>
+      <w:r>
+        <w:t xml:space="preserve">A changed input produces a new key.</w:t>
+      </w:r>
+    </w:p>
+    <w:p>
+      <w:pPr>
+        <w:numPr>
+          <w:ilvl w:val="1"/>
+          <w:numId w:val="1052"/>
+        </w:numPr>
+        <w:pStyle w:val="Compact"/>
+      </w:pPr>
+      <w:r>
         <w:t xml:space="preserve">A per-run</w:t>
       </w:r>
       <w:r>
@@ -7250,7 +7829,7 @@
       <w:pPr>
         <w:numPr>
           <w:ilvl w:val="1"/>
-          <w:numId w:val="1049"/>
+          <w:numId w:val="1052"/>
         </w:numPr>
         <w:pStyle w:val="Compact"/>
       </w:pPr>
@@ -7271,7 +7850,7 @@
       <w:pPr>
         <w:numPr>
           <w:ilvl w:val="0"/>
-          <w:numId w:val="1048"/>
+          <w:numId w:val="1051"/>
         </w:numPr>
         <w:pStyle w:val="Compact"/>
       </w:pPr>
@@ -7310,7 +7889,7 @@
       <w:pPr>
         <w:numPr>
           <w:ilvl w:val="0"/>
-          <w:numId w:val="1048"/>
+          <w:numId w:val="1051"/>
         </w:numPr>
         <w:pStyle w:val="Compact"/>
       </w:pPr>
@@ -7331,7 +7910,7 @@
       <w:pPr>
         <w:numPr>
           <w:ilvl w:val="0"/>
-          <w:numId w:val="1048"/>
+          <w:numId w:val="1051"/>
         </w:numPr>
         <w:pStyle w:val="Compact"/>
       </w:pPr>
@@ -7343,7 +7922,7 @@
       <w:pPr>
         <w:numPr>
           <w:ilvl w:val="0"/>
-          <w:numId w:val="1048"/>
+          <w:numId w:val="1051"/>
         </w:numPr>
         <w:pStyle w:val="Compact"/>
       </w:pPr>
@@ -7351,8 +7930,8 @@
         <w:t xml:space="preserve">Only one heavy notebook runs on the project Drive at a time.</w:t>
       </w:r>
     </w:p>
-    <w:bookmarkEnd w:id="36"/>
-    <w:bookmarkStart w:id="37" w:name="legacy-external-validation-notebook-b"/>
+    <w:bookmarkEnd w:id="39"/>
+    <w:bookmarkStart w:id="40" w:name="legacy-external-validation-notebook-b"/>
     <w:p>
       <w:pPr>
         <w:pStyle w:val="Heading2"/>
@@ -7466,7 +8045,7 @@
       <w:pPr>
         <w:numPr>
           <w:ilvl w:val="0"/>
-          <w:numId w:val="1050"/>
+          <w:numId w:val="1053"/>
         </w:numPr>
         <w:pStyle w:val="Compact"/>
       </w:pPr>
@@ -7488,7 +8067,7 @@
       <w:pPr>
         <w:numPr>
           <w:ilvl w:val="0"/>
-          <w:numId w:val="1050"/>
+          <w:numId w:val="1053"/>
         </w:numPr>
         <w:pStyle w:val="Compact"/>
       </w:pPr>
@@ -7510,7 +8089,7 @@
       <w:pPr>
         <w:numPr>
           <w:ilvl w:val="0"/>
-          <w:numId w:val="1050"/>
+          <w:numId w:val="1053"/>
         </w:numPr>
         <w:pStyle w:val="Compact"/>
       </w:pPr>
@@ -7565,7 +8144,7 @@
       <w:pPr>
         <w:numPr>
           <w:ilvl w:val="0"/>
-          <w:numId w:val="1050"/>
+          <w:numId w:val="1053"/>
         </w:numPr>
         <w:pStyle w:val="Compact"/>
       </w:pPr>
@@ -7583,8 +8162,8 @@
         <w:t xml:space="preserve">not yet run on real data; it awaits the original model folders.</w:t>
       </w:r>
     </w:p>
-    <w:bookmarkEnd w:id="37"/>
-    <w:bookmarkStart w:id="41" w:name="Xe149fb2478db8da35cf9b6ef25933425736707f"/>
+    <w:bookmarkEnd w:id="40"/>
+    <w:bookmarkStart w:id="44" w:name="Xe149fb2478db8da35cf9b6ef25933425736707f"/>
     <w:p>
       <w:pPr>
         <w:pStyle w:val="Heading2"/>
@@ -7601,7 +8180,7 @@
         <w:t xml:space="preserve">The models and the pipeline were built in three stages. Each stage was triggered by a finding from the one before. All numbers are causal; results from the earlier leaky pipeline are never reported.</w:t>
       </w:r>
     </w:p>
-    <w:bookmarkStart w:id="38" w:name="X735e13a538b82c8e9d481869e251d3414058621"/>
+    <w:bookmarkStart w:id="41" w:name="X735e13a538b82c8e9d481869e251d3414058621"/>
     <w:p>
       <w:pPr>
         <w:pStyle w:val="Heading3"/>
@@ -7827,8 +8406,8 @@
         </w:tc>
       </w:tr>
     </w:tbl>
-    <w:bookmarkEnd w:id="38"/>
-    <w:bookmarkStart w:id="39" w:name="X02b04979c6e494c5ca74ff48a676d02b1c052ef"/>
+    <w:bookmarkEnd w:id="41"/>
+    <w:bookmarkStart w:id="42" w:name="X02b04979c6e494c5ca74ff48a676d02b1c052ef"/>
     <w:p>
       <w:pPr>
         <w:pStyle w:val="Heading3"/>
@@ -7859,7 +8438,7 @@
       <w:pPr>
         <w:numPr>
           <w:ilvl w:val="0"/>
-          <w:numId w:val="1051"/>
+          <w:numId w:val="1054"/>
         </w:numPr>
         <w:pStyle w:val="Compact"/>
       </w:pPr>
@@ -7871,7 +8450,7 @@
       <w:pPr>
         <w:numPr>
           <w:ilvl w:val="0"/>
-          <w:numId w:val="1051"/>
+          <w:numId w:val="1054"/>
         </w:numPr>
         <w:pStyle w:val="Compact"/>
       </w:pPr>
@@ -7883,7 +8462,7 @@
       <w:pPr>
         <w:numPr>
           <w:ilvl w:val="1"/>
-          <w:numId w:val="1052"/>
+          <w:numId w:val="1055"/>
         </w:numPr>
         <w:pStyle w:val="Compact"/>
       </w:pPr>
@@ -7895,7 +8474,7 @@
       <w:pPr>
         <w:numPr>
           <w:ilvl w:val="1"/>
-          <w:numId w:val="1052"/>
+          <w:numId w:val="1055"/>
         </w:numPr>
         <w:pStyle w:val="Compact"/>
       </w:pPr>
@@ -7907,7 +8486,7 @@
       <w:pPr>
         <w:numPr>
           <w:ilvl w:val="1"/>
-          <w:numId w:val="1052"/>
+          <w:numId w:val="1055"/>
         </w:numPr>
         <w:pStyle w:val="Compact"/>
       </w:pPr>
@@ -7919,7 +8498,7 @@
       <w:pPr>
         <w:numPr>
           <w:ilvl w:val="1"/>
-          <w:numId w:val="1052"/>
+          <w:numId w:val="1055"/>
         </w:numPr>
         <w:pStyle w:val="Compact"/>
       </w:pPr>
@@ -7931,7 +8510,7 @@
       <w:pPr>
         <w:numPr>
           <w:ilvl w:val="0"/>
-          <w:numId w:val="1051"/>
+          <w:numId w:val="1054"/>
         </w:numPr>
         <w:pStyle w:val="Compact"/>
       </w:pPr>
@@ -7943,7 +8522,7 @@
       <w:pPr>
         <w:numPr>
           <w:ilvl w:val="0"/>
-          <w:numId w:val="1051"/>
+          <w:numId w:val="1054"/>
         </w:numPr>
         <w:pStyle w:val="Compact"/>
       </w:pPr>
@@ -7955,7 +8534,7 @@
       <w:pPr>
         <w:numPr>
           <w:ilvl w:val="0"/>
-          <w:numId w:val="1051"/>
+          <w:numId w:val="1054"/>
         </w:numPr>
         <w:pStyle w:val="Compact"/>
       </w:pPr>
@@ -7975,7 +8554,7 @@
       <w:pPr>
         <w:numPr>
           <w:ilvl w:val="0"/>
-          <w:numId w:val="1053"/>
+          <w:numId w:val="1056"/>
         </w:numPr>
         <w:pStyle w:val="Compact"/>
       </w:pPr>
@@ -7987,7 +8566,7 @@
       <w:pPr>
         <w:numPr>
           <w:ilvl w:val="0"/>
-          <w:numId w:val="1053"/>
+          <w:numId w:val="1056"/>
         </w:numPr>
         <w:pStyle w:val="Compact"/>
       </w:pPr>
@@ -8463,8 +9042,8 @@
         <w:t xml:space="preserve">): hourly OSTA exceeded qSOFA on MIMIC-IV by +0.28 AUROC (95 % CI 0.21 to 0.35). In eICU, onset-anchored, the models were not better than qSOFA or SIRS.</w:t>
       </w:r>
     </w:p>
-    <w:bookmarkEnd w:id="39"/>
-    <w:bookmarkStart w:id="40" w:name="stage-3-v11-this-protocol"/>
+    <w:bookmarkEnd w:id="42"/>
+    <w:bookmarkStart w:id="43" w:name="stage-3-v11-this-protocol"/>
     <w:p>
       <w:pPr>
         <w:pStyle w:val="Heading3"/>
@@ -8485,7 +9064,7 @@
       <w:pPr>
         <w:numPr>
           <w:ilvl w:val="0"/>
-          <w:numId w:val="1054"/>
+          <w:numId w:val="1057"/>
         </w:numPr>
         <w:pStyle w:val="Compact"/>
       </w:pPr>
@@ -8507,7 +9086,7 @@
       <w:pPr>
         <w:numPr>
           <w:ilvl w:val="0"/>
-          <w:numId w:val="1054"/>
+          <w:numId w:val="1057"/>
         </w:numPr>
         <w:pStyle w:val="Compact"/>
       </w:pPr>
@@ -8529,7 +9108,7 @@
       <w:pPr>
         <w:numPr>
           <w:ilvl w:val="1"/>
-          <w:numId w:val="1055"/>
+          <w:numId w:val="1058"/>
         </w:numPr>
         <w:pStyle w:val="Compact"/>
       </w:pPr>
@@ -8541,7 +9120,7 @@
       <w:pPr>
         <w:numPr>
           <w:ilvl w:val="1"/>
-          <w:numId w:val="1055"/>
+          <w:numId w:val="1058"/>
         </w:numPr>
         <w:pStyle w:val="Compact"/>
       </w:pPr>
@@ -8553,7 +9132,7 @@
       <w:pPr>
         <w:numPr>
           <w:ilvl w:val="1"/>
-          <w:numId w:val="1055"/>
+          <w:numId w:val="1058"/>
         </w:numPr>
         <w:pStyle w:val="Compact"/>
       </w:pPr>
@@ -8565,7 +9144,7 @@
       <w:pPr>
         <w:numPr>
           <w:ilvl w:val="0"/>
-          <w:numId w:val="1054"/>
+          <w:numId w:val="1057"/>
         </w:numPr>
         <w:pStyle w:val="Compact"/>
       </w:pPr>
@@ -8583,9 +9162,9 @@
         <w:t xml:space="preserve">It was retired.</w:t>
       </w:r>
     </w:p>
-    <w:bookmarkEnd w:id="40"/>
-    <w:bookmarkEnd w:id="41"/>
-    <w:bookmarkStart w:id="42" w:name="X0296bd26dd3c8397ebfff3644d5772bc7e084f6"/>
+    <w:bookmarkEnd w:id="43"/>
+    <w:bookmarkEnd w:id="44"/>
+    <w:bookmarkStart w:id="45" w:name="X0296bd26dd3c8397ebfff3644d5772bc7e084f6"/>
     <w:p>
       <w:pPr>
         <w:pStyle w:val="Heading2"/>
@@ -8598,7 +9177,7 @@
       <w:pPr>
         <w:numPr>
           <w:ilvl w:val="0"/>
-          <w:numId w:val="1056"/>
+          <w:numId w:val="1059"/>
         </w:numPr>
         <w:pStyle w:val="Compact"/>
       </w:pPr>
@@ -8625,7 +9204,7 @@
       <w:pPr>
         <w:numPr>
           <w:ilvl w:val="0"/>
-          <w:numId w:val="1056"/>
+          <w:numId w:val="1059"/>
         </w:numPr>
         <w:pStyle w:val="Compact"/>
       </w:pPr>
@@ -8637,7 +9216,7 @@
       <w:pPr>
         <w:numPr>
           <w:ilvl w:val="0"/>
-          <w:numId w:val="1056"/>
+          <w:numId w:val="1059"/>
         </w:numPr>
         <w:pStyle w:val="Compact"/>
       </w:pPr>
@@ -8660,8 +9239,8 @@
         <w:t xml:space="preserve">notebook embeds the earlier label worker (Section 4); the repository copy carries the interval-units fix.</w:t>
       </w:r>
     </w:p>
-    <w:bookmarkEnd w:id="42"/>
-    <w:bookmarkEnd w:id="43"/>
+    <w:bookmarkEnd w:id="45"/>
+    <w:bookmarkEnd w:id="46"/>
     <w:sectPr/>
   </w:body>
 </w:document>
@@ -9146,12 +9725,6 @@
     <w:abstractNumId w:val="991"/>
   </w:num>
   <w:num w:numId="1045">
-    <w:abstractNumId w:val="991"/>
-  </w:num>
-  <w:num w:numId="1046">
-    <w:abstractNumId w:val="991"/>
-  </w:num>
-  <w:num w:numId="1047">
     <w:abstractNumId w:val="99411"/>
     <w:lvlOverride w:ilvl="0">
       <w:startOverride w:val="1"/>
@@ -9181,6 +9754,39 @@
       <w:startOverride w:val="1"/>
     </w:lvlOverride>
   </w:num>
+  <w:num w:numId="1046">
+    <w:abstractNumId w:val="99411"/>
+    <w:lvlOverride w:ilvl="0">
+      <w:startOverride w:val="1"/>
+    </w:lvlOverride>
+    <w:lvlOverride w:ilvl="1">
+      <w:startOverride w:val="1"/>
+    </w:lvlOverride>
+    <w:lvlOverride w:ilvl="2">
+      <w:startOverride w:val="1"/>
+    </w:lvlOverride>
+    <w:lvlOverride w:ilvl="3">
+      <w:startOverride w:val="1"/>
+    </w:lvlOverride>
+    <w:lvlOverride w:ilvl="4">
+      <w:startOverride w:val="1"/>
+    </w:lvlOverride>
+    <w:lvlOverride w:ilvl="5">
+      <w:startOverride w:val="1"/>
+    </w:lvlOverride>
+    <w:lvlOverride w:ilvl="6">
+      <w:startOverride w:val="1"/>
+    </w:lvlOverride>
+    <w:lvlOverride w:ilvl="7">
+      <w:startOverride w:val="1"/>
+    </w:lvlOverride>
+    <w:lvlOverride w:ilvl="8">
+      <w:startOverride w:val="1"/>
+    </w:lvlOverride>
+  </w:num>
+  <w:num w:numId="1047">
+    <w:abstractNumId w:val="991"/>
+  </w:num>
   <w:num w:numId="1048">
     <w:abstractNumId w:val="991"/>
   </w:num>
@@ -9188,7 +9794,34 @@
     <w:abstractNumId w:val="991"/>
   </w:num>
   <w:num w:numId="1050">
-    <w:abstractNumId w:val="991"/>
+    <w:abstractNumId w:val="99411"/>
+    <w:lvlOverride w:ilvl="0">
+      <w:startOverride w:val="1"/>
+    </w:lvlOverride>
+    <w:lvlOverride w:ilvl="1">
+      <w:startOverride w:val="1"/>
+    </w:lvlOverride>
+    <w:lvlOverride w:ilvl="2">
+      <w:startOverride w:val="1"/>
+    </w:lvlOverride>
+    <w:lvlOverride w:ilvl="3">
+      <w:startOverride w:val="1"/>
+    </w:lvlOverride>
+    <w:lvlOverride w:ilvl="4">
+      <w:startOverride w:val="1"/>
+    </w:lvlOverride>
+    <w:lvlOverride w:ilvl="5">
+      <w:startOverride w:val="1"/>
+    </w:lvlOverride>
+    <w:lvlOverride w:ilvl="6">
+      <w:startOverride w:val="1"/>
+    </w:lvlOverride>
+    <w:lvlOverride w:ilvl="7">
+      <w:startOverride w:val="1"/>
+    </w:lvlOverride>
+    <w:lvlOverride w:ilvl="8">
+      <w:startOverride w:val="1"/>
+    </w:lvlOverride>
   </w:num>
   <w:num w:numId="1051">
     <w:abstractNumId w:val="991"/>
@@ -9206,6 +9839,15 @@
     <w:abstractNumId w:val="991"/>
   </w:num>
   <w:num w:numId="1056">
+    <w:abstractNumId w:val="991"/>
+  </w:num>
+  <w:num w:numId="1057">
+    <w:abstractNumId w:val="991"/>
+  </w:num>
+  <w:num w:numId="1058">
+    <w:abstractNumId w:val="991"/>
+  </w:num>
+  <w:num w:numId="1059">
     <w:abstractNumId w:val="991"/>
   </w:num>
 </w:numbering>

</xml_diff>

<commit_message>
Stage 2 build started: manifest, labels, baseline-relative features; consultant survey; seed tiering recorded
Protocol: seed tiering decided with its condition; consultants' three
questions carry defaults. Consultant survey pages drafted (Markdown and
Word). Stage 2 build plan with the fifteen pieces in build order.
v12 modules: two-channel feature manifest with audit and concept-grouped
practice path; suspicion-anchored event (sustained course, 72 h washout,
death rule), hourly label, pre-treatment mask, documentation prior and
positive-unlabelled soft label; baseline-relative features with expanding
baseline recovered from measurement ages, causal by construction.
32 synthetic checks pass.

Co-Authored-By: Claude Fable 5.1 <noreply@anthropic.com>
Claude-Session: https://claude.ai/code/session_01LgDqxV9dzSvE8XpquGaBd5
</commit_message>
<xml_diff>
--- a/dev/protocol/Study_Protocol_v11.docx
+++ b/dev/protocol/Study_Protocol_v11.docx
@@ -7932,13 +7932,22 @@
           <w:bCs/>
           <w:b/>
         </w:rPr>
-        <w:t xml:space="preserve">Consultants (added 30 Oct 2026; third question added 31 Oct 2026).</w:t>
-      </w:r>
-      <w:r>
-        <w:t xml:space="preserve"> </w:t>
-      </w:r>
-      <w:r>
-        <w:t xml:space="preserve">Three questions are put to the ICU consultants before the freeze: whether a warning raised after the first antibiotic has clinical value; which course definition they recognise (48 h or 72 h; the vasopressor threshold); and whether the alarm threshold should be set as a workload (a fixed fraction of patient-hours, as the quantile rule does) or as a probability.</w:t>
+        <w:t xml:space="preserve">Consultants (added 30 Oct 2026; third question and defaults added 31 Oct 2026).</w:t>
+      </w:r>
+      <w:r>
+        <w:t xml:space="preserve"> </w:t>
+      </w:r>
+      <w:r>
+        <w:t xml:space="preserve">Three questions are put to the ICU consultants before the freeze, each as a default to confirm or change, with the data line behind it (</w:t>
+      </w:r>
+      <w:r>
+        <w:rPr>
+          <w:rStyle w:val="VerbatimChar"/>
+        </w:rPr>
+        <w:t xml:space="preserve">dev/consultants/Consultant_Survey.md</w:t>
+      </w:r>
+      <w:r>
+        <w:t xml:space="preserve">): (1) whether a warning raised after the first antibiotic has clinical value; default: recorded but without credit in the primary presentation, lead time reported against the antibiotic; (2) which course definition they recognise; default: 48 h primary and 72 h sensitivity, deteriorating = death, a paired SOFA-component rise of 2, or vasopressor escalation above 0.1 norepinephrine-equivalent, with two explicit sub-questions on the vasopressor threshold and on deaths under treatment limitation; (3) whether the alarm threshold is set as a workload or a probability; default: a fixed fraction of patient-hours carried between hospitals, with the question of the acceptable burden in alarms per ten patients per day and whether it differs between unit types. Their answers set the alarm budget, the utility weights and the course definition before the freeze.</w:t>
       </w:r>
     </w:p>
     <w:p>
@@ -8353,13 +8362,13 @@
           <w:bCs/>
           <w:b/>
         </w:rPr>
-        <w:t xml:space="preserve">Seeds (TO DECIDE before the freeze):</w:t>
-      </w:r>
-      <w:r>
-        <w:t xml:space="preserve"> </w:t>
-      </w:r>
-      <w:r>
-        <w:t xml:space="preserve">proposed three seeds (42, 7, 123) for arms 1 to 5 and one seed for arms 6 to 9, with the project model’s seed variance reported as the yardstick for the one-seed arms. Everything at three seeds is estimated at three to four weeks of A100 time; the tiering at ten to twelve days. The estimate is revised after arm 1 completes.</w:t>
+        <w:t xml:space="preserve">Seeds (decided 31 Oct 2026, conditional):</w:t>
+      </w:r>
+      <w:r>
+        <w:t xml:space="preserve"> </w:t>
+      </w:r>
+      <w:r>
+        <w:t xml:space="preserve">three seeds (42, 7, 123) for arms 1 to 5 and one seed (42) for arms 6 to 9, with the project model’s seed variance reported as the yardstick for the one-seed arms. Condition fixed now: if arm 1 on the full cohort runs faster than the eight-fold scaling estimate (under about 1 day of A100 time for its three seeds on both databases), the predictor-set arms of item 6 run at three seeds as well; if it runs slower than twice the estimate, the exploratory pair of item 9 is dropped first. Everything at three seeds is estimated at three to four weeks of A100 time; the tiering at ten to twelve days.</w:t>
       </w:r>
     </w:p>
     <w:p>

</xml_diff>